<commit_message>
Update to Module-6 Test Plan 04/24/2026
</commit_message>
<xml_diff>
--- a/MODULE-6/6.2 Test Plan - MoffatBay.docx
+++ b/MODULE-6/6.2 Test Plan - MoffatBay.docx
@@ -98,25 +98,7 @@
                 <w:sz w:val="20"/>
                 <w:szCs w:val="20"/>
               </w:rPr>
-              <w:t xml:space="preserve">Zachary Anderson, </w:t>
-            </w:r>
-            <w:proofErr w:type="spellStart"/>
-            <w:r>
-              <w:rPr>
-                <w:rFonts w:ascii="Arial" w:hAnsi="Arial" w:cs="Arial"/>
-                <w:sz w:val="20"/>
-                <w:szCs w:val="20"/>
-              </w:rPr>
-              <w:t>Tevyah</w:t>
-            </w:r>
-            <w:proofErr w:type="spellEnd"/>
-            <w:r>
-              <w:rPr>
-                <w:rFonts w:ascii="Arial" w:hAnsi="Arial" w:cs="Arial"/>
-                <w:sz w:val="20"/>
-                <w:szCs w:val="20"/>
-              </w:rPr>
-              <w:t xml:space="preserve"> Hanley, Cameron Mendez, Angela Vargas</w:t>
+              <w:t>Zachary Anderson, Tevyah Hanley, Cameron Mendez, Angela Vargas</w:t>
             </w:r>
           </w:p>
         </w:tc>
@@ -1002,25 +984,7 @@
           <w:sz w:val="24"/>
           <w:szCs w:val="24"/>
         </w:rPr>
-        <w:t xml:space="preserve"> should:  provide a test description, a test objective, the </w:t>
-      </w:r>
-      <w:proofErr w:type="gramStart"/>
-      <w:r>
-        <w:rPr>
-          <w:rFonts w:ascii="Arial" w:hAnsi="Arial" w:cs="Arial"/>
-          <w:sz w:val="24"/>
-          <w:szCs w:val="24"/>
-        </w:rPr>
-        <w:t>developer</w:t>
-      </w:r>
-      <w:proofErr w:type="gramEnd"/>
-      <w:r>
-        <w:rPr>
-          <w:rFonts w:ascii="Arial" w:hAnsi="Arial" w:cs="Arial"/>
-          <w:sz w:val="24"/>
-          <w:szCs w:val="24"/>
-        </w:rPr>
-        <w:t xml:space="preserve"> name and date tested. </w:t>
+        <w:t xml:space="preserve"> should:  provide a test description, a test objective, the developer name and date tested. </w:t>
       </w:r>
       <w:r>
         <w:rPr>
@@ -1108,9 +1072,9 @@
       <w:tblGrid>
         <w:gridCol w:w="1250"/>
         <w:gridCol w:w="3941"/>
-        <w:gridCol w:w="3703"/>
-        <w:gridCol w:w="2067"/>
-        <w:gridCol w:w="1989"/>
+        <w:gridCol w:w="1757"/>
+        <w:gridCol w:w="1366"/>
+        <w:gridCol w:w="4636"/>
       </w:tblGrid>
       <w:tr>
         <w:trPr>
@@ -1136,6 +1100,7 @@
                 <w:sz w:val="24"/>
                 <w:szCs w:val="24"/>
               </w:rPr>
+              <w:lastRenderedPageBreak/>
               <w:t>Test 1</w:t>
             </w:r>
           </w:p>
@@ -1236,27 +1201,7 @@
                 <w:sz w:val="20"/>
                 <w:szCs w:val="20"/>
               </w:rPr>
-              <w:t xml:space="preserve"> </w:t>
-            </w:r>
-            <w:proofErr w:type="gramStart"/>
-            <w:r>
-              <w:rPr>
-                <w:rFonts w:ascii="Arial" w:hAnsi="Arial" w:cs="Arial"/>
-                <w:color w:val="C00000"/>
-                <w:sz w:val="20"/>
-                <w:szCs w:val="20"/>
-              </w:rPr>
-              <w:t>is able to</w:t>
-            </w:r>
-            <w:proofErr w:type="gramEnd"/>
-            <w:r>
-              <w:rPr>
-                <w:rFonts w:ascii="Arial" w:hAnsi="Arial" w:cs="Arial"/>
-                <w:color w:val="C00000"/>
-                <w:sz w:val="20"/>
-                <w:szCs w:val="20"/>
-              </w:rPr>
-              <w:t xml:space="preserve"> make </w:t>
+              <w:t xml:space="preserve"> is able to make </w:t>
             </w:r>
             <w:r>
               <w:rPr>
@@ -1393,6 +1338,16 @@
               </w:rPr>
               <w:t xml:space="preserve">Peer tester: </w:t>
             </w:r>
+            <w:r>
+              <w:rPr>
+                <w:rFonts w:ascii="Arial" w:hAnsi="Arial" w:cs="Arial"/>
+                <w:b/>
+                <w:bCs/>
+                <w:sz w:val="20"/>
+                <w:szCs w:val="20"/>
+              </w:rPr>
+              <w:t>Cameron Mendez</w:t>
+            </w:r>
           </w:p>
           <w:p>
             <w:pPr>
@@ -1427,27 +1382,7 @@
                 <w:sz w:val="20"/>
                 <w:szCs w:val="20"/>
               </w:rPr>
-              <w:t>&lt;</w:t>
-            </w:r>
-            <w:proofErr w:type="spellStart"/>
-            <w:r>
-              <w:rPr>
-                <w:rFonts w:ascii="Arial" w:hAnsi="Arial" w:cs="Arial"/>
-                <w:color w:val="C00000"/>
-                <w:sz w:val="20"/>
-                <w:szCs w:val="20"/>
-              </w:rPr>
-              <w:t>yyyy</w:t>
-            </w:r>
-            <w:proofErr w:type="spellEnd"/>
-            <w:r>
-              <w:rPr>
-                <w:rFonts w:ascii="Arial" w:hAnsi="Arial" w:cs="Arial"/>
-                <w:color w:val="C00000"/>
-                <w:sz w:val="20"/>
-                <w:szCs w:val="20"/>
-              </w:rPr>
-              <w:t>/mm/dd&gt;</w:t>
+              <w:t>04/24/2026</w:t>
             </w:r>
           </w:p>
         </w:tc>
@@ -1662,27 +1597,7 @@
                 <w:sz w:val="20"/>
                 <w:szCs w:val="20"/>
               </w:rPr>
-              <w:t xml:space="preserve">Navigate to </w:t>
-            </w:r>
-            <w:proofErr w:type="spellStart"/>
-            <w:r>
-              <w:rPr>
-                <w:rFonts w:ascii="Arial" w:hAnsi="Arial" w:cs="Arial"/>
-                <w:color w:val="C00000"/>
-                <w:sz w:val="20"/>
-                <w:szCs w:val="20"/>
-              </w:rPr>
-              <w:t>MoffayBayLodge</w:t>
-            </w:r>
-            <w:proofErr w:type="spellEnd"/>
-            <w:r>
-              <w:rPr>
-                <w:rFonts w:ascii="Arial" w:hAnsi="Arial" w:cs="Arial"/>
-                <w:color w:val="C00000"/>
-                <w:sz w:val="20"/>
-                <w:szCs w:val="20"/>
-              </w:rPr>
-              <w:t xml:space="preserve"> landing page</w:t>
+              <w:t>Navigate to MoffayBayLodge landing page</w:t>
             </w:r>
             <w:r>
               <w:rPr>
@@ -1784,7 +1699,61 @@
                 <w:sz w:val="20"/>
                 <w:szCs w:val="20"/>
               </w:rPr>
-              <w:t>&lt;yes/no&gt;</w:t>
+              <w:t>Yes</w:t>
+            </w:r>
+          </w:p>
+          <w:p>
+            <w:pPr>
+              <w:spacing w:before="80" w:after="80"/>
+              <w:rPr>
+                <w:rFonts w:ascii="Arial" w:hAnsi="Arial" w:cs="Arial"/>
+                <w:color w:val="C00000"/>
+                <w:sz w:val="20"/>
+                <w:szCs w:val="20"/>
+              </w:rPr>
+            </w:pPr>
+            <w:r>
+              <w:rPr>
+                <w:rFonts w:ascii="Arial" w:hAnsi="Arial" w:cs="Arial"/>
+                <w:color w:val="C00000"/>
+                <w:sz w:val="20"/>
+                <w:szCs w:val="20"/>
+              </w:rPr>
+              <w:drawing>
+                <wp:inline distT="0" distB="0" distL="0" distR="0" wp14:anchorId="0923BA86" wp14:editId="75C0DCD6">
+                  <wp:extent cx="2273300" cy="1331881"/>
+                  <wp:effectExtent l="0" t="0" r="0" b="1905"/>
+                  <wp:docPr id="1436926483" name="Picture 1"/>
+                  <wp:cNvGraphicFramePr>
+                    <a:graphicFrameLocks xmlns:a="http://schemas.openxmlformats.org/drawingml/2006/main" noChangeAspect="1"/>
+                  </wp:cNvGraphicFramePr>
+                  <a:graphic xmlns:a="http://schemas.openxmlformats.org/drawingml/2006/main">
+                    <a:graphicData uri="http://schemas.openxmlformats.org/drawingml/2006/picture">
+                      <pic:pic xmlns:pic="http://schemas.openxmlformats.org/drawingml/2006/picture">
+                        <pic:nvPicPr>
+                          <pic:cNvPr id="1436926483" name=""/>
+                          <pic:cNvPicPr/>
+                        </pic:nvPicPr>
+                        <pic:blipFill>
+                          <a:blip r:embed="rId8"/>
+                          <a:stretch>
+                            <a:fillRect/>
+                          </a:stretch>
+                        </pic:blipFill>
+                        <pic:spPr>
+                          <a:xfrm>
+                            <a:off x="0" y="0"/>
+                            <a:ext cx="2280515" cy="1336108"/>
+                          </a:xfrm>
+                          <a:prstGeom prst="rect">
+                            <a:avLst/>
+                          </a:prstGeom>
+                        </pic:spPr>
+                      </pic:pic>
+                    </a:graphicData>
+                  </a:graphic>
+                </wp:inline>
+              </w:drawing>
             </w:r>
           </w:p>
         </w:tc>
@@ -1993,7 +1962,61 @@
                 <w:sz w:val="20"/>
                 <w:szCs w:val="20"/>
               </w:rPr>
-              <w:t>&lt;yes/no&gt;</w:t>
+              <w:t>No</w:t>
+            </w:r>
+          </w:p>
+          <w:p>
+            <w:pPr>
+              <w:spacing w:before="80" w:after="80"/>
+              <w:rPr>
+                <w:rFonts w:ascii="Arial" w:hAnsi="Arial" w:cs="Arial"/>
+                <w:color w:val="C00000"/>
+                <w:sz w:val="20"/>
+                <w:szCs w:val="20"/>
+              </w:rPr>
+            </w:pPr>
+            <w:r>
+              <w:rPr>
+                <w:rFonts w:ascii="Arial" w:hAnsi="Arial" w:cs="Arial"/>
+                <w:color w:val="C00000"/>
+                <w:sz w:val="20"/>
+                <w:szCs w:val="20"/>
+              </w:rPr>
+              <w:drawing>
+                <wp:inline distT="0" distB="0" distL="0" distR="0" wp14:anchorId="02BFDA89" wp14:editId="647F6245">
+                  <wp:extent cx="2806700" cy="980851"/>
+                  <wp:effectExtent l="0" t="0" r="0" b="0"/>
+                  <wp:docPr id="1240259731" name="Picture 1"/>
+                  <wp:cNvGraphicFramePr>
+                    <a:graphicFrameLocks xmlns:a="http://schemas.openxmlformats.org/drawingml/2006/main" noChangeAspect="1"/>
+                  </wp:cNvGraphicFramePr>
+                  <a:graphic xmlns:a="http://schemas.openxmlformats.org/drawingml/2006/main">
+                    <a:graphicData uri="http://schemas.openxmlformats.org/drawingml/2006/picture">
+                      <pic:pic xmlns:pic="http://schemas.openxmlformats.org/drawingml/2006/picture">
+                        <pic:nvPicPr>
+                          <pic:cNvPr id="1240259731" name=""/>
+                          <pic:cNvPicPr/>
+                        </pic:nvPicPr>
+                        <pic:blipFill>
+                          <a:blip r:embed="rId9"/>
+                          <a:stretch>
+                            <a:fillRect/>
+                          </a:stretch>
+                        </pic:blipFill>
+                        <pic:spPr>
+                          <a:xfrm>
+                            <a:off x="0" y="0"/>
+                            <a:ext cx="2812208" cy="982776"/>
+                          </a:xfrm>
+                          <a:prstGeom prst="rect">
+                            <a:avLst/>
+                          </a:prstGeom>
+                        </pic:spPr>
+                      </pic:pic>
+                    </a:graphicData>
+                  </a:graphic>
+                </wp:inline>
+              </w:drawing>
             </w:r>
           </w:p>
         </w:tc>
@@ -2125,6 +2148,7 @@
                 <w:sz w:val="20"/>
                 <w:szCs w:val="20"/>
               </w:rPr>
+              <w:lastRenderedPageBreak/>
               <w:t>reservation page to be able to make a reservation</w:t>
             </w:r>
           </w:p>
@@ -2150,6 +2174,7 @@
                 <w:sz w:val="20"/>
                 <w:szCs w:val="20"/>
               </w:rPr>
+              <w:lastRenderedPageBreak/>
               <w:t>Pass</w:t>
             </w:r>
           </w:p>
@@ -2175,7 +2200,7 @@
                 <w:sz w:val="20"/>
                 <w:szCs w:val="20"/>
               </w:rPr>
-              <w:t>&lt;yes/no&gt;</w:t>
+              <w:t>No</w:t>
             </w:r>
           </w:p>
         </w:tc>
@@ -2366,7 +2391,61 @@
                 <w:sz w:val="20"/>
                 <w:szCs w:val="20"/>
               </w:rPr>
-              <w:t>&lt;yes/no&gt;</w:t>
+              <w:t>No</w:t>
+            </w:r>
+          </w:p>
+          <w:p>
+            <w:pPr>
+              <w:spacing w:before="80" w:after="80"/>
+              <w:rPr>
+                <w:rFonts w:ascii="Arial" w:hAnsi="Arial" w:cs="Arial"/>
+                <w:color w:val="C00000"/>
+                <w:sz w:val="20"/>
+                <w:szCs w:val="20"/>
+              </w:rPr>
+            </w:pPr>
+            <w:r>
+              <w:rPr>
+                <w:rFonts w:ascii="Arial" w:hAnsi="Arial" w:cs="Arial"/>
+                <w:color w:val="C00000"/>
+                <w:sz w:val="20"/>
+                <w:szCs w:val="20"/>
+              </w:rPr>
+              <w:drawing>
+                <wp:inline distT="0" distB="0" distL="0" distR="0" wp14:anchorId="0157FFAE" wp14:editId="1BECAF32">
+                  <wp:extent cx="2438400" cy="1690370"/>
+                  <wp:effectExtent l="0" t="0" r="0" b="5080"/>
+                  <wp:docPr id="414590909" name="Picture 1"/>
+                  <wp:cNvGraphicFramePr>
+                    <a:graphicFrameLocks xmlns:a="http://schemas.openxmlformats.org/drawingml/2006/main" noChangeAspect="1"/>
+                  </wp:cNvGraphicFramePr>
+                  <a:graphic xmlns:a="http://schemas.openxmlformats.org/drawingml/2006/main">
+                    <a:graphicData uri="http://schemas.openxmlformats.org/drawingml/2006/picture">
+                      <pic:pic xmlns:pic="http://schemas.openxmlformats.org/drawingml/2006/picture">
+                        <pic:nvPicPr>
+                          <pic:cNvPr id="414590909" name=""/>
+                          <pic:cNvPicPr/>
+                        </pic:nvPicPr>
+                        <pic:blipFill>
+                          <a:blip r:embed="rId10"/>
+                          <a:stretch>
+                            <a:fillRect/>
+                          </a:stretch>
+                        </pic:blipFill>
+                        <pic:spPr>
+                          <a:xfrm>
+                            <a:off x="0" y="0"/>
+                            <a:ext cx="2443101" cy="1693629"/>
+                          </a:xfrm>
+                          <a:prstGeom prst="rect">
+                            <a:avLst/>
+                          </a:prstGeom>
+                        </pic:spPr>
+                      </pic:pic>
+                    </a:graphicData>
+                  </a:graphic>
+                </wp:inline>
+              </w:drawing>
             </w:r>
           </w:p>
         </w:tc>
@@ -2539,7 +2618,7 @@
                 <w:sz w:val="20"/>
                 <w:szCs w:val="20"/>
               </w:rPr>
-              <w:t>&lt;yes/no&gt;</w:t>
+              <w:t>No – Not able to create customer account</w:t>
             </w:r>
           </w:p>
         </w:tc>
@@ -2597,7 +2676,7 @@
                 <w:sz w:val="20"/>
                 <w:szCs w:val="20"/>
               </w:rPr>
-              <w:t xml:space="preserve">Comments should be substantive; this means there should be at least 2-3 well-structured sentences with constructive feedback. </w:t>
+              <w:t>Reservation page opened, no prompt on creating or logging into an account</w:t>
             </w:r>
           </w:p>
         </w:tc>
@@ -2622,9 +2701,9 @@
       <w:tblGrid>
         <w:gridCol w:w="1250"/>
         <w:gridCol w:w="3941"/>
-        <w:gridCol w:w="3726"/>
-        <w:gridCol w:w="2067"/>
-        <w:gridCol w:w="1966"/>
+        <w:gridCol w:w="1758"/>
+        <w:gridCol w:w="1365"/>
+        <w:gridCol w:w="4636"/>
       </w:tblGrid>
       <w:tr>
         <w:trPr>
@@ -2650,7 +2729,6 @@
                 <w:sz w:val="24"/>
                 <w:szCs w:val="24"/>
               </w:rPr>
-              <w:lastRenderedPageBreak/>
               <w:t xml:space="preserve">Test </w:t>
             </w:r>
             <w:r>
@@ -2859,6 +2937,16 @@
               </w:rPr>
               <w:t xml:space="preserve">Peer tester: </w:t>
             </w:r>
+            <w:r>
+              <w:rPr>
+                <w:rFonts w:ascii="Arial" w:hAnsi="Arial" w:cs="Arial"/>
+                <w:b/>
+                <w:bCs/>
+                <w:sz w:val="20"/>
+                <w:szCs w:val="20"/>
+              </w:rPr>
+              <w:t>Cameron Mendez</w:t>
+            </w:r>
           </w:p>
           <w:p>
             <w:pPr>
@@ -2889,31 +2977,10 @@
             <w:r>
               <w:rPr>
                 <w:rFonts w:ascii="Arial" w:hAnsi="Arial" w:cs="Arial"/>
-                <w:color w:val="C00000"/>
-                <w:sz w:val="20"/>
-                <w:szCs w:val="20"/>
-              </w:rPr>
-              <w:t>&lt;</w:t>
-            </w:r>
-            <w:proofErr w:type="spellStart"/>
-            <w:r>
-              <w:rPr>
-                <w:rFonts w:ascii="Arial" w:hAnsi="Arial" w:cs="Arial"/>
-                <w:color w:val="C00000"/>
-                <w:sz w:val="20"/>
-                <w:szCs w:val="20"/>
-              </w:rPr>
-              <w:t>yyyy</w:t>
-            </w:r>
-            <w:proofErr w:type="spellEnd"/>
-            <w:r>
-              <w:rPr>
-                <w:rFonts w:ascii="Arial" w:hAnsi="Arial" w:cs="Arial"/>
-                <w:color w:val="C00000"/>
-                <w:sz w:val="20"/>
-                <w:szCs w:val="20"/>
-              </w:rPr>
-              <w:t>/mm/dd&gt;</w:t>
+                <w:sz w:val="20"/>
+                <w:szCs w:val="20"/>
+              </w:rPr>
+              <w:t>04/24/2026</w:t>
             </w:r>
           </w:p>
         </w:tc>
@@ -3106,27 +3173,7 @@
                 <w:sz w:val="20"/>
                 <w:szCs w:val="20"/>
               </w:rPr>
-              <w:t xml:space="preserve">Navigate to </w:t>
-            </w:r>
-            <w:proofErr w:type="spellStart"/>
-            <w:r>
-              <w:rPr>
-                <w:rFonts w:ascii="Arial" w:hAnsi="Arial" w:cs="Arial"/>
-                <w:color w:val="C00000"/>
-                <w:sz w:val="20"/>
-                <w:szCs w:val="20"/>
-              </w:rPr>
-              <w:t>MoffayBayLodge</w:t>
-            </w:r>
-            <w:proofErr w:type="spellEnd"/>
-            <w:r>
-              <w:rPr>
-                <w:rFonts w:ascii="Arial" w:hAnsi="Arial" w:cs="Arial"/>
-                <w:color w:val="C00000"/>
-                <w:sz w:val="20"/>
-                <w:szCs w:val="20"/>
-              </w:rPr>
-              <w:t xml:space="preserve"> landing page(</w:t>
+              <w:t>Navigate to MoffayBayLodge landing page(</w:t>
             </w:r>
             <w:r>
               <w:rPr>
@@ -3219,7 +3266,62 @@
                 <w:sz w:val="20"/>
                 <w:szCs w:val="20"/>
               </w:rPr>
-              <w:t>&lt;yes/no&gt;</w:t>
+              <w:t>Yes</w:t>
+            </w:r>
+          </w:p>
+          <w:p>
+            <w:pPr>
+              <w:spacing w:before="80" w:after="80"/>
+              <w:rPr>
+                <w:rFonts w:ascii="Arial" w:hAnsi="Arial" w:cs="Arial"/>
+                <w:color w:val="C00000"/>
+                <w:sz w:val="20"/>
+                <w:szCs w:val="20"/>
+              </w:rPr>
+            </w:pPr>
+            <w:r>
+              <w:rPr>
+                <w:rFonts w:ascii="Arial" w:hAnsi="Arial" w:cs="Arial"/>
+                <w:color w:val="C00000"/>
+                <w:sz w:val="20"/>
+                <w:szCs w:val="20"/>
+              </w:rPr>
+              <w:lastRenderedPageBreak/>
+              <w:drawing>
+                <wp:inline distT="0" distB="0" distL="0" distR="0" wp14:anchorId="07FE0DC8" wp14:editId="38636056">
+                  <wp:extent cx="2273300" cy="1331881"/>
+                  <wp:effectExtent l="0" t="0" r="0" b="1905"/>
+                  <wp:docPr id="322436250" name="Picture 1"/>
+                  <wp:cNvGraphicFramePr>
+                    <a:graphicFrameLocks xmlns:a="http://schemas.openxmlformats.org/drawingml/2006/main" noChangeAspect="1"/>
+                  </wp:cNvGraphicFramePr>
+                  <a:graphic xmlns:a="http://schemas.openxmlformats.org/drawingml/2006/main">
+                    <a:graphicData uri="http://schemas.openxmlformats.org/drawingml/2006/picture">
+                      <pic:pic xmlns:pic="http://schemas.openxmlformats.org/drawingml/2006/picture">
+                        <pic:nvPicPr>
+                          <pic:cNvPr id="1436926483" name=""/>
+                          <pic:cNvPicPr/>
+                        </pic:nvPicPr>
+                        <pic:blipFill>
+                          <a:blip r:embed="rId8"/>
+                          <a:stretch>
+                            <a:fillRect/>
+                          </a:stretch>
+                        </pic:blipFill>
+                        <pic:spPr>
+                          <a:xfrm>
+                            <a:off x="0" y="0"/>
+                            <a:ext cx="2280515" cy="1336108"/>
+                          </a:xfrm>
+                          <a:prstGeom prst="rect">
+                            <a:avLst/>
+                          </a:prstGeom>
+                        </pic:spPr>
+                      </pic:pic>
+                    </a:graphicData>
+                  </a:graphic>
+                </wp:inline>
+              </w:drawing>
             </w:r>
           </w:p>
         </w:tc>
@@ -3247,6 +3349,7 @@
                 <w:sz w:val="20"/>
                 <w:szCs w:val="20"/>
               </w:rPr>
+              <w:lastRenderedPageBreak/>
               <w:t>2</w:t>
             </w:r>
           </w:p>
@@ -3347,7 +3450,61 @@
                 <w:sz w:val="20"/>
                 <w:szCs w:val="20"/>
               </w:rPr>
-              <w:t>&lt;yes/no&gt;</w:t>
+              <w:t>No</w:t>
+            </w:r>
+          </w:p>
+          <w:p>
+            <w:pPr>
+              <w:spacing w:before="80" w:after="80"/>
+              <w:rPr>
+                <w:rFonts w:ascii="Arial" w:hAnsi="Arial" w:cs="Arial"/>
+                <w:color w:val="C00000"/>
+                <w:sz w:val="20"/>
+                <w:szCs w:val="20"/>
+              </w:rPr>
+            </w:pPr>
+            <w:r>
+              <w:rPr>
+                <w:rFonts w:ascii="Arial" w:hAnsi="Arial" w:cs="Arial"/>
+                <w:color w:val="C00000"/>
+                <w:sz w:val="20"/>
+                <w:szCs w:val="20"/>
+              </w:rPr>
+              <w:drawing>
+                <wp:inline distT="0" distB="0" distL="0" distR="0" wp14:anchorId="6D5FF933" wp14:editId="15E803A1">
+                  <wp:extent cx="2806700" cy="980851"/>
+                  <wp:effectExtent l="0" t="0" r="0" b="0"/>
+                  <wp:docPr id="1881302972" name="Picture 1"/>
+                  <wp:cNvGraphicFramePr>
+                    <a:graphicFrameLocks xmlns:a="http://schemas.openxmlformats.org/drawingml/2006/main" noChangeAspect="1"/>
+                  </wp:cNvGraphicFramePr>
+                  <a:graphic xmlns:a="http://schemas.openxmlformats.org/drawingml/2006/main">
+                    <a:graphicData uri="http://schemas.openxmlformats.org/drawingml/2006/picture">
+                      <pic:pic xmlns:pic="http://schemas.openxmlformats.org/drawingml/2006/picture">
+                        <pic:nvPicPr>
+                          <pic:cNvPr id="1240259731" name=""/>
+                          <pic:cNvPicPr/>
+                        </pic:nvPicPr>
+                        <pic:blipFill>
+                          <a:blip r:embed="rId9"/>
+                          <a:stretch>
+                            <a:fillRect/>
+                          </a:stretch>
+                        </pic:blipFill>
+                        <pic:spPr>
+                          <a:xfrm>
+                            <a:off x="0" y="0"/>
+                            <a:ext cx="2812208" cy="982776"/>
+                          </a:xfrm>
+                          <a:prstGeom prst="rect">
+                            <a:avLst/>
+                          </a:prstGeom>
+                        </pic:spPr>
+                      </pic:pic>
+                    </a:graphicData>
+                  </a:graphic>
+                </wp:inline>
+              </w:drawing>
             </w:r>
           </w:p>
         </w:tc>
@@ -3475,7 +3632,7 @@
                 <w:sz w:val="20"/>
                 <w:szCs w:val="20"/>
               </w:rPr>
-              <w:t>&lt;yes/no&gt;</w:t>
+              <w:t>No</w:t>
             </w:r>
           </w:p>
         </w:tc>
@@ -3546,25 +3703,14 @@
                 <w:szCs w:val="20"/>
               </w:rPr>
             </w:pPr>
-            <w:proofErr w:type="gramStart"/>
-            <w:r>
-              <w:rPr>
-                <w:rFonts w:ascii="Arial" w:hAnsi="Arial" w:cs="Arial"/>
-                <w:color w:val="C00000"/>
-                <w:sz w:val="20"/>
-                <w:szCs w:val="20"/>
-              </w:rPr>
-              <w:t>User</w:t>
-            </w:r>
-            <w:proofErr w:type="gramEnd"/>
-            <w:r>
-              <w:rPr>
-                <w:rFonts w:ascii="Arial" w:hAnsi="Arial" w:cs="Arial"/>
-                <w:color w:val="C00000"/>
-                <w:sz w:val="20"/>
-                <w:szCs w:val="20"/>
-              </w:rPr>
-              <w:t xml:space="preserve"> will be shown what attractions were selected in addition to their room booking</w:t>
+            <w:r>
+              <w:rPr>
+                <w:rFonts w:ascii="Arial" w:hAnsi="Arial" w:cs="Arial"/>
+                <w:color w:val="C00000"/>
+                <w:sz w:val="20"/>
+                <w:szCs w:val="20"/>
+              </w:rPr>
+              <w:t>User will be shown what attractions were selected in addition to their room booking</w:t>
             </w:r>
           </w:p>
         </w:tc>
@@ -3614,7 +3760,61 @@
                 <w:sz w:val="20"/>
                 <w:szCs w:val="20"/>
               </w:rPr>
-              <w:t>&lt;yes/no&gt;</w:t>
+              <w:t>Yes</w:t>
+            </w:r>
+          </w:p>
+          <w:p>
+            <w:pPr>
+              <w:spacing w:before="80" w:after="80"/>
+              <w:rPr>
+                <w:rFonts w:ascii="Arial" w:hAnsi="Arial" w:cs="Arial"/>
+                <w:color w:val="C00000"/>
+                <w:sz w:val="20"/>
+                <w:szCs w:val="20"/>
+              </w:rPr>
+            </w:pPr>
+            <w:r>
+              <w:rPr>
+                <w:rFonts w:ascii="Arial" w:hAnsi="Arial" w:cs="Arial"/>
+                <w:color w:val="C00000"/>
+                <w:sz w:val="20"/>
+                <w:szCs w:val="20"/>
+              </w:rPr>
+              <w:drawing>
+                <wp:inline distT="0" distB="0" distL="0" distR="0" wp14:anchorId="51E067C6" wp14:editId="37AD57C3">
+                  <wp:extent cx="2341229" cy="1092200"/>
+                  <wp:effectExtent l="0" t="0" r="2540" b="0"/>
+                  <wp:docPr id="800391624" name="Picture 1"/>
+                  <wp:cNvGraphicFramePr>
+                    <a:graphicFrameLocks xmlns:a="http://schemas.openxmlformats.org/drawingml/2006/main" noChangeAspect="1"/>
+                  </wp:cNvGraphicFramePr>
+                  <a:graphic xmlns:a="http://schemas.openxmlformats.org/drawingml/2006/main">
+                    <a:graphicData uri="http://schemas.openxmlformats.org/drawingml/2006/picture">
+                      <pic:pic xmlns:pic="http://schemas.openxmlformats.org/drawingml/2006/picture">
+                        <pic:nvPicPr>
+                          <pic:cNvPr id="800391624" name=""/>
+                          <pic:cNvPicPr/>
+                        </pic:nvPicPr>
+                        <pic:blipFill>
+                          <a:blip r:embed="rId11"/>
+                          <a:stretch>
+                            <a:fillRect/>
+                          </a:stretch>
+                        </pic:blipFill>
+                        <pic:spPr>
+                          <a:xfrm>
+                            <a:off x="0" y="0"/>
+                            <a:ext cx="2344806" cy="1093869"/>
+                          </a:xfrm>
+                          <a:prstGeom prst="rect">
+                            <a:avLst/>
+                          </a:prstGeom>
+                        </pic:spPr>
+                      </pic:pic>
+                    </a:graphicData>
+                  </a:graphic>
+                </wp:inline>
+              </w:drawing>
             </w:r>
           </w:p>
         </w:tc>
@@ -3742,7 +3942,7 @@
                 <w:sz w:val="20"/>
                 <w:szCs w:val="20"/>
               </w:rPr>
-              <w:t>&lt;yes/no&gt;</w:t>
+              <w:t>No</w:t>
             </w:r>
           </w:p>
         </w:tc>
@@ -3774,6 +3974,7 @@
                 <w:sz w:val="20"/>
                 <w:szCs w:val="20"/>
               </w:rPr>
+              <w:lastRenderedPageBreak/>
               <w:t>Comments</w:t>
             </w:r>
           </w:p>
@@ -3800,7 +4001,7 @@
                 <w:sz w:val="20"/>
                 <w:szCs w:val="20"/>
               </w:rPr>
-              <w:t>Comments should be substantive; this means there should be at least 2-3 well-structured sentences with constructive feedback.</w:t>
+              <w:t>No confirmation on submission or errors, no check out date selection</w:t>
             </w:r>
           </w:p>
         </w:tc>
@@ -3823,11 +4024,11 @@
         <w:tblLook w:val="04A0" w:firstRow="1" w:lastRow="0" w:firstColumn="1" w:lastColumn="0" w:noHBand="0" w:noVBand="1"/>
       </w:tblPr>
       <w:tblGrid>
-        <w:gridCol w:w="1251"/>
+        <w:gridCol w:w="1250"/>
         <w:gridCol w:w="3941"/>
-        <w:gridCol w:w="3716"/>
-        <w:gridCol w:w="2071"/>
-        <w:gridCol w:w="1971"/>
+        <w:gridCol w:w="1757"/>
+        <w:gridCol w:w="1366"/>
+        <w:gridCol w:w="4636"/>
       </w:tblGrid>
       <w:tr>
         <w:trPr>
@@ -4061,6 +4262,16 @@
               </w:rPr>
               <w:t xml:space="preserve">Peer tester: </w:t>
             </w:r>
+            <w:r>
+              <w:rPr>
+                <w:rFonts w:ascii="Arial" w:hAnsi="Arial" w:cs="Arial"/>
+                <w:b/>
+                <w:bCs/>
+                <w:sz w:val="20"/>
+                <w:szCs w:val="20"/>
+              </w:rPr>
+              <w:t>Cameron Mendez</w:t>
+            </w:r>
           </w:p>
           <w:p>
             <w:pPr>
@@ -4091,31 +4302,10 @@
             <w:r>
               <w:rPr>
                 <w:rFonts w:ascii="Arial" w:hAnsi="Arial" w:cs="Arial"/>
-                <w:color w:val="C00000"/>
-                <w:sz w:val="20"/>
-                <w:szCs w:val="20"/>
-              </w:rPr>
-              <w:t>&lt;</w:t>
-            </w:r>
-            <w:proofErr w:type="spellStart"/>
-            <w:r>
-              <w:rPr>
-                <w:rFonts w:ascii="Arial" w:hAnsi="Arial" w:cs="Arial"/>
-                <w:color w:val="C00000"/>
-                <w:sz w:val="20"/>
-                <w:szCs w:val="20"/>
-              </w:rPr>
-              <w:t>yyyy</w:t>
-            </w:r>
-            <w:proofErr w:type="spellEnd"/>
-            <w:r>
-              <w:rPr>
-                <w:rFonts w:ascii="Arial" w:hAnsi="Arial" w:cs="Arial"/>
-                <w:color w:val="C00000"/>
-                <w:sz w:val="20"/>
-                <w:szCs w:val="20"/>
-              </w:rPr>
-              <w:t>/mm/dd&gt;</w:t>
+                <w:sz w:val="20"/>
+                <w:szCs w:val="20"/>
+              </w:rPr>
+              <w:t>04/24/2026</w:t>
             </w:r>
           </w:p>
         </w:tc>
@@ -4308,27 +4498,7 @@
                 <w:sz w:val="20"/>
                 <w:szCs w:val="20"/>
               </w:rPr>
-              <w:t xml:space="preserve">Navigate to </w:t>
-            </w:r>
-            <w:proofErr w:type="spellStart"/>
-            <w:r>
-              <w:rPr>
-                <w:rFonts w:ascii="Arial" w:hAnsi="Arial" w:cs="Arial"/>
-                <w:color w:val="C00000"/>
-                <w:sz w:val="20"/>
-                <w:szCs w:val="20"/>
-              </w:rPr>
-              <w:t>MoffayBayLodge</w:t>
-            </w:r>
-            <w:proofErr w:type="spellEnd"/>
-            <w:r>
-              <w:rPr>
-                <w:rFonts w:ascii="Arial" w:hAnsi="Arial" w:cs="Arial"/>
-                <w:color w:val="C00000"/>
-                <w:sz w:val="20"/>
-                <w:szCs w:val="20"/>
-              </w:rPr>
-              <w:t xml:space="preserve"> landing page(</w:t>
+              <w:t>Navigate to MoffayBayLodge landing page(</w:t>
             </w:r>
             <w:r>
               <w:rPr>
@@ -4421,7 +4591,61 @@
                 <w:sz w:val="20"/>
                 <w:szCs w:val="20"/>
               </w:rPr>
-              <w:t>&lt;yes/no&gt;</w:t>
+              <w:t>Yes</w:t>
+            </w:r>
+          </w:p>
+          <w:p>
+            <w:pPr>
+              <w:spacing w:before="80" w:after="80"/>
+              <w:rPr>
+                <w:rFonts w:ascii="Arial" w:hAnsi="Arial" w:cs="Arial"/>
+                <w:color w:val="C00000"/>
+                <w:sz w:val="20"/>
+                <w:szCs w:val="20"/>
+              </w:rPr>
+            </w:pPr>
+            <w:r>
+              <w:rPr>
+                <w:rFonts w:ascii="Arial" w:hAnsi="Arial" w:cs="Arial"/>
+                <w:color w:val="C00000"/>
+                <w:sz w:val="20"/>
+                <w:szCs w:val="20"/>
+              </w:rPr>
+              <w:drawing>
+                <wp:inline distT="0" distB="0" distL="0" distR="0" wp14:anchorId="1D41C087" wp14:editId="7E83C272">
+                  <wp:extent cx="2273300" cy="1331881"/>
+                  <wp:effectExtent l="0" t="0" r="0" b="1905"/>
+                  <wp:docPr id="1408479073" name="Picture 1"/>
+                  <wp:cNvGraphicFramePr>
+                    <a:graphicFrameLocks xmlns:a="http://schemas.openxmlformats.org/drawingml/2006/main" noChangeAspect="1"/>
+                  </wp:cNvGraphicFramePr>
+                  <a:graphic xmlns:a="http://schemas.openxmlformats.org/drawingml/2006/main">
+                    <a:graphicData uri="http://schemas.openxmlformats.org/drawingml/2006/picture">
+                      <pic:pic xmlns:pic="http://schemas.openxmlformats.org/drawingml/2006/picture">
+                        <pic:nvPicPr>
+                          <pic:cNvPr id="1436926483" name=""/>
+                          <pic:cNvPicPr/>
+                        </pic:nvPicPr>
+                        <pic:blipFill>
+                          <a:blip r:embed="rId8"/>
+                          <a:stretch>
+                            <a:fillRect/>
+                          </a:stretch>
+                        </pic:blipFill>
+                        <pic:spPr>
+                          <a:xfrm>
+                            <a:off x="0" y="0"/>
+                            <a:ext cx="2280515" cy="1336108"/>
+                          </a:xfrm>
+                          <a:prstGeom prst="rect">
+                            <a:avLst/>
+                          </a:prstGeom>
+                        </pic:spPr>
+                      </pic:pic>
+                    </a:graphicData>
+                  </a:graphic>
+                </wp:inline>
+              </w:drawing>
             </w:r>
           </w:p>
         </w:tc>
@@ -4449,7 +4673,6 @@
                 <w:sz w:val="20"/>
                 <w:szCs w:val="20"/>
               </w:rPr>
-              <w:lastRenderedPageBreak/>
               <w:t>2</w:t>
             </w:r>
           </w:p>
@@ -4550,7 +4773,61 @@
                 <w:sz w:val="20"/>
                 <w:szCs w:val="20"/>
               </w:rPr>
-              <w:t>&lt;yes/no&gt;</w:t>
+              <w:t>No</w:t>
+            </w:r>
+          </w:p>
+          <w:p>
+            <w:pPr>
+              <w:spacing w:before="80" w:after="80"/>
+              <w:rPr>
+                <w:rFonts w:ascii="Arial" w:hAnsi="Arial" w:cs="Arial"/>
+                <w:color w:val="C00000"/>
+                <w:sz w:val="20"/>
+                <w:szCs w:val="20"/>
+              </w:rPr>
+            </w:pPr>
+            <w:r>
+              <w:rPr>
+                <w:rFonts w:ascii="Arial" w:hAnsi="Arial" w:cs="Arial"/>
+                <w:color w:val="C00000"/>
+                <w:sz w:val="20"/>
+                <w:szCs w:val="20"/>
+              </w:rPr>
+              <w:drawing>
+                <wp:inline distT="0" distB="0" distL="0" distR="0" wp14:anchorId="02070304" wp14:editId="620B7396">
+                  <wp:extent cx="2806700" cy="980851"/>
+                  <wp:effectExtent l="0" t="0" r="0" b="0"/>
+                  <wp:docPr id="1416557870" name="Picture 1"/>
+                  <wp:cNvGraphicFramePr>
+                    <a:graphicFrameLocks xmlns:a="http://schemas.openxmlformats.org/drawingml/2006/main" noChangeAspect="1"/>
+                  </wp:cNvGraphicFramePr>
+                  <a:graphic xmlns:a="http://schemas.openxmlformats.org/drawingml/2006/main">
+                    <a:graphicData uri="http://schemas.openxmlformats.org/drawingml/2006/picture">
+                      <pic:pic xmlns:pic="http://schemas.openxmlformats.org/drawingml/2006/picture">
+                        <pic:nvPicPr>
+                          <pic:cNvPr id="1240259731" name=""/>
+                          <pic:cNvPicPr/>
+                        </pic:nvPicPr>
+                        <pic:blipFill>
+                          <a:blip r:embed="rId9"/>
+                          <a:stretch>
+                            <a:fillRect/>
+                          </a:stretch>
+                        </pic:blipFill>
+                        <pic:spPr>
+                          <a:xfrm>
+                            <a:off x="0" y="0"/>
+                            <a:ext cx="2812208" cy="982776"/>
+                          </a:xfrm>
+                          <a:prstGeom prst="rect">
+                            <a:avLst/>
+                          </a:prstGeom>
+                        </pic:spPr>
+                      </pic:pic>
+                    </a:graphicData>
+                  </a:graphic>
+                </wp:inline>
+              </w:drawing>
             </w:r>
           </w:p>
         </w:tc>
@@ -4628,7 +4905,17 @@
                 <w:sz w:val="20"/>
                 <w:szCs w:val="20"/>
               </w:rPr>
-              <w:t>I will be redirected back to the reservation page to be able to make a reservation</w:t>
+              <w:t xml:space="preserve">I will be redirected back to the reservation page to be able to </w:t>
+            </w:r>
+            <w:r>
+              <w:rPr>
+                <w:rFonts w:ascii="Arial" w:hAnsi="Arial" w:cs="Arial"/>
+                <w:color w:val="C00000"/>
+                <w:sz w:val="20"/>
+                <w:szCs w:val="20"/>
+              </w:rPr>
+              <w:lastRenderedPageBreak/>
+              <w:t>make a reservation</w:t>
             </w:r>
           </w:p>
         </w:tc>
@@ -4653,6 +4940,7 @@
                 <w:sz w:val="20"/>
                 <w:szCs w:val="20"/>
               </w:rPr>
+              <w:lastRenderedPageBreak/>
               <w:t>Pass</w:t>
             </w:r>
           </w:p>
@@ -4678,7 +4966,7 @@
                 <w:sz w:val="20"/>
                 <w:szCs w:val="20"/>
               </w:rPr>
-              <w:t>&lt;yes/no&gt;</w:t>
+              <w:t>No</w:t>
             </w:r>
           </w:p>
         </w:tc>
@@ -4806,7 +5094,61 @@
                 <w:sz w:val="20"/>
                 <w:szCs w:val="20"/>
               </w:rPr>
-              <w:t>&lt;yes/no&gt;</w:t>
+              <w:t>No</w:t>
+            </w:r>
+          </w:p>
+          <w:p>
+            <w:pPr>
+              <w:spacing w:before="80" w:after="80"/>
+              <w:rPr>
+                <w:rFonts w:ascii="Arial" w:hAnsi="Arial" w:cs="Arial"/>
+                <w:color w:val="C00000"/>
+                <w:sz w:val="20"/>
+                <w:szCs w:val="20"/>
+              </w:rPr>
+            </w:pPr>
+            <w:r>
+              <w:rPr>
+                <w:rFonts w:ascii="Arial" w:hAnsi="Arial" w:cs="Arial"/>
+                <w:color w:val="C00000"/>
+                <w:sz w:val="20"/>
+                <w:szCs w:val="20"/>
+              </w:rPr>
+              <w:drawing>
+                <wp:inline distT="0" distB="0" distL="0" distR="0" wp14:anchorId="51037873" wp14:editId="1B0A6562">
+                  <wp:extent cx="2406149" cy="1511300"/>
+                  <wp:effectExtent l="0" t="0" r="0" b="0"/>
+                  <wp:docPr id="1775436213" name="Picture 1"/>
+                  <wp:cNvGraphicFramePr>
+                    <a:graphicFrameLocks xmlns:a="http://schemas.openxmlformats.org/drawingml/2006/main" noChangeAspect="1"/>
+                  </wp:cNvGraphicFramePr>
+                  <a:graphic xmlns:a="http://schemas.openxmlformats.org/drawingml/2006/main">
+                    <a:graphicData uri="http://schemas.openxmlformats.org/drawingml/2006/picture">
+                      <pic:pic xmlns:pic="http://schemas.openxmlformats.org/drawingml/2006/picture">
+                        <pic:nvPicPr>
+                          <pic:cNvPr id="1775436213" name=""/>
+                          <pic:cNvPicPr/>
+                        </pic:nvPicPr>
+                        <pic:blipFill>
+                          <a:blip r:embed="rId12"/>
+                          <a:stretch>
+                            <a:fillRect/>
+                          </a:stretch>
+                        </pic:blipFill>
+                        <pic:spPr>
+                          <a:xfrm>
+                            <a:off x="0" y="0"/>
+                            <a:ext cx="2410194" cy="1513841"/>
+                          </a:xfrm>
+                          <a:prstGeom prst="rect">
+                            <a:avLst/>
+                          </a:prstGeom>
+                        </pic:spPr>
+                      </pic:pic>
+                    </a:graphicData>
+                  </a:graphic>
+                </wp:inline>
+              </w:drawing>
             </w:r>
           </w:p>
         </w:tc>
@@ -4934,7 +5276,7 @@
                 <w:sz w:val="20"/>
                 <w:szCs w:val="20"/>
               </w:rPr>
-              <w:t>&lt;yes/no&gt;</w:t>
+              <w:t>No</w:t>
             </w:r>
           </w:p>
         </w:tc>
@@ -4992,7 +5334,7 @@
                 <w:sz w:val="20"/>
                 <w:szCs w:val="20"/>
               </w:rPr>
-              <w:t>Comments should be substantive; this means there should be at least 2-3 well-structured sentences with constructive feedback.</w:t>
+              <w:t>No error messages or confirmation messages after submission, appears reservation went through</w:t>
             </w:r>
           </w:p>
         </w:tc>
@@ -5015,11 +5357,11 @@
         <w:tblLook w:val="04A0" w:firstRow="1" w:lastRow="0" w:firstColumn="1" w:lastColumn="0" w:noHBand="0" w:noVBand="1"/>
       </w:tblPr>
       <w:tblGrid>
-        <w:gridCol w:w="1251"/>
+        <w:gridCol w:w="1250"/>
         <w:gridCol w:w="3941"/>
-        <w:gridCol w:w="3716"/>
-        <w:gridCol w:w="2071"/>
-        <w:gridCol w:w="1971"/>
+        <w:gridCol w:w="1757"/>
+        <w:gridCol w:w="1366"/>
+        <w:gridCol w:w="4636"/>
       </w:tblGrid>
       <w:tr>
         <w:trPr>
@@ -5045,15 +5387,7 @@
                 <w:sz w:val="24"/>
                 <w:szCs w:val="24"/>
               </w:rPr>
-              <w:t xml:space="preserve">Test </w:t>
-            </w:r>
-            <w:r>
-              <w:rPr>
-                <w:rFonts w:ascii="Arial" w:hAnsi="Arial" w:cs="Arial"/>
-                <w:sz w:val="24"/>
-                <w:szCs w:val="24"/>
-              </w:rPr>
-              <w:t>4</w:t>
+              <w:t>Test 4</w:t>
             </w:r>
           </w:p>
         </w:tc>
@@ -5096,16 +5430,7 @@
                 <w:bCs/>
                 <w:color w:val="auto"/>
               </w:rPr>
-              <w:t xml:space="preserve"> a Room </w:t>
-            </w:r>
-            <w:r>
-              <w:rPr>
-                <w:rFonts w:ascii="Arial" w:hAnsi="Arial" w:cs="Arial"/>
-                <w:b/>
-                <w:bCs/>
-                <w:color w:val="auto"/>
-              </w:rPr>
-              <w:t>with no Check-out date</w:t>
+              <w:t xml:space="preserve"> a Room with no Check-out date</w:t>
             </w:r>
           </w:p>
         </w:tc>
@@ -5301,6 +5626,16 @@
               </w:rPr>
               <w:t xml:space="preserve">Peer tester: </w:t>
             </w:r>
+            <w:r>
+              <w:rPr>
+                <w:rFonts w:ascii="Arial" w:hAnsi="Arial" w:cs="Arial"/>
+                <w:b/>
+                <w:bCs/>
+                <w:sz w:val="20"/>
+                <w:szCs w:val="20"/>
+              </w:rPr>
+              <w:t>Cameron Mendez</w:t>
+            </w:r>
           </w:p>
           <w:p>
             <w:pPr>
@@ -5331,31 +5666,10 @@
             <w:r>
               <w:rPr>
                 <w:rFonts w:ascii="Arial" w:hAnsi="Arial" w:cs="Arial"/>
-                <w:color w:val="C00000"/>
-                <w:sz w:val="20"/>
-                <w:szCs w:val="20"/>
-              </w:rPr>
-              <w:t>&lt;</w:t>
-            </w:r>
-            <w:proofErr w:type="spellStart"/>
-            <w:r>
-              <w:rPr>
-                <w:rFonts w:ascii="Arial" w:hAnsi="Arial" w:cs="Arial"/>
-                <w:color w:val="C00000"/>
-                <w:sz w:val="20"/>
-                <w:szCs w:val="20"/>
-              </w:rPr>
-              <w:t>yyyy</w:t>
-            </w:r>
-            <w:proofErr w:type="spellEnd"/>
-            <w:r>
-              <w:rPr>
-                <w:rFonts w:ascii="Arial" w:hAnsi="Arial" w:cs="Arial"/>
-                <w:color w:val="C00000"/>
-                <w:sz w:val="20"/>
-                <w:szCs w:val="20"/>
-              </w:rPr>
-              <w:t>/mm/dd&gt;</w:t>
+                <w:sz w:val="20"/>
+                <w:szCs w:val="20"/>
+              </w:rPr>
+              <w:t>04/24/2026</w:t>
             </w:r>
           </w:p>
         </w:tc>
@@ -5548,27 +5862,7 @@
                 <w:sz w:val="20"/>
                 <w:szCs w:val="20"/>
               </w:rPr>
-              <w:t xml:space="preserve">Navigate to </w:t>
-            </w:r>
-            <w:proofErr w:type="spellStart"/>
-            <w:r>
-              <w:rPr>
-                <w:rFonts w:ascii="Arial" w:hAnsi="Arial" w:cs="Arial"/>
-                <w:color w:val="C00000"/>
-                <w:sz w:val="20"/>
-                <w:szCs w:val="20"/>
-              </w:rPr>
-              <w:t>MoffayBayLodge</w:t>
-            </w:r>
-            <w:proofErr w:type="spellEnd"/>
-            <w:r>
-              <w:rPr>
-                <w:rFonts w:ascii="Arial" w:hAnsi="Arial" w:cs="Arial"/>
-                <w:color w:val="C00000"/>
-                <w:sz w:val="20"/>
-                <w:szCs w:val="20"/>
-              </w:rPr>
-              <w:t xml:space="preserve"> landing page(</w:t>
+              <w:t>Navigate to MoffayBayLodge landing page(</w:t>
             </w:r>
             <w:r>
               <w:rPr>
@@ -5661,7 +5955,62 @@
                 <w:sz w:val="20"/>
                 <w:szCs w:val="20"/>
               </w:rPr>
-              <w:t>&lt;yes/no&gt;</w:t>
+              <w:t>Yes</w:t>
+            </w:r>
+          </w:p>
+          <w:p>
+            <w:pPr>
+              <w:spacing w:before="80" w:after="80"/>
+              <w:rPr>
+                <w:rFonts w:ascii="Arial" w:hAnsi="Arial" w:cs="Arial"/>
+                <w:color w:val="C00000"/>
+                <w:sz w:val="20"/>
+                <w:szCs w:val="20"/>
+              </w:rPr>
+            </w:pPr>
+            <w:r>
+              <w:rPr>
+                <w:rFonts w:ascii="Arial" w:hAnsi="Arial" w:cs="Arial"/>
+                <w:color w:val="C00000"/>
+                <w:sz w:val="20"/>
+                <w:szCs w:val="20"/>
+              </w:rPr>
+              <w:lastRenderedPageBreak/>
+              <w:drawing>
+                <wp:inline distT="0" distB="0" distL="0" distR="0" wp14:anchorId="642F8BB9" wp14:editId="0F102707">
+                  <wp:extent cx="2273300" cy="1331881"/>
+                  <wp:effectExtent l="0" t="0" r="0" b="1905"/>
+                  <wp:docPr id="1060412981" name="Picture 1"/>
+                  <wp:cNvGraphicFramePr>
+                    <a:graphicFrameLocks xmlns:a="http://schemas.openxmlformats.org/drawingml/2006/main" noChangeAspect="1"/>
+                  </wp:cNvGraphicFramePr>
+                  <a:graphic xmlns:a="http://schemas.openxmlformats.org/drawingml/2006/main">
+                    <a:graphicData uri="http://schemas.openxmlformats.org/drawingml/2006/picture">
+                      <pic:pic xmlns:pic="http://schemas.openxmlformats.org/drawingml/2006/picture">
+                        <pic:nvPicPr>
+                          <pic:cNvPr id="1436926483" name=""/>
+                          <pic:cNvPicPr/>
+                        </pic:nvPicPr>
+                        <pic:blipFill>
+                          <a:blip r:embed="rId8"/>
+                          <a:stretch>
+                            <a:fillRect/>
+                          </a:stretch>
+                        </pic:blipFill>
+                        <pic:spPr>
+                          <a:xfrm>
+                            <a:off x="0" y="0"/>
+                            <a:ext cx="2280515" cy="1336108"/>
+                          </a:xfrm>
+                          <a:prstGeom prst="rect">
+                            <a:avLst/>
+                          </a:prstGeom>
+                        </pic:spPr>
+                      </pic:pic>
+                    </a:graphicData>
+                  </a:graphic>
+                </wp:inline>
+              </w:drawing>
             </w:r>
           </w:p>
         </w:tc>
@@ -5689,6 +6038,7 @@
                 <w:sz w:val="20"/>
                 <w:szCs w:val="20"/>
               </w:rPr>
+              <w:lastRenderedPageBreak/>
               <w:t>2</w:t>
             </w:r>
           </w:p>
@@ -5789,7 +6139,61 @@
                 <w:sz w:val="20"/>
                 <w:szCs w:val="20"/>
               </w:rPr>
-              <w:t>&lt;yes/no&gt;</w:t>
+              <w:t>No</w:t>
+            </w:r>
+          </w:p>
+          <w:p>
+            <w:pPr>
+              <w:spacing w:before="80" w:after="80"/>
+              <w:rPr>
+                <w:rFonts w:ascii="Arial" w:hAnsi="Arial" w:cs="Arial"/>
+                <w:color w:val="C00000"/>
+                <w:sz w:val="20"/>
+                <w:szCs w:val="20"/>
+              </w:rPr>
+            </w:pPr>
+            <w:r>
+              <w:rPr>
+                <w:rFonts w:ascii="Arial" w:hAnsi="Arial" w:cs="Arial"/>
+                <w:color w:val="C00000"/>
+                <w:sz w:val="20"/>
+                <w:szCs w:val="20"/>
+              </w:rPr>
+              <w:drawing>
+                <wp:inline distT="0" distB="0" distL="0" distR="0" wp14:anchorId="4C4B7DF0" wp14:editId="072B3A2E">
+                  <wp:extent cx="2806700" cy="980851"/>
+                  <wp:effectExtent l="0" t="0" r="0" b="0"/>
+                  <wp:docPr id="197920614" name="Picture 1"/>
+                  <wp:cNvGraphicFramePr>
+                    <a:graphicFrameLocks xmlns:a="http://schemas.openxmlformats.org/drawingml/2006/main" noChangeAspect="1"/>
+                  </wp:cNvGraphicFramePr>
+                  <a:graphic xmlns:a="http://schemas.openxmlformats.org/drawingml/2006/main">
+                    <a:graphicData uri="http://schemas.openxmlformats.org/drawingml/2006/picture">
+                      <pic:pic xmlns:pic="http://schemas.openxmlformats.org/drawingml/2006/picture">
+                        <pic:nvPicPr>
+                          <pic:cNvPr id="1240259731" name=""/>
+                          <pic:cNvPicPr/>
+                        </pic:nvPicPr>
+                        <pic:blipFill>
+                          <a:blip r:embed="rId9"/>
+                          <a:stretch>
+                            <a:fillRect/>
+                          </a:stretch>
+                        </pic:blipFill>
+                        <pic:spPr>
+                          <a:xfrm>
+                            <a:off x="0" y="0"/>
+                            <a:ext cx="2812208" cy="982776"/>
+                          </a:xfrm>
+                          <a:prstGeom prst="rect">
+                            <a:avLst/>
+                          </a:prstGeom>
+                        </pic:spPr>
+                      </pic:pic>
+                    </a:graphicData>
+                  </a:graphic>
+                </wp:inline>
+              </w:drawing>
             </w:r>
           </w:p>
         </w:tc>
@@ -5926,7 +6330,7 @@
                 <w:sz w:val="20"/>
                 <w:szCs w:val="20"/>
               </w:rPr>
-              <w:t>&lt;yes/no&gt;</w:t>
+              <w:t>No</w:t>
             </w:r>
           </w:p>
         </w:tc>
@@ -5979,16 +6383,7 @@
                 <w:sz w:val="20"/>
                 <w:szCs w:val="20"/>
               </w:rPr>
-              <w:t xml:space="preserve">Attempt to </w:t>
-            </w:r>
-            <w:r>
-              <w:rPr>
-                <w:rFonts w:ascii="Arial" w:hAnsi="Arial" w:cs="Arial"/>
-                <w:color w:val="C00000"/>
-                <w:sz w:val="20"/>
-                <w:szCs w:val="20"/>
-              </w:rPr>
-              <w:t xml:space="preserve">reserve a room with a </w:t>
+              <w:t xml:space="preserve">Attempt to reserve a room with a </w:t>
             </w:r>
             <w:r>
               <w:rPr>
@@ -6153,7 +6548,61 @@
                 <w:sz w:val="20"/>
                 <w:szCs w:val="20"/>
               </w:rPr>
-              <w:t>&lt;yes/no&gt;</w:t>
+              <w:t>No</w:t>
+            </w:r>
+          </w:p>
+          <w:p>
+            <w:pPr>
+              <w:spacing w:before="80" w:after="80"/>
+              <w:rPr>
+                <w:rFonts w:ascii="Arial" w:hAnsi="Arial" w:cs="Arial"/>
+                <w:color w:val="C00000"/>
+                <w:sz w:val="20"/>
+                <w:szCs w:val="20"/>
+              </w:rPr>
+            </w:pPr>
+            <w:r>
+              <w:rPr>
+                <w:rFonts w:ascii="Arial" w:hAnsi="Arial" w:cs="Arial"/>
+                <w:color w:val="C00000"/>
+                <w:sz w:val="20"/>
+                <w:szCs w:val="20"/>
+              </w:rPr>
+              <w:drawing>
+                <wp:inline distT="0" distB="0" distL="0" distR="0" wp14:anchorId="33292BB4" wp14:editId="4D7E7108">
+                  <wp:extent cx="2806700" cy="980851"/>
+                  <wp:effectExtent l="0" t="0" r="0" b="0"/>
+                  <wp:docPr id="1482952935" name="Picture 1"/>
+                  <wp:cNvGraphicFramePr>
+                    <a:graphicFrameLocks xmlns:a="http://schemas.openxmlformats.org/drawingml/2006/main" noChangeAspect="1"/>
+                  </wp:cNvGraphicFramePr>
+                  <a:graphic xmlns:a="http://schemas.openxmlformats.org/drawingml/2006/main">
+                    <a:graphicData uri="http://schemas.openxmlformats.org/drawingml/2006/picture">
+                      <pic:pic xmlns:pic="http://schemas.openxmlformats.org/drawingml/2006/picture">
+                        <pic:nvPicPr>
+                          <pic:cNvPr id="1240259731" name=""/>
+                          <pic:cNvPicPr/>
+                        </pic:nvPicPr>
+                        <pic:blipFill>
+                          <a:blip r:embed="rId9"/>
+                          <a:stretch>
+                            <a:fillRect/>
+                          </a:stretch>
+                        </pic:blipFill>
+                        <pic:spPr>
+                          <a:xfrm>
+                            <a:off x="0" y="0"/>
+                            <a:ext cx="2812208" cy="982776"/>
+                          </a:xfrm>
+                          <a:prstGeom prst="rect">
+                            <a:avLst/>
+                          </a:prstGeom>
+                        </pic:spPr>
+                      </pic:pic>
+                    </a:graphicData>
+                  </a:graphic>
+                </wp:inline>
+              </w:drawing>
             </w:r>
           </w:p>
         </w:tc>
@@ -6181,7 +6630,6 @@
                 <w:sz w:val="20"/>
                 <w:szCs w:val="20"/>
               </w:rPr>
-              <w:lastRenderedPageBreak/>
               <w:t>5</w:t>
             </w:r>
           </w:p>
@@ -6282,7 +6730,7 @@
                 <w:sz w:val="20"/>
                 <w:szCs w:val="20"/>
               </w:rPr>
-              <w:t>&lt;yes/no&gt;</w:t>
+              <w:t>No</w:t>
             </w:r>
           </w:p>
         </w:tc>
@@ -6314,6 +6762,7 @@
                 <w:sz w:val="20"/>
                 <w:szCs w:val="20"/>
               </w:rPr>
+              <w:lastRenderedPageBreak/>
               <w:t>Comments</w:t>
             </w:r>
           </w:p>
@@ -6340,7 +6789,7 @@
                 <w:sz w:val="20"/>
                 <w:szCs w:val="20"/>
               </w:rPr>
-              <w:t>Comments should be substantive; this means there should be at least 2-3 well-structured sentences with constructive feedback.</w:t>
+              <w:t xml:space="preserve">No check out date selections available </w:t>
             </w:r>
           </w:p>
         </w:tc>
@@ -6357,8 +6806,8 @@
       </w:pPr>
     </w:p>
     <w:sectPr>
-      <w:headerReference w:type="default" r:id="rId8"/>
-      <w:footerReference w:type="default" r:id="rId9"/>
+      <w:headerReference w:type="default" r:id="rId13"/>
+      <w:footerReference w:type="default" r:id="rId14"/>
       <w:pgSz w:w="15840" w:h="12240" w:orient="landscape"/>
       <w:pgMar w:top="1440" w:right="1440" w:bottom="1440" w:left="1440" w:header="720" w:footer="720" w:gutter="0"/>
       <w:cols w:space="720"/>
@@ -6573,18 +7022,8 @@
         <w:sz w:val="36"/>
         <w:szCs w:val="36"/>
       </w:rPr>
-      <w:t xml:space="preserve">Bravo Team Test Cases : </w:t>
+      <w:t>Bravo Team Test Cases : Reservation.php</w:t>
     </w:r>
-    <w:proofErr w:type="spellStart"/>
-    <w:r>
-      <w:rPr>
-        <w:rFonts w:ascii="Times New Roman" w:hAnsi="Times New Roman" w:cs="Times New Roman"/>
-        <w:sz w:val="36"/>
-        <w:szCs w:val="36"/>
-      </w:rPr>
-      <w:t>Reservation.php</w:t>
-    </w:r>
-    <w:proofErr w:type="spellEnd"/>
   </w:p>
 </w:hdr>
 </file>

</xml_diff>

<commit_message>
Revised Test plan for module-6
</commit_message>
<xml_diff>
--- a/MODULE-6/6.2 Test Plan - MoffatBay.docx
+++ b/MODULE-6/6.2 Test Plan - MoffatBay.docx
@@ -98,7 +98,25 @@
                 <w:sz w:val="20"/>
                 <w:szCs w:val="20"/>
               </w:rPr>
-              <w:t>Zachary Anderson, Tevyah Hanley, Cameron Mendez, Angela Vargas</w:t>
+              <w:t xml:space="preserve">Zachary Anderson, </w:t>
+            </w:r>
+            <w:proofErr w:type="spellStart"/>
+            <w:r>
+              <w:rPr>
+                <w:rFonts w:ascii="Arial" w:hAnsi="Arial" w:cs="Arial"/>
+                <w:sz w:val="20"/>
+                <w:szCs w:val="20"/>
+              </w:rPr>
+              <w:t>Tevyah</w:t>
+            </w:r>
+            <w:proofErr w:type="spellEnd"/>
+            <w:r>
+              <w:rPr>
+                <w:rFonts w:ascii="Arial" w:hAnsi="Arial" w:cs="Arial"/>
+                <w:sz w:val="20"/>
+                <w:szCs w:val="20"/>
+              </w:rPr>
+              <w:t xml:space="preserve"> Hanley, Cameron Mendez, Angela Vargas</w:t>
             </w:r>
           </w:p>
         </w:tc>
@@ -1072,9 +1090,9 @@
       <w:tblGrid>
         <w:gridCol w:w="1250"/>
         <w:gridCol w:w="3941"/>
-        <w:gridCol w:w="1757"/>
-        <w:gridCol w:w="1366"/>
-        <w:gridCol w:w="4636"/>
+        <w:gridCol w:w="1742"/>
+        <w:gridCol w:w="1361"/>
+        <w:gridCol w:w="4656"/>
       </w:tblGrid>
       <w:tr>
         <w:trPr>
@@ -1597,7 +1615,27 @@
                 <w:sz w:val="20"/>
                 <w:szCs w:val="20"/>
               </w:rPr>
-              <w:t>Navigate to MoffayBayLodge landing page</w:t>
+              <w:t xml:space="preserve">Navigate to </w:t>
+            </w:r>
+            <w:proofErr w:type="spellStart"/>
+            <w:r>
+              <w:rPr>
+                <w:rFonts w:ascii="Arial" w:hAnsi="Arial" w:cs="Arial"/>
+                <w:color w:val="C00000"/>
+                <w:sz w:val="20"/>
+                <w:szCs w:val="20"/>
+              </w:rPr>
+              <w:t>MoffayBayLodge</w:t>
+            </w:r>
+            <w:proofErr w:type="spellEnd"/>
+            <w:r>
+              <w:rPr>
+                <w:rFonts w:ascii="Arial" w:hAnsi="Arial" w:cs="Arial"/>
+                <w:color w:val="C00000"/>
+                <w:sz w:val="20"/>
+                <w:szCs w:val="20"/>
+              </w:rPr>
+              <w:t xml:space="preserve"> landing page</w:t>
             </w:r>
             <w:r>
               <w:rPr>
@@ -1715,6 +1753,7 @@
             <w:r>
               <w:rPr>
                 <w:rFonts w:ascii="Arial" w:hAnsi="Arial" w:cs="Arial"/>
+                <w:noProof/>
                 <w:color w:val="C00000"/>
                 <w:sz w:val="20"/>
                 <w:szCs w:val="20"/>
@@ -1962,31 +2001,32 @@
                 <w:sz w:val="20"/>
                 <w:szCs w:val="20"/>
               </w:rPr>
-              <w:t>No</w:t>
-            </w:r>
-          </w:p>
-          <w:p>
-            <w:pPr>
-              <w:spacing w:before="80" w:after="80"/>
-              <w:rPr>
-                <w:rFonts w:ascii="Arial" w:hAnsi="Arial" w:cs="Arial"/>
-                <w:color w:val="C00000"/>
-                <w:sz w:val="20"/>
-                <w:szCs w:val="20"/>
-              </w:rPr>
-            </w:pPr>
-            <w:r>
-              <w:rPr>
-                <w:rFonts w:ascii="Arial" w:hAnsi="Arial" w:cs="Arial"/>
-                <w:color w:val="C00000"/>
-                <w:sz w:val="20"/>
-                <w:szCs w:val="20"/>
-              </w:rPr>
+              <w:t>Yes</w:t>
+            </w:r>
+          </w:p>
+          <w:p>
+            <w:pPr>
+              <w:spacing w:before="80" w:after="80"/>
+              <w:rPr>
+                <w:rFonts w:ascii="Arial" w:hAnsi="Arial" w:cs="Arial"/>
+                <w:color w:val="C00000"/>
+                <w:sz w:val="20"/>
+                <w:szCs w:val="20"/>
+              </w:rPr>
+            </w:pPr>
+            <w:r>
+              <w:rPr>
+                <w:rFonts w:ascii="Arial" w:hAnsi="Arial" w:cs="Arial"/>
+                <w:color w:val="C00000"/>
+                <w:sz w:val="20"/>
+                <w:szCs w:val="20"/>
+              </w:rPr>
+              <w:lastRenderedPageBreak/>
               <w:drawing>
-                <wp:inline distT="0" distB="0" distL="0" distR="0" wp14:anchorId="02BFDA89" wp14:editId="647F6245">
-                  <wp:extent cx="2806700" cy="980851"/>
-                  <wp:effectExtent l="0" t="0" r="0" b="0"/>
-                  <wp:docPr id="1240259731" name="Picture 1"/>
+                <wp:inline distT="0" distB="0" distL="0" distR="0" wp14:anchorId="2BE18C8C" wp14:editId="000C64EE">
+                  <wp:extent cx="1976816" cy="1562100"/>
+                  <wp:effectExtent l="0" t="0" r="4445" b="0"/>
+                  <wp:docPr id="79938956" name="Picture 1"/>
                   <wp:cNvGraphicFramePr>
                     <a:graphicFrameLocks xmlns:a="http://schemas.openxmlformats.org/drawingml/2006/main" noChangeAspect="1"/>
                   </wp:cNvGraphicFramePr>
@@ -1994,7 +2034,7 @@
                     <a:graphicData uri="http://schemas.openxmlformats.org/drawingml/2006/picture">
                       <pic:pic xmlns:pic="http://schemas.openxmlformats.org/drawingml/2006/picture">
                         <pic:nvPicPr>
-                          <pic:cNvPr id="1240259731" name=""/>
+                          <pic:cNvPr id="79938956" name=""/>
                           <pic:cNvPicPr/>
                         </pic:nvPicPr>
                         <pic:blipFill>
@@ -2006,7 +2046,7 @@
                         <pic:spPr>
                           <a:xfrm>
                             <a:off x="0" y="0"/>
-                            <a:ext cx="2812208" cy="982776"/>
+                            <a:ext cx="1980955" cy="1565371"/>
                           </a:xfrm>
                           <a:prstGeom prst="rect">
                             <a:avLst/>
@@ -2044,6 +2084,7 @@
                 <w:sz w:val="20"/>
                 <w:szCs w:val="20"/>
               </w:rPr>
+              <w:lastRenderedPageBreak/>
               <w:t>3</w:t>
             </w:r>
           </w:p>
@@ -2148,7 +2189,6 @@
                 <w:sz w:val="20"/>
                 <w:szCs w:val="20"/>
               </w:rPr>
-              <w:lastRenderedPageBreak/>
               <w:t>reservation page to be able to make a reservation</w:t>
             </w:r>
           </w:p>
@@ -2174,7 +2214,6 @@
                 <w:sz w:val="20"/>
                 <w:szCs w:val="20"/>
               </w:rPr>
-              <w:lastRenderedPageBreak/>
               <w:t>Pass</w:t>
             </w:r>
           </w:p>
@@ -2200,198 +2239,7 @@
                 <w:sz w:val="20"/>
                 <w:szCs w:val="20"/>
               </w:rPr>
-              <w:t>No</w:t>
-            </w:r>
-          </w:p>
-        </w:tc>
-      </w:tr>
-      <w:tr>
-        <w:trPr>
-          <w:trHeight w:val="350"/>
-        </w:trPr>
-        <w:tc>
-          <w:tcPr>
-            <w:tcW w:w="1250" w:type="dxa"/>
-          </w:tcPr>
-          <w:p>
-            <w:pPr>
-              <w:spacing w:before="80" w:after="80"/>
-              <w:rPr>
-                <w:rFonts w:ascii="Arial" w:hAnsi="Arial" w:cs="Arial"/>
-                <w:sz w:val="20"/>
-                <w:szCs w:val="20"/>
-              </w:rPr>
-            </w:pPr>
-            <w:r>
-              <w:rPr>
-                <w:rFonts w:ascii="Arial" w:hAnsi="Arial" w:cs="Arial"/>
-                <w:sz w:val="20"/>
-                <w:szCs w:val="20"/>
-              </w:rPr>
-              <w:t>4</w:t>
-            </w:r>
-          </w:p>
-        </w:tc>
-        <w:tc>
-          <w:tcPr>
-            <w:tcW w:w="3571" w:type="dxa"/>
-          </w:tcPr>
-          <w:p>
-            <w:pPr>
-              <w:spacing w:before="80" w:after="80"/>
-              <w:rPr>
-                <w:rFonts w:ascii="Arial" w:hAnsi="Arial" w:cs="Arial"/>
-                <w:color w:val="C00000"/>
-                <w:sz w:val="20"/>
-                <w:szCs w:val="20"/>
-              </w:rPr>
-            </w:pPr>
-            <w:r>
-              <w:rPr>
-                <w:rFonts w:ascii="Arial" w:hAnsi="Arial" w:cs="Arial"/>
-                <w:color w:val="C00000"/>
-                <w:sz w:val="20"/>
-                <w:szCs w:val="20"/>
-              </w:rPr>
-              <w:t>Make a Reservation</w:t>
-            </w:r>
-          </w:p>
-        </w:tc>
-        <w:tc>
-          <w:tcPr>
-            <w:tcW w:w="3929" w:type="dxa"/>
-          </w:tcPr>
-          <w:p>
-            <w:pPr>
-              <w:spacing w:before="80" w:after="80"/>
-              <w:rPr>
-                <w:rFonts w:ascii="Arial" w:hAnsi="Arial" w:cs="Arial"/>
-                <w:color w:val="C00000"/>
-                <w:sz w:val="20"/>
-                <w:szCs w:val="20"/>
-              </w:rPr>
-            </w:pPr>
-            <w:r>
-              <w:rPr>
-                <w:rFonts w:ascii="Arial" w:hAnsi="Arial" w:cs="Arial"/>
-                <w:color w:val="C00000"/>
-                <w:sz w:val="20"/>
-                <w:szCs w:val="20"/>
-              </w:rPr>
-              <w:t>The form</w:t>
-            </w:r>
-            <w:r>
-              <w:rPr>
-                <w:rFonts w:ascii="Arial" w:hAnsi="Arial" w:cs="Arial"/>
-                <w:color w:val="C00000"/>
-                <w:sz w:val="20"/>
-                <w:szCs w:val="20"/>
-              </w:rPr>
-              <w:t xml:space="preserve"> will display the reservation booked and show </w:t>
-            </w:r>
-            <w:r>
-              <w:rPr>
-                <w:rFonts w:ascii="Arial" w:hAnsi="Arial" w:cs="Arial"/>
-                <w:color w:val="C00000"/>
-                <w:sz w:val="20"/>
-                <w:szCs w:val="20"/>
-              </w:rPr>
-              <w:t xml:space="preserve">the </w:t>
-            </w:r>
-            <w:r>
-              <w:rPr>
-                <w:rFonts w:ascii="Arial" w:hAnsi="Arial" w:cs="Arial"/>
-                <w:color w:val="C00000"/>
-                <w:sz w:val="20"/>
-                <w:szCs w:val="20"/>
-              </w:rPr>
-              <w:t xml:space="preserve">total </w:t>
-            </w:r>
-            <w:r>
-              <w:rPr>
-                <w:rFonts w:ascii="Arial" w:hAnsi="Arial" w:cs="Arial"/>
-                <w:color w:val="C00000"/>
-                <w:sz w:val="20"/>
-                <w:szCs w:val="20"/>
-              </w:rPr>
-              <w:t xml:space="preserve">cost </w:t>
-            </w:r>
-            <w:r>
-              <w:rPr>
-                <w:rFonts w:ascii="Arial" w:hAnsi="Arial" w:cs="Arial"/>
-                <w:color w:val="C00000"/>
-                <w:sz w:val="20"/>
-                <w:szCs w:val="20"/>
-              </w:rPr>
-              <w:t xml:space="preserve">of </w:t>
-            </w:r>
-            <w:r>
-              <w:rPr>
-                <w:rFonts w:ascii="Arial" w:hAnsi="Arial" w:cs="Arial"/>
-                <w:color w:val="C00000"/>
-                <w:sz w:val="20"/>
-                <w:szCs w:val="20"/>
-              </w:rPr>
-              <w:t xml:space="preserve">the </w:t>
-            </w:r>
-            <w:r>
-              <w:rPr>
-                <w:rFonts w:ascii="Arial" w:hAnsi="Arial" w:cs="Arial"/>
-                <w:color w:val="C00000"/>
-                <w:sz w:val="20"/>
-                <w:szCs w:val="20"/>
-              </w:rPr>
-              <w:t>room selected</w:t>
-            </w:r>
-          </w:p>
-        </w:tc>
-        <w:tc>
-          <w:tcPr>
-            <w:tcW w:w="2148" w:type="dxa"/>
-          </w:tcPr>
-          <w:p>
-            <w:pPr>
-              <w:spacing w:before="80" w:after="80"/>
-              <w:rPr>
-                <w:rFonts w:ascii="Arial" w:hAnsi="Arial" w:cs="Arial"/>
-                <w:color w:val="C00000"/>
-                <w:sz w:val="20"/>
-                <w:szCs w:val="20"/>
-              </w:rPr>
-            </w:pPr>
-            <w:r>
-              <w:rPr>
-                <w:rFonts w:ascii="Arial" w:hAnsi="Arial" w:cs="Arial"/>
-                <w:color w:val="C00000"/>
-                <w:sz w:val="20"/>
-                <w:szCs w:val="20"/>
-              </w:rPr>
-              <w:t>Pass</w:t>
-            </w:r>
-          </w:p>
-        </w:tc>
-        <w:tc>
-          <w:tcPr>
-            <w:tcW w:w="2052" w:type="dxa"/>
-          </w:tcPr>
-          <w:p>
-            <w:pPr>
-              <w:spacing w:before="80" w:after="80"/>
-              <w:rPr>
-                <w:rFonts w:ascii="Arial" w:hAnsi="Arial" w:cs="Arial"/>
-                <w:color w:val="C00000"/>
-                <w:sz w:val="20"/>
-                <w:szCs w:val="20"/>
-              </w:rPr>
-            </w:pPr>
-            <w:r>
-              <w:rPr>
-                <w:rFonts w:ascii="Arial" w:hAnsi="Arial" w:cs="Arial"/>
-                <w:color w:val="C00000"/>
-                <w:sz w:val="20"/>
-                <w:szCs w:val="20"/>
-              </w:rPr>
-              <w:t>No</w:t>
+              <w:t>Yes</w:t>
             </w:r>
           </w:p>
           <w:p>
@@ -2412,10 +2260,10 @@
                 <w:szCs w:val="20"/>
               </w:rPr>
               <w:drawing>
-                <wp:inline distT="0" distB="0" distL="0" distR="0" wp14:anchorId="0157FFAE" wp14:editId="1BECAF32">
-                  <wp:extent cx="2438400" cy="1690370"/>
-                  <wp:effectExtent l="0" t="0" r="0" b="5080"/>
-                  <wp:docPr id="414590909" name="Picture 1"/>
+                <wp:inline distT="0" distB="0" distL="0" distR="0" wp14:anchorId="5F470E07" wp14:editId="43F21D33">
+                  <wp:extent cx="2184400" cy="1805420"/>
+                  <wp:effectExtent l="0" t="0" r="6350" b="4445"/>
+                  <wp:docPr id="639338486" name="Picture 1"/>
                   <wp:cNvGraphicFramePr>
                     <a:graphicFrameLocks xmlns:a="http://schemas.openxmlformats.org/drawingml/2006/main" noChangeAspect="1"/>
                   </wp:cNvGraphicFramePr>
@@ -2423,7 +2271,7 @@
                     <a:graphicData uri="http://schemas.openxmlformats.org/drawingml/2006/picture">
                       <pic:pic xmlns:pic="http://schemas.openxmlformats.org/drawingml/2006/picture">
                         <pic:nvPicPr>
-                          <pic:cNvPr id="414590909" name=""/>
+                          <pic:cNvPr id="767645164" name=""/>
                           <pic:cNvPicPr/>
                         </pic:nvPicPr>
                         <pic:blipFill>
@@ -2435,7 +2283,7 @@
                         <pic:spPr>
                           <a:xfrm>
                             <a:off x="0" y="0"/>
-                            <a:ext cx="2443101" cy="1693629"/>
+                            <a:ext cx="2187529" cy="1808006"/>
                           </a:xfrm>
                           <a:prstGeom prst="rect">
                             <a:avLst/>
@@ -2473,7 +2321,7 @@
                 <w:sz w:val="20"/>
                 <w:szCs w:val="20"/>
               </w:rPr>
-              <w:t>5</w:t>
+              <w:t>4</w:t>
             </w:r>
           </w:p>
         </w:tc>
@@ -2498,16 +2346,41 @@
                 <w:sz w:val="20"/>
                 <w:szCs w:val="20"/>
               </w:rPr>
-              <w:t>Log out</w:t>
-            </w:r>
-            <w:r>
-              <w:rPr>
-                <w:rFonts w:ascii="Arial" w:hAnsi="Arial" w:cs="Arial"/>
-                <w:color w:val="C00000"/>
-                <w:sz w:val="20"/>
-                <w:szCs w:val="20"/>
-              </w:rPr>
-              <w:t xml:space="preserve"> of </w:t>
+              <w:t>Make a Reservation</w:t>
+            </w:r>
+          </w:p>
+        </w:tc>
+        <w:tc>
+          <w:tcPr>
+            <w:tcW w:w="3929" w:type="dxa"/>
+          </w:tcPr>
+          <w:p>
+            <w:pPr>
+              <w:spacing w:before="80" w:after="80"/>
+              <w:rPr>
+                <w:rFonts w:ascii="Arial" w:hAnsi="Arial" w:cs="Arial"/>
+                <w:color w:val="C00000"/>
+                <w:sz w:val="20"/>
+                <w:szCs w:val="20"/>
+              </w:rPr>
+            </w:pPr>
+            <w:r>
+              <w:rPr>
+                <w:rFonts w:ascii="Arial" w:hAnsi="Arial" w:cs="Arial"/>
+                <w:color w:val="C00000"/>
+                <w:sz w:val="20"/>
+                <w:szCs w:val="20"/>
+              </w:rPr>
+              <w:t>The form</w:t>
+            </w:r>
+            <w:r>
+              <w:rPr>
+                <w:rFonts w:ascii="Arial" w:hAnsi="Arial" w:cs="Arial"/>
+                <w:color w:val="C00000"/>
+                <w:sz w:val="20"/>
+                <w:szCs w:val="20"/>
+              </w:rPr>
+              <w:t xml:space="preserve"> will display the reservation booked and show </w:t>
             </w:r>
             <w:r>
               <w:rPr>
@@ -2525,32 +2398,25 @@
                 <w:sz w:val="20"/>
                 <w:szCs w:val="20"/>
               </w:rPr>
-              <w:t>registered user</w:t>
-            </w:r>
-          </w:p>
-        </w:tc>
-        <w:tc>
-          <w:tcPr>
-            <w:tcW w:w="3929" w:type="dxa"/>
-          </w:tcPr>
-          <w:p>
-            <w:pPr>
-              <w:spacing w:before="80" w:after="80"/>
-              <w:rPr>
-                <w:rFonts w:ascii="Arial" w:hAnsi="Arial" w:cs="Arial"/>
-                <w:color w:val="C00000"/>
-                <w:sz w:val="20"/>
-                <w:szCs w:val="20"/>
-              </w:rPr>
-            </w:pPr>
-            <w:r>
-              <w:rPr>
-                <w:rFonts w:ascii="Arial" w:hAnsi="Arial" w:cs="Arial"/>
-                <w:color w:val="C00000"/>
-                <w:sz w:val="20"/>
-                <w:szCs w:val="20"/>
-              </w:rPr>
-              <w:t xml:space="preserve">Will be redirected back to </w:t>
+              <w:t xml:space="preserve">total </w:t>
+            </w:r>
+            <w:r>
+              <w:rPr>
+                <w:rFonts w:ascii="Arial" w:hAnsi="Arial" w:cs="Arial"/>
+                <w:color w:val="C00000"/>
+                <w:sz w:val="20"/>
+                <w:szCs w:val="20"/>
+              </w:rPr>
+              <w:t xml:space="preserve">cost </w:t>
+            </w:r>
+            <w:r>
+              <w:rPr>
+                <w:rFonts w:ascii="Arial" w:hAnsi="Arial" w:cs="Arial"/>
+                <w:color w:val="C00000"/>
+                <w:sz w:val="20"/>
+                <w:szCs w:val="20"/>
+              </w:rPr>
+              <w:t xml:space="preserve">of </w:t>
             </w:r>
             <w:r>
               <w:rPr>
@@ -2568,7 +2434,7 @@
                 <w:sz w:val="20"/>
                 <w:szCs w:val="20"/>
               </w:rPr>
-              <w:t>landing page</w:t>
+              <w:t>room selected</w:t>
             </w:r>
           </w:p>
         </w:tc>
@@ -2603,23 +2469,103 @@
           </w:tcPr>
           <w:p>
             <w:pPr>
-              <w:spacing w:before="80" w:after="80"/>
-              <w:rPr>
-                <w:rFonts w:ascii="Arial" w:hAnsi="Arial" w:cs="Arial"/>
-                <w:color w:val="C00000"/>
-                <w:sz w:val="20"/>
-                <w:szCs w:val="20"/>
-              </w:rPr>
-            </w:pPr>
-            <w:r>
-              <w:rPr>
-                <w:rFonts w:ascii="Arial" w:hAnsi="Arial" w:cs="Arial"/>
-                <w:color w:val="C00000"/>
-                <w:sz w:val="20"/>
-                <w:szCs w:val="20"/>
-              </w:rPr>
-              <w:t>No – Not able to create customer account</w:t>
-            </w:r>
+              <w:tabs>
+                <w:tab w:val="right" w:pos="3580"/>
+              </w:tabs>
+              <w:spacing w:before="80" w:after="80"/>
+              <w:rPr>
+                <w:rFonts w:ascii="Arial" w:hAnsi="Arial" w:cs="Arial"/>
+                <w:color w:val="C00000"/>
+                <w:sz w:val="20"/>
+                <w:szCs w:val="20"/>
+              </w:rPr>
+            </w:pPr>
+            <w:r>
+              <w:rPr>
+                <w:rFonts w:ascii="Arial" w:hAnsi="Arial" w:cs="Arial"/>
+                <w:color w:val="C00000"/>
+                <w:sz w:val="20"/>
+                <w:szCs w:val="20"/>
+              </w:rPr>
+              <w:t>Yes</w:t>
+            </w:r>
+          </w:p>
+          <w:p>
+            <w:pPr>
+              <w:tabs>
+                <w:tab w:val="right" w:pos="3580"/>
+              </w:tabs>
+              <w:spacing w:before="80" w:after="80"/>
+              <w:rPr>
+                <w:rFonts w:ascii="Arial" w:hAnsi="Arial" w:cs="Arial"/>
+                <w:color w:val="C00000"/>
+                <w:sz w:val="20"/>
+                <w:szCs w:val="20"/>
+              </w:rPr>
+            </w:pPr>
+            <w:r>
+              <w:rPr>
+                <w:rFonts w:ascii="Arial" w:hAnsi="Arial" w:cs="Arial"/>
+                <w:color w:val="C00000"/>
+                <w:sz w:val="20"/>
+                <w:szCs w:val="20"/>
+              </w:rPr>
+              <w:drawing>
+                <wp:inline distT="0" distB="0" distL="0" distR="0" wp14:anchorId="1892F3C8" wp14:editId="589EF41B">
+                  <wp:extent cx="1511300" cy="986367"/>
+                  <wp:effectExtent l="0" t="0" r="0" b="4445"/>
+                  <wp:docPr id="1965839743" name="Picture 1"/>
+                  <wp:cNvGraphicFramePr>
+                    <a:graphicFrameLocks xmlns:a="http://schemas.openxmlformats.org/drawingml/2006/main" noChangeAspect="1"/>
+                  </wp:cNvGraphicFramePr>
+                  <a:graphic xmlns:a="http://schemas.openxmlformats.org/drawingml/2006/main">
+                    <a:graphicData uri="http://schemas.openxmlformats.org/drawingml/2006/picture">
+                      <pic:pic xmlns:pic="http://schemas.openxmlformats.org/drawingml/2006/picture">
+                        <pic:nvPicPr>
+                          <pic:cNvPr id="1965839743" name=""/>
+                          <pic:cNvPicPr/>
+                        </pic:nvPicPr>
+                        <pic:blipFill>
+                          <a:blip r:embed="rId11"/>
+                          <a:stretch>
+                            <a:fillRect/>
+                          </a:stretch>
+                        </pic:blipFill>
+                        <pic:spPr>
+                          <a:xfrm>
+                            <a:off x="0" y="0"/>
+                            <a:ext cx="1520319" cy="992253"/>
+                          </a:xfrm>
+                          <a:prstGeom prst="rect">
+                            <a:avLst/>
+                          </a:prstGeom>
+                        </pic:spPr>
+                      </pic:pic>
+                    </a:graphicData>
+                  </a:graphic>
+                </wp:inline>
+              </w:drawing>
+            </w:r>
+            <w:r>
+              <w:rPr>
+                <w:rFonts w:ascii="Arial" w:hAnsi="Arial" w:cs="Arial"/>
+                <w:color w:val="C00000"/>
+                <w:sz w:val="20"/>
+                <w:szCs w:val="20"/>
+              </w:rPr>
+              <w:tab/>
+            </w:r>
+          </w:p>
+          <w:p>
+            <w:pPr>
+              <w:spacing w:before="80" w:after="80"/>
+              <w:rPr>
+                <w:rFonts w:ascii="Arial" w:hAnsi="Arial" w:cs="Arial"/>
+                <w:color w:val="C00000"/>
+                <w:sz w:val="20"/>
+                <w:szCs w:val="20"/>
+              </w:rPr>
+            </w:pPr>
           </w:p>
         </w:tc>
       </w:tr>
@@ -2636,20 +2582,249 @@
               <w:spacing w:before="80" w:after="80"/>
               <w:rPr>
                 <w:rFonts w:ascii="Arial" w:hAnsi="Arial" w:cs="Arial"/>
-                <w:b/>
-                <w:bCs/>
-                <w:sz w:val="20"/>
-                <w:szCs w:val="20"/>
-              </w:rPr>
-            </w:pPr>
-            <w:r>
-              <w:rPr>
-                <w:rFonts w:ascii="Arial" w:hAnsi="Arial" w:cs="Arial"/>
-                <w:b/>
-                <w:bCs/>
-                <w:sz w:val="20"/>
-                <w:szCs w:val="20"/>
-              </w:rPr>
+                <w:sz w:val="20"/>
+                <w:szCs w:val="20"/>
+              </w:rPr>
+            </w:pPr>
+            <w:r>
+              <w:rPr>
+                <w:rFonts w:ascii="Arial" w:hAnsi="Arial" w:cs="Arial"/>
+                <w:sz w:val="20"/>
+                <w:szCs w:val="20"/>
+              </w:rPr>
+              <w:t>5</w:t>
+            </w:r>
+          </w:p>
+        </w:tc>
+        <w:tc>
+          <w:tcPr>
+            <w:tcW w:w="3571" w:type="dxa"/>
+          </w:tcPr>
+          <w:p>
+            <w:pPr>
+              <w:spacing w:before="80" w:after="80"/>
+              <w:rPr>
+                <w:rFonts w:ascii="Arial" w:hAnsi="Arial" w:cs="Arial"/>
+                <w:color w:val="C00000"/>
+                <w:sz w:val="20"/>
+                <w:szCs w:val="20"/>
+              </w:rPr>
+            </w:pPr>
+            <w:r>
+              <w:rPr>
+                <w:rFonts w:ascii="Arial" w:hAnsi="Arial" w:cs="Arial"/>
+                <w:color w:val="C00000"/>
+                <w:sz w:val="20"/>
+                <w:szCs w:val="20"/>
+              </w:rPr>
+              <w:t>Log out</w:t>
+            </w:r>
+            <w:r>
+              <w:rPr>
+                <w:rFonts w:ascii="Arial" w:hAnsi="Arial" w:cs="Arial"/>
+                <w:color w:val="C00000"/>
+                <w:sz w:val="20"/>
+                <w:szCs w:val="20"/>
+              </w:rPr>
+              <w:t xml:space="preserve"> of </w:t>
+            </w:r>
+            <w:r>
+              <w:rPr>
+                <w:rFonts w:ascii="Arial" w:hAnsi="Arial" w:cs="Arial"/>
+                <w:color w:val="C00000"/>
+                <w:sz w:val="20"/>
+                <w:szCs w:val="20"/>
+              </w:rPr>
+              <w:t xml:space="preserve">the </w:t>
+            </w:r>
+            <w:r>
+              <w:rPr>
+                <w:rFonts w:ascii="Arial" w:hAnsi="Arial" w:cs="Arial"/>
+                <w:color w:val="C00000"/>
+                <w:sz w:val="20"/>
+                <w:szCs w:val="20"/>
+              </w:rPr>
+              <w:t>registered user</w:t>
+            </w:r>
+          </w:p>
+        </w:tc>
+        <w:tc>
+          <w:tcPr>
+            <w:tcW w:w="3929" w:type="dxa"/>
+          </w:tcPr>
+          <w:p>
+            <w:pPr>
+              <w:spacing w:before="80" w:after="80"/>
+              <w:rPr>
+                <w:rFonts w:ascii="Arial" w:hAnsi="Arial" w:cs="Arial"/>
+                <w:color w:val="C00000"/>
+                <w:sz w:val="20"/>
+                <w:szCs w:val="20"/>
+              </w:rPr>
+            </w:pPr>
+            <w:r>
+              <w:rPr>
+                <w:rFonts w:ascii="Arial" w:hAnsi="Arial" w:cs="Arial"/>
+                <w:color w:val="C00000"/>
+                <w:sz w:val="20"/>
+                <w:szCs w:val="20"/>
+              </w:rPr>
+              <w:t xml:space="preserve">Will be redirected back to </w:t>
+            </w:r>
+            <w:r>
+              <w:rPr>
+                <w:rFonts w:ascii="Arial" w:hAnsi="Arial" w:cs="Arial"/>
+                <w:color w:val="C00000"/>
+                <w:sz w:val="20"/>
+                <w:szCs w:val="20"/>
+              </w:rPr>
+              <w:t xml:space="preserve">the </w:t>
+            </w:r>
+            <w:r>
+              <w:rPr>
+                <w:rFonts w:ascii="Arial" w:hAnsi="Arial" w:cs="Arial"/>
+                <w:color w:val="C00000"/>
+                <w:sz w:val="20"/>
+                <w:szCs w:val="20"/>
+              </w:rPr>
+              <w:t>landing page</w:t>
+            </w:r>
+          </w:p>
+        </w:tc>
+        <w:tc>
+          <w:tcPr>
+            <w:tcW w:w="2148" w:type="dxa"/>
+          </w:tcPr>
+          <w:p>
+            <w:pPr>
+              <w:spacing w:before="80" w:after="80"/>
+              <w:rPr>
+                <w:rFonts w:ascii="Arial" w:hAnsi="Arial" w:cs="Arial"/>
+                <w:color w:val="C00000"/>
+                <w:sz w:val="20"/>
+                <w:szCs w:val="20"/>
+              </w:rPr>
+            </w:pPr>
+            <w:r>
+              <w:rPr>
+                <w:rFonts w:ascii="Arial" w:hAnsi="Arial" w:cs="Arial"/>
+                <w:color w:val="C00000"/>
+                <w:sz w:val="20"/>
+                <w:szCs w:val="20"/>
+              </w:rPr>
+              <w:t>Pass</w:t>
+            </w:r>
+          </w:p>
+        </w:tc>
+        <w:tc>
+          <w:tcPr>
+            <w:tcW w:w="2052" w:type="dxa"/>
+          </w:tcPr>
+          <w:p>
+            <w:pPr>
+              <w:spacing w:before="80" w:after="80"/>
+              <w:rPr>
+                <w:rFonts w:ascii="Arial" w:hAnsi="Arial" w:cs="Arial"/>
+                <w:color w:val="C00000"/>
+                <w:sz w:val="20"/>
+                <w:szCs w:val="20"/>
+              </w:rPr>
+            </w:pPr>
+            <w:r>
+              <w:rPr>
+                <w:rFonts w:ascii="Arial" w:hAnsi="Arial" w:cs="Arial"/>
+                <w:color w:val="C00000"/>
+                <w:sz w:val="20"/>
+                <w:szCs w:val="20"/>
+              </w:rPr>
+              <w:t>Yes</w:t>
+            </w:r>
+          </w:p>
+          <w:p>
+            <w:pPr>
+              <w:spacing w:before="80" w:after="80"/>
+              <w:rPr>
+                <w:rFonts w:ascii="Arial" w:hAnsi="Arial" w:cs="Arial"/>
+                <w:color w:val="C00000"/>
+                <w:sz w:val="20"/>
+                <w:szCs w:val="20"/>
+              </w:rPr>
+            </w:pPr>
+            <w:r>
+              <w:rPr>
+                <w:rFonts w:ascii="Arial" w:hAnsi="Arial" w:cs="Arial"/>
+                <w:color w:val="C00000"/>
+                <w:sz w:val="20"/>
+                <w:szCs w:val="20"/>
+              </w:rPr>
+              <w:lastRenderedPageBreak/>
+              <w:drawing>
+                <wp:inline distT="0" distB="0" distL="0" distR="0" wp14:anchorId="1A21BEA1" wp14:editId="1B9AF743">
+                  <wp:extent cx="2819400" cy="615557"/>
+                  <wp:effectExtent l="0" t="0" r="0" b="0"/>
+                  <wp:docPr id="1793584332" name="Picture 1"/>
+                  <wp:cNvGraphicFramePr>
+                    <a:graphicFrameLocks xmlns:a="http://schemas.openxmlformats.org/drawingml/2006/main" noChangeAspect="1"/>
+                  </wp:cNvGraphicFramePr>
+                  <a:graphic xmlns:a="http://schemas.openxmlformats.org/drawingml/2006/main">
+                    <a:graphicData uri="http://schemas.openxmlformats.org/drawingml/2006/picture">
+                      <pic:pic xmlns:pic="http://schemas.openxmlformats.org/drawingml/2006/picture">
+                        <pic:nvPicPr>
+                          <pic:cNvPr id="535569739" name=""/>
+                          <pic:cNvPicPr/>
+                        </pic:nvPicPr>
+                        <pic:blipFill>
+                          <a:blip r:embed="rId12"/>
+                          <a:stretch>
+                            <a:fillRect/>
+                          </a:stretch>
+                        </pic:blipFill>
+                        <pic:spPr>
+                          <a:xfrm>
+                            <a:off x="0" y="0"/>
+                            <a:ext cx="2829325" cy="617724"/>
+                          </a:xfrm>
+                          <a:prstGeom prst="rect">
+                            <a:avLst/>
+                          </a:prstGeom>
+                        </pic:spPr>
+                      </pic:pic>
+                    </a:graphicData>
+                  </a:graphic>
+                </wp:inline>
+              </w:drawing>
+            </w:r>
+          </w:p>
+        </w:tc>
+      </w:tr>
+      <w:tr>
+        <w:trPr>
+          <w:trHeight w:val="350"/>
+        </w:trPr>
+        <w:tc>
+          <w:tcPr>
+            <w:tcW w:w="1250" w:type="dxa"/>
+          </w:tcPr>
+          <w:p>
+            <w:pPr>
+              <w:spacing w:before="80" w:after="80"/>
+              <w:rPr>
+                <w:rFonts w:ascii="Arial" w:hAnsi="Arial" w:cs="Arial"/>
+                <w:b/>
+                <w:bCs/>
+                <w:sz w:val="20"/>
+                <w:szCs w:val="20"/>
+              </w:rPr>
+            </w:pPr>
+            <w:r>
+              <w:rPr>
+                <w:rFonts w:ascii="Arial" w:hAnsi="Arial" w:cs="Arial"/>
+                <w:b/>
+                <w:bCs/>
+                <w:sz w:val="20"/>
+                <w:szCs w:val="20"/>
+              </w:rPr>
+              <w:lastRenderedPageBreak/>
               <w:t>Comments</w:t>
             </w:r>
           </w:p>
@@ -2669,15 +2844,6 @@
                 <w:szCs w:val="20"/>
               </w:rPr>
             </w:pPr>
-            <w:r>
-              <w:rPr>
-                <w:rFonts w:ascii="Arial" w:hAnsi="Arial" w:cs="Arial"/>
-                <w:color w:val="C00000"/>
-                <w:sz w:val="20"/>
-                <w:szCs w:val="20"/>
-              </w:rPr>
-              <w:t>Reservation page opened, no prompt on creating or logging into an account</w:t>
-            </w:r>
           </w:p>
         </w:tc>
       </w:tr>
@@ -2701,9 +2867,9 @@
       <w:tblGrid>
         <w:gridCol w:w="1250"/>
         <w:gridCol w:w="3941"/>
-        <w:gridCol w:w="1758"/>
-        <w:gridCol w:w="1365"/>
-        <w:gridCol w:w="4636"/>
+        <w:gridCol w:w="1743"/>
+        <w:gridCol w:w="1360"/>
+        <w:gridCol w:w="4656"/>
       </w:tblGrid>
       <w:tr>
         <w:trPr>
@@ -3173,7 +3339,27 @@
                 <w:sz w:val="20"/>
                 <w:szCs w:val="20"/>
               </w:rPr>
-              <w:t>Navigate to MoffayBayLodge landing page(</w:t>
+              <w:t xml:space="preserve">Navigate to </w:t>
+            </w:r>
+            <w:proofErr w:type="spellStart"/>
+            <w:r>
+              <w:rPr>
+                <w:rFonts w:ascii="Arial" w:hAnsi="Arial" w:cs="Arial"/>
+                <w:color w:val="C00000"/>
+                <w:sz w:val="20"/>
+                <w:szCs w:val="20"/>
+              </w:rPr>
+              <w:t>MoffayBayLodge</w:t>
+            </w:r>
+            <w:proofErr w:type="spellEnd"/>
+            <w:r>
+              <w:rPr>
+                <w:rFonts w:ascii="Arial" w:hAnsi="Arial" w:cs="Arial"/>
+                <w:color w:val="C00000"/>
+                <w:sz w:val="20"/>
+                <w:szCs w:val="20"/>
+              </w:rPr>
+              <w:t xml:space="preserve"> landing page(</w:t>
             </w:r>
             <w:r>
               <w:rPr>
@@ -3282,11 +3468,11 @@
             <w:r>
               <w:rPr>
                 <w:rFonts w:ascii="Arial" w:hAnsi="Arial" w:cs="Arial"/>
-                <w:color w:val="C00000"/>
-                <w:sz w:val="20"/>
-                <w:szCs w:val="20"/>
-              </w:rPr>
-              <w:lastRenderedPageBreak/>
+                <w:noProof/>
+                <w:color w:val="C00000"/>
+                <w:sz w:val="20"/>
+                <w:szCs w:val="20"/>
+              </w:rPr>
               <w:drawing>
                 <wp:inline distT="0" distB="0" distL="0" distR="0" wp14:anchorId="07FE0DC8" wp14:editId="38636056">
                   <wp:extent cx="2273300" cy="1331881"/>
@@ -3349,132 +3535,132 @@
                 <w:sz w:val="20"/>
                 <w:szCs w:val="20"/>
               </w:rPr>
+              <w:t>2</w:t>
+            </w:r>
+          </w:p>
+        </w:tc>
+        <w:tc>
+          <w:tcPr>
+            <w:tcW w:w="3941" w:type="dxa"/>
+          </w:tcPr>
+          <w:p>
+            <w:pPr>
+              <w:spacing w:before="80" w:after="80"/>
+              <w:rPr>
+                <w:rFonts w:ascii="Arial" w:hAnsi="Arial" w:cs="Arial"/>
+                <w:color w:val="C00000"/>
+                <w:sz w:val="20"/>
+                <w:szCs w:val="20"/>
+              </w:rPr>
+            </w:pPr>
+            <w:r>
+              <w:rPr>
+                <w:rFonts w:ascii="Arial" w:hAnsi="Arial" w:cs="Arial"/>
+                <w:color w:val="C00000"/>
+                <w:sz w:val="20"/>
+                <w:szCs w:val="20"/>
+              </w:rPr>
+              <w:t>Click Reservations to open the reservation form</w:t>
+            </w:r>
+          </w:p>
+        </w:tc>
+        <w:tc>
+          <w:tcPr>
+            <w:tcW w:w="3726" w:type="dxa"/>
+          </w:tcPr>
+          <w:p>
+            <w:pPr>
+              <w:spacing w:before="80" w:after="80"/>
+              <w:rPr>
+                <w:rFonts w:ascii="Arial" w:hAnsi="Arial" w:cs="Arial"/>
+                <w:color w:val="C00000"/>
+                <w:sz w:val="20"/>
+                <w:szCs w:val="20"/>
+              </w:rPr>
+            </w:pPr>
+            <w:r>
+              <w:rPr>
+                <w:rFonts w:ascii="Arial" w:hAnsi="Arial" w:cs="Arial"/>
+                <w:color w:val="C00000"/>
+                <w:sz w:val="20"/>
+                <w:szCs w:val="20"/>
+              </w:rPr>
+              <w:t>The page will redirect to the login page and inform me that I need to log in to make a reservation</w:t>
+            </w:r>
+          </w:p>
+        </w:tc>
+        <w:tc>
+          <w:tcPr>
+            <w:tcW w:w="2067" w:type="dxa"/>
+          </w:tcPr>
+          <w:p>
+            <w:pPr>
+              <w:spacing w:before="80" w:after="80"/>
+              <w:rPr>
+                <w:rFonts w:ascii="Arial" w:hAnsi="Arial" w:cs="Arial"/>
+                <w:color w:val="C00000"/>
+                <w:sz w:val="20"/>
+                <w:szCs w:val="20"/>
+              </w:rPr>
+            </w:pPr>
+            <w:r>
+              <w:rPr>
+                <w:rFonts w:ascii="Arial" w:hAnsi="Arial" w:cs="Arial"/>
+                <w:color w:val="C00000"/>
+                <w:sz w:val="20"/>
+                <w:szCs w:val="20"/>
+              </w:rPr>
+              <w:t>Pass</w:t>
+            </w:r>
+          </w:p>
+        </w:tc>
+        <w:tc>
+          <w:tcPr>
+            <w:tcW w:w="1966" w:type="dxa"/>
+          </w:tcPr>
+          <w:p>
+            <w:pPr>
+              <w:spacing w:before="80" w:after="80"/>
+              <w:rPr>
+                <w:rFonts w:ascii="Arial" w:hAnsi="Arial" w:cs="Arial"/>
+                <w:color w:val="C00000"/>
+                <w:sz w:val="20"/>
+                <w:szCs w:val="20"/>
+              </w:rPr>
+            </w:pPr>
+            <w:r>
+              <w:rPr>
+                <w:rFonts w:ascii="Arial" w:hAnsi="Arial" w:cs="Arial"/>
+                <w:color w:val="C00000"/>
+                <w:sz w:val="20"/>
+                <w:szCs w:val="20"/>
+              </w:rPr>
+              <w:t>Yes</w:t>
+            </w:r>
+          </w:p>
+          <w:p>
+            <w:pPr>
+              <w:spacing w:before="80" w:after="80"/>
+              <w:rPr>
+                <w:rFonts w:ascii="Arial" w:hAnsi="Arial" w:cs="Arial"/>
+                <w:color w:val="C00000"/>
+                <w:sz w:val="20"/>
+                <w:szCs w:val="20"/>
+              </w:rPr>
+            </w:pPr>
+            <w:r>
+              <w:rPr>
+                <w:rFonts w:ascii="Arial" w:hAnsi="Arial" w:cs="Arial"/>
+                <w:color w:val="C00000"/>
+                <w:sz w:val="20"/>
+                <w:szCs w:val="20"/>
+              </w:rPr>
               <w:lastRenderedPageBreak/>
-              <w:t>2</w:t>
-            </w:r>
-          </w:p>
-        </w:tc>
-        <w:tc>
-          <w:tcPr>
-            <w:tcW w:w="3941" w:type="dxa"/>
-          </w:tcPr>
-          <w:p>
-            <w:pPr>
-              <w:spacing w:before="80" w:after="80"/>
-              <w:rPr>
-                <w:rFonts w:ascii="Arial" w:hAnsi="Arial" w:cs="Arial"/>
-                <w:color w:val="C00000"/>
-                <w:sz w:val="20"/>
-                <w:szCs w:val="20"/>
-              </w:rPr>
-            </w:pPr>
-            <w:r>
-              <w:rPr>
-                <w:rFonts w:ascii="Arial" w:hAnsi="Arial" w:cs="Arial"/>
-                <w:color w:val="C00000"/>
-                <w:sz w:val="20"/>
-                <w:szCs w:val="20"/>
-              </w:rPr>
-              <w:t>Click Reservations to open the reservation form</w:t>
-            </w:r>
-          </w:p>
-        </w:tc>
-        <w:tc>
-          <w:tcPr>
-            <w:tcW w:w="3726" w:type="dxa"/>
-          </w:tcPr>
-          <w:p>
-            <w:pPr>
-              <w:spacing w:before="80" w:after="80"/>
-              <w:rPr>
-                <w:rFonts w:ascii="Arial" w:hAnsi="Arial" w:cs="Arial"/>
-                <w:color w:val="C00000"/>
-                <w:sz w:val="20"/>
-                <w:szCs w:val="20"/>
-              </w:rPr>
-            </w:pPr>
-            <w:r>
-              <w:rPr>
-                <w:rFonts w:ascii="Arial" w:hAnsi="Arial" w:cs="Arial"/>
-                <w:color w:val="C00000"/>
-                <w:sz w:val="20"/>
-                <w:szCs w:val="20"/>
-              </w:rPr>
-              <w:t>The page will redirect to the login page and inform me that I need to log in to make a reservation</w:t>
-            </w:r>
-          </w:p>
-        </w:tc>
-        <w:tc>
-          <w:tcPr>
-            <w:tcW w:w="2067" w:type="dxa"/>
-          </w:tcPr>
-          <w:p>
-            <w:pPr>
-              <w:spacing w:before="80" w:after="80"/>
-              <w:rPr>
-                <w:rFonts w:ascii="Arial" w:hAnsi="Arial" w:cs="Arial"/>
-                <w:color w:val="C00000"/>
-                <w:sz w:val="20"/>
-                <w:szCs w:val="20"/>
-              </w:rPr>
-            </w:pPr>
-            <w:r>
-              <w:rPr>
-                <w:rFonts w:ascii="Arial" w:hAnsi="Arial" w:cs="Arial"/>
-                <w:color w:val="C00000"/>
-                <w:sz w:val="20"/>
-                <w:szCs w:val="20"/>
-              </w:rPr>
-              <w:t>Pass</w:t>
-            </w:r>
-          </w:p>
-        </w:tc>
-        <w:tc>
-          <w:tcPr>
-            <w:tcW w:w="1966" w:type="dxa"/>
-          </w:tcPr>
-          <w:p>
-            <w:pPr>
-              <w:spacing w:before="80" w:after="80"/>
-              <w:rPr>
-                <w:rFonts w:ascii="Arial" w:hAnsi="Arial" w:cs="Arial"/>
-                <w:color w:val="C00000"/>
-                <w:sz w:val="20"/>
-                <w:szCs w:val="20"/>
-              </w:rPr>
-            </w:pPr>
-            <w:r>
-              <w:rPr>
-                <w:rFonts w:ascii="Arial" w:hAnsi="Arial" w:cs="Arial"/>
-                <w:color w:val="C00000"/>
-                <w:sz w:val="20"/>
-                <w:szCs w:val="20"/>
-              </w:rPr>
-              <w:t>No</w:t>
-            </w:r>
-          </w:p>
-          <w:p>
-            <w:pPr>
-              <w:spacing w:before="80" w:after="80"/>
-              <w:rPr>
-                <w:rFonts w:ascii="Arial" w:hAnsi="Arial" w:cs="Arial"/>
-                <w:color w:val="C00000"/>
-                <w:sz w:val="20"/>
-                <w:szCs w:val="20"/>
-              </w:rPr>
-            </w:pPr>
-            <w:r>
-              <w:rPr>
-                <w:rFonts w:ascii="Arial" w:hAnsi="Arial" w:cs="Arial"/>
-                <w:color w:val="C00000"/>
-                <w:sz w:val="20"/>
-                <w:szCs w:val="20"/>
-              </w:rPr>
               <w:drawing>
-                <wp:inline distT="0" distB="0" distL="0" distR="0" wp14:anchorId="6D5FF933" wp14:editId="15E803A1">
-                  <wp:extent cx="2806700" cy="980851"/>
-                  <wp:effectExtent l="0" t="0" r="0" b="0"/>
-                  <wp:docPr id="1881302972" name="Picture 1"/>
+                <wp:inline distT="0" distB="0" distL="0" distR="0" wp14:anchorId="293E2016" wp14:editId="4F61B0BC">
+                  <wp:extent cx="1976816" cy="1562100"/>
+                  <wp:effectExtent l="0" t="0" r="4445" b="0"/>
+                  <wp:docPr id="1005654771" name="Picture 1"/>
                   <wp:cNvGraphicFramePr>
                     <a:graphicFrameLocks xmlns:a="http://schemas.openxmlformats.org/drawingml/2006/main" noChangeAspect="1"/>
                   </wp:cNvGraphicFramePr>
@@ -3482,7 +3668,7 @@
                     <a:graphicData uri="http://schemas.openxmlformats.org/drawingml/2006/picture">
                       <pic:pic xmlns:pic="http://schemas.openxmlformats.org/drawingml/2006/picture">
                         <pic:nvPicPr>
-                          <pic:cNvPr id="1240259731" name=""/>
+                          <pic:cNvPr id="79938956" name=""/>
                           <pic:cNvPicPr/>
                         </pic:nvPicPr>
                         <pic:blipFill>
@@ -3494,7 +3680,7 @@
                         <pic:spPr>
                           <a:xfrm>
                             <a:off x="0" y="0"/>
-                            <a:ext cx="2812208" cy="982776"/>
+                            <a:ext cx="1980955" cy="1565371"/>
                           </a:xfrm>
                           <a:prstGeom prst="rect">
                             <a:avLst/>
@@ -3532,6 +3718,7 @@
                 <w:sz w:val="20"/>
                 <w:szCs w:val="20"/>
               </w:rPr>
+              <w:lastRenderedPageBreak/>
               <w:t>3</w:t>
             </w:r>
           </w:p>
@@ -3632,134 +3819,6 @@
                 <w:sz w:val="20"/>
                 <w:szCs w:val="20"/>
               </w:rPr>
-              <w:t>No</w:t>
-            </w:r>
-          </w:p>
-        </w:tc>
-      </w:tr>
-      <w:tr>
-        <w:trPr>
-          <w:trHeight w:val="350"/>
-        </w:trPr>
-        <w:tc>
-          <w:tcPr>
-            <w:tcW w:w="1250" w:type="dxa"/>
-          </w:tcPr>
-          <w:p>
-            <w:pPr>
-              <w:spacing w:before="80" w:after="80"/>
-              <w:rPr>
-                <w:rFonts w:ascii="Arial" w:hAnsi="Arial" w:cs="Arial"/>
-                <w:sz w:val="20"/>
-                <w:szCs w:val="20"/>
-              </w:rPr>
-            </w:pPr>
-            <w:r>
-              <w:rPr>
-                <w:rFonts w:ascii="Arial" w:hAnsi="Arial" w:cs="Arial"/>
-                <w:sz w:val="20"/>
-                <w:szCs w:val="20"/>
-              </w:rPr>
-              <w:t>4</w:t>
-            </w:r>
-          </w:p>
-        </w:tc>
-        <w:tc>
-          <w:tcPr>
-            <w:tcW w:w="3941" w:type="dxa"/>
-          </w:tcPr>
-          <w:p>
-            <w:pPr>
-              <w:spacing w:before="80" w:after="80"/>
-              <w:rPr>
-                <w:rFonts w:ascii="Arial" w:hAnsi="Arial" w:cs="Arial"/>
-                <w:color w:val="C00000"/>
-                <w:sz w:val="20"/>
-                <w:szCs w:val="20"/>
-              </w:rPr>
-            </w:pPr>
-            <w:r>
-              <w:rPr>
-                <w:rFonts w:ascii="Arial" w:hAnsi="Arial" w:cs="Arial"/>
-                <w:color w:val="C00000"/>
-                <w:sz w:val="20"/>
-                <w:szCs w:val="20"/>
-              </w:rPr>
-              <w:t>Make a reservation, adding multiple attractions</w:t>
-            </w:r>
-          </w:p>
-        </w:tc>
-        <w:tc>
-          <w:tcPr>
-            <w:tcW w:w="3726" w:type="dxa"/>
-          </w:tcPr>
-          <w:p>
-            <w:pPr>
-              <w:spacing w:before="80" w:after="80"/>
-              <w:rPr>
-                <w:rFonts w:ascii="Arial" w:hAnsi="Arial" w:cs="Arial"/>
-                <w:color w:val="C00000"/>
-                <w:sz w:val="20"/>
-                <w:szCs w:val="20"/>
-              </w:rPr>
-            </w:pPr>
-            <w:r>
-              <w:rPr>
-                <w:rFonts w:ascii="Arial" w:hAnsi="Arial" w:cs="Arial"/>
-                <w:color w:val="C00000"/>
-                <w:sz w:val="20"/>
-                <w:szCs w:val="20"/>
-              </w:rPr>
-              <w:t>User will be shown what attractions were selected in addition to their room booking</w:t>
-            </w:r>
-          </w:p>
-        </w:tc>
-        <w:tc>
-          <w:tcPr>
-            <w:tcW w:w="2067" w:type="dxa"/>
-          </w:tcPr>
-          <w:p>
-            <w:pPr>
-              <w:spacing w:before="80" w:after="80"/>
-              <w:rPr>
-                <w:rFonts w:ascii="Arial" w:hAnsi="Arial" w:cs="Arial"/>
-                <w:color w:val="C00000"/>
-                <w:sz w:val="20"/>
-                <w:szCs w:val="20"/>
-              </w:rPr>
-            </w:pPr>
-            <w:r>
-              <w:rPr>
-                <w:rFonts w:ascii="Arial" w:hAnsi="Arial" w:cs="Arial"/>
-                <w:color w:val="C00000"/>
-                <w:sz w:val="20"/>
-                <w:szCs w:val="20"/>
-              </w:rPr>
-              <w:t>Pass</w:t>
-            </w:r>
-          </w:p>
-        </w:tc>
-        <w:tc>
-          <w:tcPr>
-            <w:tcW w:w="1966" w:type="dxa"/>
-          </w:tcPr>
-          <w:p>
-            <w:pPr>
-              <w:spacing w:before="80" w:after="80"/>
-              <w:rPr>
-                <w:rFonts w:ascii="Arial" w:hAnsi="Arial" w:cs="Arial"/>
-                <w:color w:val="C00000"/>
-                <w:sz w:val="20"/>
-                <w:szCs w:val="20"/>
-              </w:rPr>
-            </w:pPr>
-            <w:r>
-              <w:rPr>
-                <w:rFonts w:ascii="Arial" w:hAnsi="Arial" w:cs="Arial"/>
-                <w:color w:val="C00000"/>
-                <w:sz w:val="20"/>
-                <w:szCs w:val="20"/>
-              </w:rPr>
               <w:t>Yes</w:t>
             </w:r>
           </w:p>
@@ -3781,10 +3840,10 @@
                 <w:szCs w:val="20"/>
               </w:rPr>
               <w:drawing>
-                <wp:inline distT="0" distB="0" distL="0" distR="0" wp14:anchorId="51E067C6" wp14:editId="37AD57C3">
-                  <wp:extent cx="2341229" cy="1092200"/>
-                  <wp:effectExtent l="0" t="0" r="2540" b="0"/>
-                  <wp:docPr id="800391624" name="Picture 1"/>
+                <wp:inline distT="0" distB="0" distL="0" distR="0" wp14:anchorId="25D092CB" wp14:editId="4D9C3C67">
+                  <wp:extent cx="2184400" cy="1805420"/>
+                  <wp:effectExtent l="0" t="0" r="6350" b="4445"/>
+                  <wp:docPr id="367456036" name="Picture 1"/>
                   <wp:cNvGraphicFramePr>
                     <a:graphicFrameLocks xmlns:a="http://schemas.openxmlformats.org/drawingml/2006/main" noChangeAspect="1"/>
                   </wp:cNvGraphicFramePr>
@@ -3792,11 +3851,11 @@
                     <a:graphicData uri="http://schemas.openxmlformats.org/drawingml/2006/picture">
                       <pic:pic xmlns:pic="http://schemas.openxmlformats.org/drawingml/2006/picture">
                         <pic:nvPicPr>
-                          <pic:cNvPr id="800391624" name=""/>
+                          <pic:cNvPr id="767645164" name=""/>
                           <pic:cNvPicPr/>
                         </pic:nvPicPr>
                         <pic:blipFill>
-                          <a:blip r:embed="rId11"/>
+                          <a:blip r:embed="rId10"/>
                           <a:stretch>
                             <a:fillRect/>
                           </a:stretch>
@@ -3804,7 +3863,7 @@
                         <pic:spPr>
                           <a:xfrm>
                             <a:off x="0" y="0"/>
-                            <a:ext cx="2344806" cy="1093869"/>
+                            <a:ext cx="2187529" cy="1808006"/>
                           </a:xfrm>
                           <a:prstGeom prst="rect">
                             <a:avLst/>
@@ -3842,7 +3901,7 @@
                 <w:sz w:val="20"/>
                 <w:szCs w:val="20"/>
               </w:rPr>
-              <w:t>5</w:t>
+              <w:t>4</w:t>
             </w:r>
           </w:p>
         </w:tc>
@@ -3867,7 +3926,7 @@
                 <w:sz w:val="20"/>
                 <w:szCs w:val="20"/>
               </w:rPr>
-              <w:t>Log out of the registered user</w:t>
+              <w:t>Make a reservation, adding multiple attractions</w:t>
             </w:r>
           </w:p>
         </w:tc>
@@ -3892,7 +3951,7 @@
                 <w:sz w:val="20"/>
                 <w:szCs w:val="20"/>
               </w:rPr>
-              <w:t>Will be redirected back to the landing page</w:t>
+              <w:t>User will be shown what attractions were selected in addition to their room booking</w:t>
             </w:r>
           </w:p>
         </w:tc>
@@ -3942,7 +4001,61 @@
                 <w:sz w:val="20"/>
                 <w:szCs w:val="20"/>
               </w:rPr>
-              <w:t>No</w:t>
+              <w:t>Yes</w:t>
+            </w:r>
+          </w:p>
+          <w:p>
+            <w:pPr>
+              <w:spacing w:before="80" w:after="80"/>
+              <w:rPr>
+                <w:rFonts w:ascii="Arial" w:hAnsi="Arial" w:cs="Arial"/>
+                <w:color w:val="C00000"/>
+                <w:sz w:val="20"/>
+                <w:szCs w:val="20"/>
+              </w:rPr>
+            </w:pPr>
+            <w:r>
+              <w:rPr>
+                <w:rFonts w:ascii="Arial" w:hAnsi="Arial" w:cs="Arial"/>
+                <w:color w:val="C00000"/>
+                <w:sz w:val="20"/>
+                <w:szCs w:val="20"/>
+              </w:rPr>
+              <w:drawing>
+                <wp:inline distT="0" distB="0" distL="0" distR="0" wp14:anchorId="0F96C95A" wp14:editId="7A1AA0D1">
+                  <wp:extent cx="2222500" cy="1490382"/>
+                  <wp:effectExtent l="0" t="0" r="6350" b="0"/>
+                  <wp:docPr id="716750384" name="Picture 1"/>
+                  <wp:cNvGraphicFramePr>
+                    <a:graphicFrameLocks xmlns:a="http://schemas.openxmlformats.org/drawingml/2006/main" noChangeAspect="1"/>
+                  </wp:cNvGraphicFramePr>
+                  <a:graphic xmlns:a="http://schemas.openxmlformats.org/drawingml/2006/main">
+                    <a:graphicData uri="http://schemas.openxmlformats.org/drawingml/2006/picture">
+                      <pic:pic xmlns:pic="http://schemas.openxmlformats.org/drawingml/2006/picture">
+                        <pic:nvPicPr>
+                          <pic:cNvPr id="716750384" name=""/>
+                          <pic:cNvPicPr/>
+                        </pic:nvPicPr>
+                        <pic:blipFill>
+                          <a:blip r:embed="rId13"/>
+                          <a:stretch>
+                            <a:fillRect/>
+                          </a:stretch>
+                        </pic:blipFill>
+                        <pic:spPr>
+                          <a:xfrm>
+                            <a:off x="0" y="0"/>
+                            <a:ext cx="2226607" cy="1493136"/>
+                          </a:xfrm>
+                          <a:prstGeom prst="rect">
+                            <a:avLst/>
+                          </a:prstGeom>
+                        </pic:spPr>
+                      </pic:pic>
+                    </a:graphicData>
+                  </a:graphic>
+                </wp:inline>
+              </w:drawing>
             </w:r>
           </w:p>
         </w:tc>
@@ -3960,6 +4073,200 @@
               <w:spacing w:before="80" w:after="80"/>
               <w:rPr>
                 <w:rFonts w:ascii="Arial" w:hAnsi="Arial" w:cs="Arial"/>
+                <w:sz w:val="20"/>
+                <w:szCs w:val="20"/>
+              </w:rPr>
+            </w:pPr>
+            <w:r>
+              <w:rPr>
+                <w:rFonts w:ascii="Arial" w:hAnsi="Arial" w:cs="Arial"/>
+                <w:sz w:val="20"/>
+                <w:szCs w:val="20"/>
+              </w:rPr>
+              <w:t>5</w:t>
+            </w:r>
+          </w:p>
+        </w:tc>
+        <w:tc>
+          <w:tcPr>
+            <w:tcW w:w="3941" w:type="dxa"/>
+          </w:tcPr>
+          <w:p>
+            <w:pPr>
+              <w:spacing w:before="80" w:after="80"/>
+              <w:rPr>
+                <w:rFonts w:ascii="Arial" w:hAnsi="Arial" w:cs="Arial"/>
+                <w:color w:val="C00000"/>
+                <w:sz w:val="20"/>
+                <w:szCs w:val="20"/>
+              </w:rPr>
+            </w:pPr>
+            <w:r>
+              <w:rPr>
+                <w:rFonts w:ascii="Arial" w:hAnsi="Arial" w:cs="Arial"/>
+                <w:color w:val="C00000"/>
+                <w:sz w:val="20"/>
+                <w:szCs w:val="20"/>
+              </w:rPr>
+              <w:t>Log out of the registered user</w:t>
+            </w:r>
+          </w:p>
+        </w:tc>
+        <w:tc>
+          <w:tcPr>
+            <w:tcW w:w="3726" w:type="dxa"/>
+          </w:tcPr>
+          <w:p>
+            <w:pPr>
+              <w:spacing w:before="80" w:after="80"/>
+              <w:rPr>
+                <w:rFonts w:ascii="Arial" w:hAnsi="Arial" w:cs="Arial"/>
+                <w:color w:val="C00000"/>
+                <w:sz w:val="20"/>
+                <w:szCs w:val="20"/>
+              </w:rPr>
+            </w:pPr>
+            <w:r>
+              <w:rPr>
+                <w:rFonts w:ascii="Arial" w:hAnsi="Arial" w:cs="Arial"/>
+                <w:color w:val="C00000"/>
+                <w:sz w:val="20"/>
+                <w:szCs w:val="20"/>
+              </w:rPr>
+              <w:t xml:space="preserve">Will be redirected back </w:t>
+            </w:r>
+            <w:r>
+              <w:rPr>
+                <w:rFonts w:ascii="Arial" w:hAnsi="Arial" w:cs="Arial"/>
+                <w:color w:val="C00000"/>
+                <w:sz w:val="20"/>
+                <w:szCs w:val="20"/>
+              </w:rPr>
+              <w:lastRenderedPageBreak/>
+              <w:t>to the landing page</w:t>
+            </w:r>
+          </w:p>
+        </w:tc>
+        <w:tc>
+          <w:tcPr>
+            <w:tcW w:w="2067" w:type="dxa"/>
+          </w:tcPr>
+          <w:p>
+            <w:pPr>
+              <w:spacing w:before="80" w:after="80"/>
+              <w:rPr>
+                <w:rFonts w:ascii="Arial" w:hAnsi="Arial" w:cs="Arial"/>
+                <w:color w:val="C00000"/>
+                <w:sz w:val="20"/>
+                <w:szCs w:val="20"/>
+              </w:rPr>
+            </w:pPr>
+            <w:r>
+              <w:rPr>
+                <w:rFonts w:ascii="Arial" w:hAnsi="Arial" w:cs="Arial"/>
+                <w:color w:val="C00000"/>
+                <w:sz w:val="20"/>
+                <w:szCs w:val="20"/>
+              </w:rPr>
+              <w:lastRenderedPageBreak/>
+              <w:t>Pass</w:t>
+            </w:r>
+          </w:p>
+        </w:tc>
+        <w:tc>
+          <w:tcPr>
+            <w:tcW w:w="1966" w:type="dxa"/>
+          </w:tcPr>
+          <w:p>
+            <w:pPr>
+              <w:spacing w:before="80" w:after="80"/>
+              <w:rPr>
+                <w:rFonts w:ascii="Arial" w:hAnsi="Arial" w:cs="Arial"/>
+                <w:color w:val="C00000"/>
+                <w:sz w:val="20"/>
+                <w:szCs w:val="20"/>
+              </w:rPr>
+            </w:pPr>
+            <w:r>
+              <w:rPr>
+                <w:rFonts w:ascii="Arial" w:hAnsi="Arial" w:cs="Arial"/>
+                <w:color w:val="C00000"/>
+                <w:sz w:val="20"/>
+                <w:szCs w:val="20"/>
+              </w:rPr>
+              <w:t>Yes</w:t>
+            </w:r>
+          </w:p>
+          <w:p>
+            <w:pPr>
+              <w:spacing w:before="80" w:after="80"/>
+              <w:rPr>
+                <w:rFonts w:ascii="Arial" w:hAnsi="Arial" w:cs="Arial"/>
+                <w:color w:val="C00000"/>
+                <w:sz w:val="20"/>
+                <w:szCs w:val="20"/>
+              </w:rPr>
+            </w:pPr>
+            <w:r>
+              <w:rPr>
+                <w:rFonts w:ascii="Arial" w:hAnsi="Arial" w:cs="Arial"/>
+                <w:color w:val="C00000"/>
+                <w:sz w:val="20"/>
+                <w:szCs w:val="20"/>
+              </w:rPr>
+              <w:lastRenderedPageBreak/>
+              <w:drawing>
+                <wp:inline distT="0" distB="0" distL="0" distR="0" wp14:anchorId="54113830" wp14:editId="33A563F4">
+                  <wp:extent cx="2819400" cy="615557"/>
+                  <wp:effectExtent l="0" t="0" r="0" b="0"/>
+                  <wp:docPr id="2034357967" name="Picture 1"/>
+                  <wp:cNvGraphicFramePr>
+                    <a:graphicFrameLocks xmlns:a="http://schemas.openxmlformats.org/drawingml/2006/main" noChangeAspect="1"/>
+                  </wp:cNvGraphicFramePr>
+                  <a:graphic xmlns:a="http://schemas.openxmlformats.org/drawingml/2006/main">
+                    <a:graphicData uri="http://schemas.openxmlformats.org/drawingml/2006/picture">
+                      <pic:pic xmlns:pic="http://schemas.openxmlformats.org/drawingml/2006/picture">
+                        <pic:nvPicPr>
+                          <pic:cNvPr id="535569739" name=""/>
+                          <pic:cNvPicPr/>
+                        </pic:nvPicPr>
+                        <pic:blipFill>
+                          <a:blip r:embed="rId12"/>
+                          <a:stretch>
+                            <a:fillRect/>
+                          </a:stretch>
+                        </pic:blipFill>
+                        <pic:spPr>
+                          <a:xfrm>
+                            <a:off x="0" y="0"/>
+                            <a:ext cx="2829325" cy="617724"/>
+                          </a:xfrm>
+                          <a:prstGeom prst="rect">
+                            <a:avLst/>
+                          </a:prstGeom>
+                        </pic:spPr>
+                      </pic:pic>
+                    </a:graphicData>
+                  </a:graphic>
+                </wp:inline>
+              </w:drawing>
+            </w:r>
+          </w:p>
+        </w:tc>
+      </w:tr>
+      <w:tr>
+        <w:trPr>
+          <w:trHeight w:val="350"/>
+        </w:trPr>
+        <w:tc>
+          <w:tcPr>
+            <w:tcW w:w="1250" w:type="dxa"/>
+          </w:tcPr>
+          <w:p>
+            <w:pPr>
+              <w:spacing w:before="80" w:after="80"/>
+              <w:rPr>
+                <w:rFonts w:ascii="Arial" w:hAnsi="Arial" w:cs="Arial"/>
                 <w:b/>
                 <w:bCs/>
                 <w:sz w:val="20"/>
@@ -3994,15 +4301,6 @@
                 <w:szCs w:val="20"/>
               </w:rPr>
             </w:pPr>
-            <w:r>
-              <w:rPr>
-                <w:rFonts w:ascii="Arial" w:hAnsi="Arial" w:cs="Arial"/>
-                <w:color w:val="C00000"/>
-                <w:sz w:val="20"/>
-                <w:szCs w:val="20"/>
-              </w:rPr>
-              <w:t>No confirmation on submission or errors, no check out date selection</w:t>
-            </w:r>
           </w:p>
         </w:tc>
       </w:tr>
@@ -4026,9 +4324,9 @@
       <w:tblGrid>
         <w:gridCol w:w="1250"/>
         <w:gridCol w:w="3941"/>
-        <w:gridCol w:w="1757"/>
-        <w:gridCol w:w="1366"/>
-        <w:gridCol w:w="4636"/>
+        <w:gridCol w:w="1742"/>
+        <w:gridCol w:w="1361"/>
+        <w:gridCol w:w="4656"/>
       </w:tblGrid>
       <w:tr>
         <w:trPr>
@@ -4498,7 +4796,27 @@
                 <w:sz w:val="20"/>
                 <w:szCs w:val="20"/>
               </w:rPr>
-              <w:t>Navigate to MoffayBayLodge landing page(</w:t>
+              <w:t xml:space="preserve">Navigate to </w:t>
+            </w:r>
+            <w:proofErr w:type="spellStart"/>
+            <w:r>
+              <w:rPr>
+                <w:rFonts w:ascii="Arial" w:hAnsi="Arial" w:cs="Arial"/>
+                <w:color w:val="C00000"/>
+                <w:sz w:val="20"/>
+                <w:szCs w:val="20"/>
+              </w:rPr>
+              <w:t>MoffayBayLodge</w:t>
+            </w:r>
+            <w:proofErr w:type="spellEnd"/>
+            <w:r>
+              <w:rPr>
+                <w:rFonts w:ascii="Arial" w:hAnsi="Arial" w:cs="Arial"/>
+                <w:color w:val="C00000"/>
+                <w:sz w:val="20"/>
+                <w:szCs w:val="20"/>
+              </w:rPr>
+              <w:t xml:space="preserve"> landing page(</w:t>
             </w:r>
             <w:r>
               <w:rPr>
@@ -4607,6 +4925,7 @@
             <w:r>
               <w:rPr>
                 <w:rFonts w:ascii="Arial" w:hAnsi="Arial" w:cs="Arial"/>
+                <w:noProof/>
                 <w:color w:val="C00000"/>
                 <w:sz w:val="20"/>
                 <w:szCs w:val="20"/>
@@ -4773,31 +5092,32 @@
                 <w:sz w:val="20"/>
                 <w:szCs w:val="20"/>
               </w:rPr>
-              <w:t>No</w:t>
-            </w:r>
-          </w:p>
-          <w:p>
-            <w:pPr>
-              <w:spacing w:before="80" w:after="80"/>
-              <w:rPr>
-                <w:rFonts w:ascii="Arial" w:hAnsi="Arial" w:cs="Arial"/>
-                <w:color w:val="C00000"/>
-                <w:sz w:val="20"/>
-                <w:szCs w:val="20"/>
-              </w:rPr>
-            </w:pPr>
-            <w:r>
-              <w:rPr>
-                <w:rFonts w:ascii="Arial" w:hAnsi="Arial" w:cs="Arial"/>
-                <w:color w:val="C00000"/>
-                <w:sz w:val="20"/>
-                <w:szCs w:val="20"/>
-              </w:rPr>
+              <w:t>Yes</w:t>
+            </w:r>
+          </w:p>
+          <w:p>
+            <w:pPr>
+              <w:spacing w:before="80" w:after="80"/>
+              <w:rPr>
+                <w:rFonts w:ascii="Arial" w:hAnsi="Arial" w:cs="Arial"/>
+                <w:color w:val="C00000"/>
+                <w:sz w:val="20"/>
+                <w:szCs w:val="20"/>
+              </w:rPr>
+            </w:pPr>
+            <w:r>
+              <w:rPr>
+                <w:rFonts w:ascii="Arial" w:hAnsi="Arial" w:cs="Arial"/>
+                <w:color w:val="C00000"/>
+                <w:sz w:val="20"/>
+                <w:szCs w:val="20"/>
+              </w:rPr>
+              <w:lastRenderedPageBreak/>
               <w:drawing>
-                <wp:inline distT="0" distB="0" distL="0" distR="0" wp14:anchorId="02070304" wp14:editId="620B7396">
-                  <wp:extent cx="2806700" cy="980851"/>
-                  <wp:effectExtent l="0" t="0" r="0" b="0"/>
-                  <wp:docPr id="1416557870" name="Picture 1"/>
+                <wp:inline distT="0" distB="0" distL="0" distR="0" wp14:anchorId="0FF219BF" wp14:editId="55D26D2E">
+                  <wp:extent cx="1976816" cy="1562100"/>
+                  <wp:effectExtent l="0" t="0" r="4445" b="0"/>
+                  <wp:docPr id="1877305773" name="Picture 1"/>
                   <wp:cNvGraphicFramePr>
                     <a:graphicFrameLocks xmlns:a="http://schemas.openxmlformats.org/drawingml/2006/main" noChangeAspect="1"/>
                   </wp:cNvGraphicFramePr>
@@ -4805,7 +5125,7 @@
                     <a:graphicData uri="http://schemas.openxmlformats.org/drawingml/2006/picture">
                       <pic:pic xmlns:pic="http://schemas.openxmlformats.org/drawingml/2006/picture">
                         <pic:nvPicPr>
-                          <pic:cNvPr id="1240259731" name=""/>
+                          <pic:cNvPr id="79938956" name=""/>
                           <pic:cNvPicPr/>
                         </pic:nvPicPr>
                         <pic:blipFill>
@@ -4817,7 +5137,7 @@
                         <pic:spPr>
                           <a:xfrm>
                             <a:off x="0" y="0"/>
-                            <a:ext cx="2812208" cy="982776"/>
+                            <a:ext cx="1980955" cy="1565371"/>
                           </a:xfrm>
                           <a:prstGeom prst="rect">
                             <a:avLst/>
@@ -4855,6 +5175,7 @@
                 <w:sz w:val="20"/>
                 <w:szCs w:val="20"/>
               </w:rPr>
+              <w:lastRenderedPageBreak/>
               <w:t>3</w:t>
             </w:r>
           </w:p>
@@ -4905,17 +5226,7 @@
                 <w:sz w:val="20"/>
                 <w:szCs w:val="20"/>
               </w:rPr>
-              <w:t xml:space="preserve">I will be redirected back to the reservation page to be able to </w:t>
-            </w:r>
-            <w:r>
-              <w:rPr>
-                <w:rFonts w:ascii="Arial" w:hAnsi="Arial" w:cs="Arial"/>
-                <w:color w:val="C00000"/>
-                <w:sz w:val="20"/>
-                <w:szCs w:val="20"/>
-              </w:rPr>
-              <w:lastRenderedPageBreak/>
-              <w:t>make a reservation</w:t>
+              <w:t>I will be redirected back to the reservation page to be able to make a reservation</w:t>
             </w:r>
           </w:p>
         </w:tc>
@@ -4940,7 +5251,6 @@
                 <w:sz w:val="20"/>
                 <w:szCs w:val="20"/>
               </w:rPr>
-              <w:lastRenderedPageBreak/>
               <w:t>Pass</w:t>
             </w:r>
           </w:p>
@@ -4966,135 +5276,7 @@
                 <w:sz w:val="20"/>
                 <w:szCs w:val="20"/>
               </w:rPr>
-              <w:t>No</w:t>
-            </w:r>
-          </w:p>
-        </w:tc>
-      </w:tr>
-      <w:tr>
-        <w:trPr>
-          <w:trHeight w:val="350"/>
-        </w:trPr>
-        <w:tc>
-          <w:tcPr>
-            <w:tcW w:w="1251" w:type="dxa"/>
-          </w:tcPr>
-          <w:p>
-            <w:pPr>
-              <w:spacing w:before="80" w:after="80"/>
-              <w:rPr>
-                <w:rFonts w:ascii="Arial" w:hAnsi="Arial" w:cs="Arial"/>
-                <w:sz w:val="20"/>
-                <w:szCs w:val="20"/>
-              </w:rPr>
-            </w:pPr>
-            <w:r>
-              <w:rPr>
-                <w:rFonts w:ascii="Arial" w:hAnsi="Arial" w:cs="Arial"/>
-                <w:sz w:val="20"/>
-                <w:szCs w:val="20"/>
-              </w:rPr>
-              <w:t>4</w:t>
-            </w:r>
-          </w:p>
-        </w:tc>
-        <w:tc>
-          <w:tcPr>
-            <w:tcW w:w="3941" w:type="dxa"/>
-          </w:tcPr>
-          <w:p>
-            <w:pPr>
-              <w:spacing w:before="80" w:after="80"/>
-              <w:rPr>
-                <w:rFonts w:ascii="Arial" w:hAnsi="Arial" w:cs="Arial"/>
-                <w:color w:val="C00000"/>
-                <w:sz w:val="20"/>
-                <w:szCs w:val="20"/>
-              </w:rPr>
-            </w:pPr>
-            <w:r>
-              <w:rPr>
-                <w:rFonts w:ascii="Arial" w:hAnsi="Arial" w:cs="Arial"/>
-                <w:color w:val="C00000"/>
-                <w:sz w:val="20"/>
-                <w:szCs w:val="20"/>
-              </w:rPr>
-              <w:t xml:space="preserve">Attempt to book 3 guests into a 2-person maximum room </w:t>
-            </w:r>
-          </w:p>
-        </w:tc>
-        <w:tc>
-          <w:tcPr>
-            <w:tcW w:w="3716" w:type="dxa"/>
-          </w:tcPr>
-          <w:p>
-            <w:pPr>
-              <w:spacing w:before="80" w:after="80"/>
-              <w:rPr>
-                <w:rFonts w:ascii="Arial" w:hAnsi="Arial" w:cs="Arial"/>
-                <w:color w:val="C00000"/>
-                <w:sz w:val="20"/>
-                <w:szCs w:val="20"/>
-              </w:rPr>
-            </w:pPr>
-            <w:r>
-              <w:rPr>
-                <w:rFonts w:ascii="Arial" w:hAnsi="Arial" w:cs="Arial"/>
-                <w:color w:val="C00000"/>
-                <w:sz w:val="20"/>
-                <w:szCs w:val="20"/>
-              </w:rPr>
-              <w:t>The error message displays that the selected room has a maximum of 2 guests</w:t>
-            </w:r>
-          </w:p>
-        </w:tc>
-        <w:tc>
-          <w:tcPr>
-            <w:tcW w:w="2071" w:type="dxa"/>
-          </w:tcPr>
-          <w:p>
-            <w:pPr>
-              <w:spacing w:before="80" w:after="80"/>
-              <w:rPr>
-                <w:rFonts w:ascii="Arial" w:hAnsi="Arial" w:cs="Arial"/>
-                <w:color w:val="C00000"/>
-                <w:sz w:val="20"/>
-                <w:szCs w:val="20"/>
-              </w:rPr>
-            </w:pPr>
-            <w:r>
-              <w:rPr>
-                <w:rFonts w:ascii="Arial" w:hAnsi="Arial" w:cs="Arial"/>
-                <w:color w:val="C00000"/>
-                <w:sz w:val="20"/>
-                <w:szCs w:val="20"/>
-              </w:rPr>
-              <w:t>Pass</w:t>
-            </w:r>
-          </w:p>
-        </w:tc>
-        <w:tc>
-          <w:tcPr>
-            <w:tcW w:w="1971" w:type="dxa"/>
-          </w:tcPr>
-          <w:p>
-            <w:pPr>
-              <w:spacing w:before="80" w:after="80"/>
-              <w:rPr>
-                <w:rFonts w:ascii="Arial" w:hAnsi="Arial" w:cs="Arial"/>
-                <w:color w:val="C00000"/>
-                <w:sz w:val="20"/>
-                <w:szCs w:val="20"/>
-              </w:rPr>
-            </w:pPr>
-            <w:r>
-              <w:rPr>
-                <w:rFonts w:ascii="Arial" w:hAnsi="Arial" w:cs="Arial"/>
-                <w:color w:val="C00000"/>
-                <w:sz w:val="20"/>
-                <w:szCs w:val="20"/>
-              </w:rPr>
-              <w:t>No</w:t>
+              <w:t>Yes</w:t>
             </w:r>
           </w:p>
           <w:p>
@@ -5115,10 +5297,10 @@
                 <w:szCs w:val="20"/>
               </w:rPr>
               <w:drawing>
-                <wp:inline distT="0" distB="0" distL="0" distR="0" wp14:anchorId="51037873" wp14:editId="1B0A6562">
-                  <wp:extent cx="2406149" cy="1511300"/>
-                  <wp:effectExtent l="0" t="0" r="0" b="0"/>
-                  <wp:docPr id="1775436213" name="Picture 1"/>
+                <wp:inline distT="0" distB="0" distL="0" distR="0" wp14:anchorId="5E9D0D76" wp14:editId="4A1A4C32">
+                  <wp:extent cx="2184400" cy="1805420"/>
+                  <wp:effectExtent l="0" t="0" r="6350" b="4445"/>
+                  <wp:docPr id="1993689402" name="Picture 1"/>
                   <wp:cNvGraphicFramePr>
                     <a:graphicFrameLocks xmlns:a="http://schemas.openxmlformats.org/drawingml/2006/main" noChangeAspect="1"/>
                   </wp:cNvGraphicFramePr>
@@ -5126,7 +5308,371 @@
                     <a:graphicData uri="http://schemas.openxmlformats.org/drawingml/2006/picture">
                       <pic:pic xmlns:pic="http://schemas.openxmlformats.org/drawingml/2006/picture">
                         <pic:nvPicPr>
-                          <pic:cNvPr id="1775436213" name=""/>
+                          <pic:cNvPr id="767645164" name=""/>
+                          <pic:cNvPicPr/>
+                        </pic:nvPicPr>
+                        <pic:blipFill>
+                          <a:blip r:embed="rId10"/>
+                          <a:stretch>
+                            <a:fillRect/>
+                          </a:stretch>
+                        </pic:blipFill>
+                        <pic:spPr>
+                          <a:xfrm>
+                            <a:off x="0" y="0"/>
+                            <a:ext cx="2187529" cy="1808006"/>
+                          </a:xfrm>
+                          <a:prstGeom prst="rect">
+                            <a:avLst/>
+                          </a:prstGeom>
+                        </pic:spPr>
+                      </pic:pic>
+                    </a:graphicData>
+                  </a:graphic>
+                </wp:inline>
+              </w:drawing>
+            </w:r>
+          </w:p>
+        </w:tc>
+      </w:tr>
+      <w:tr>
+        <w:trPr>
+          <w:trHeight w:val="350"/>
+        </w:trPr>
+        <w:tc>
+          <w:tcPr>
+            <w:tcW w:w="1251" w:type="dxa"/>
+          </w:tcPr>
+          <w:p>
+            <w:pPr>
+              <w:spacing w:before="80" w:after="80"/>
+              <w:rPr>
+                <w:rFonts w:ascii="Arial" w:hAnsi="Arial" w:cs="Arial"/>
+                <w:sz w:val="20"/>
+                <w:szCs w:val="20"/>
+              </w:rPr>
+            </w:pPr>
+            <w:r>
+              <w:rPr>
+                <w:rFonts w:ascii="Arial" w:hAnsi="Arial" w:cs="Arial"/>
+                <w:sz w:val="20"/>
+                <w:szCs w:val="20"/>
+              </w:rPr>
+              <w:t>4</w:t>
+            </w:r>
+          </w:p>
+        </w:tc>
+        <w:tc>
+          <w:tcPr>
+            <w:tcW w:w="3941" w:type="dxa"/>
+          </w:tcPr>
+          <w:p>
+            <w:pPr>
+              <w:spacing w:before="80" w:after="80"/>
+              <w:rPr>
+                <w:rFonts w:ascii="Arial" w:hAnsi="Arial" w:cs="Arial"/>
+                <w:color w:val="C00000"/>
+                <w:sz w:val="20"/>
+                <w:szCs w:val="20"/>
+              </w:rPr>
+            </w:pPr>
+            <w:r>
+              <w:rPr>
+                <w:rFonts w:ascii="Arial" w:hAnsi="Arial" w:cs="Arial"/>
+                <w:color w:val="C00000"/>
+                <w:sz w:val="20"/>
+                <w:szCs w:val="20"/>
+              </w:rPr>
+              <w:t xml:space="preserve">Attempt to book 3 guests into a 2-person maximum room </w:t>
+            </w:r>
+          </w:p>
+        </w:tc>
+        <w:tc>
+          <w:tcPr>
+            <w:tcW w:w="3716" w:type="dxa"/>
+          </w:tcPr>
+          <w:p>
+            <w:pPr>
+              <w:spacing w:before="80" w:after="80"/>
+              <w:rPr>
+                <w:rFonts w:ascii="Arial" w:hAnsi="Arial" w:cs="Arial"/>
+                <w:color w:val="C00000"/>
+                <w:sz w:val="20"/>
+                <w:szCs w:val="20"/>
+              </w:rPr>
+            </w:pPr>
+            <w:r>
+              <w:rPr>
+                <w:rFonts w:ascii="Arial" w:hAnsi="Arial" w:cs="Arial"/>
+                <w:color w:val="C00000"/>
+                <w:sz w:val="20"/>
+                <w:szCs w:val="20"/>
+              </w:rPr>
+              <w:t>The error message displays that the selected room has a maximum of 2 guests</w:t>
+            </w:r>
+          </w:p>
+        </w:tc>
+        <w:tc>
+          <w:tcPr>
+            <w:tcW w:w="2071" w:type="dxa"/>
+          </w:tcPr>
+          <w:p>
+            <w:pPr>
+              <w:spacing w:before="80" w:after="80"/>
+              <w:rPr>
+                <w:rFonts w:ascii="Arial" w:hAnsi="Arial" w:cs="Arial"/>
+                <w:color w:val="C00000"/>
+                <w:sz w:val="20"/>
+                <w:szCs w:val="20"/>
+              </w:rPr>
+            </w:pPr>
+            <w:r>
+              <w:rPr>
+                <w:rFonts w:ascii="Arial" w:hAnsi="Arial" w:cs="Arial"/>
+                <w:color w:val="C00000"/>
+                <w:sz w:val="20"/>
+                <w:szCs w:val="20"/>
+              </w:rPr>
+              <w:t>Pass</w:t>
+            </w:r>
+          </w:p>
+        </w:tc>
+        <w:tc>
+          <w:tcPr>
+            <w:tcW w:w="1971" w:type="dxa"/>
+          </w:tcPr>
+          <w:p>
+            <w:pPr>
+              <w:spacing w:before="80" w:after="80"/>
+              <w:rPr>
+                <w:rFonts w:ascii="Arial" w:hAnsi="Arial" w:cs="Arial"/>
+                <w:color w:val="C00000"/>
+                <w:sz w:val="20"/>
+                <w:szCs w:val="20"/>
+              </w:rPr>
+            </w:pPr>
+            <w:r>
+              <w:rPr>
+                <w:rFonts w:ascii="Arial" w:hAnsi="Arial" w:cs="Arial"/>
+                <w:color w:val="C00000"/>
+                <w:sz w:val="20"/>
+                <w:szCs w:val="20"/>
+              </w:rPr>
+              <w:t>Yes</w:t>
+            </w:r>
+          </w:p>
+          <w:p>
+            <w:pPr>
+              <w:spacing w:before="80" w:after="80"/>
+              <w:rPr>
+                <w:rFonts w:ascii="Arial" w:hAnsi="Arial" w:cs="Arial"/>
+                <w:color w:val="C00000"/>
+                <w:sz w:val="20"/>
+                <w:szCs w:val="20"/>
+              </w:rPr>
+            </w:pPr>
+            <w:r>
+              <w:rPr>
+                <w:rFonts w:ascii="Arial" w:hAnsi="Arial" w:cs="Arial"/>
+                <w:color w:val="C00000"/>
+                <w:sz w:val="20"/>
+                <w:szCs w:val="20"/>
+              </w:rPr>
+              <w:drawing>
+                <wp:inline distT="0" distB="0" distL="0" distR="0" wp14:anchorId="22A22510" wp14:editId="5B4A1C33">
+                  <wp:extent cx="2665141" cy="914400"/>
+                  <wp:effectExtent l="0" t="0" r="1905" b="0"/>
+                  <wp:docPr id="2127920213" name="Picture 1"/>
+                  <wp:cNvGraphicFramePr>
+                    <a:graphicFrameLocks xmlns:a="http://schemas.openxmlformats.org/drawingml/2006/main" noChangeAspect="1"/>
+                  </wp:cNvGraphicFramePr>
+                  <a:graphic xmlns:a="http://schemas.openxmlformats.org/drawingml/2006/main">
+                    <a:graphicData uri="http://schemas.openxmlformats.org/drawingml/2006/picture">
+                      <pic:pic xmlns:pic="http://schemas.openxmlformats.org/drawingml/2006/picture">
+                        <pic:nvPicPr>
+                          <pic:cNvPr id="2127920213" name=""/>
+                          <pic:cNvPicPr/>
+                        </pic:nvPicPr>
+                        <pic:blipFill>
+                          <a:blip r:embed="rId14"/>
+                          <a:stretch>
+                            <a:fillRect/>
+                          </a:stretch>
+                        </pic:blipFill>
+                        <pic:spPr>
+                          <a:xfrm>
+                            <a:off x="0" y="0"/>
+                            <a:ext cx="2671363" cy="916535"/>
+                          </a:xfrm>
+                          <a:prstGeom prst="rect">
+                            <a:avLst/>
+                          </a:prstGeom>
+                        </pic:spPr>
+                      </pic:pic>
+                    </a:graphicData>
+                  </a:graphic>
+                </wp:inline>
+              </w:drawing>
+            </w:r>
+          </w:p>
+        </w:tc>
+      </w:tr>
+      <w:tr>
+        <w:trPr>
+          <w:trHeight w:val="350"/>
+        </w:trPr>
+        <w:tc>
+          <w:tcPr>
+            <w:tcW w:w="1251" w:type="dxa"/>
+          </w:tcPr>
+          <w:p>
+            <w:pPr>
+              <w:spacing w:before="80" w:after="80"/>
+              <w:rPr>
+                <w:rFonts w:ascii="Arial" w:hAnsi="Arial" w:cs="Arial"/>
+                <w:sz w:val="20"/>
+                <w:szCs w:val="20"/>
+              </w:rPr>
+            </w:pPr>
+            <w:r>
+              <w:rPr>
+                <w:rFonts w:ascii="Arial" w:hAnsi="Arial" w:cs="Arial"/>
+                <w:sz w:val="20"/>
+                <w:szCs w:val="20"/>
+              </w:rPr>
+              <w:t>5</w:t>
+            </w:r>
+          </w:p>
+        </w:tc>
+        <w:tc>
+          <w:tcPr>
+            <w:tcW w:w="3941" w:type="dxa"/>
+          </w:tcPr>
+          <w:p>
+            <w:pPr>
+              <w:spacing w:before="80" w:after="80"/>
+              <w:rPr>
+                <w:rFonts w:ascii="Arial" w:hAnsi="Arial" w:cs="Arial"/>
+                <w:color w:val="C00000"/>
+                <w:sz w:val="20"/>
+                <w:szCs w:val="20"/>
+              </w:rPr>
+            </w:pPr>
+            <w:r>
+              <w:rPr>
+                <w:rFonts w:ascii="Arial" w:hAnsi="Arial" w:cs="Arial"/>
+                <w:color w:val="C00000"/>
+                <w:sz w:val="20"/>
+                <w:szCs w:val="20"/>
+              </w:rPr>
+              <w:t>Log out of the registered user</w:t>
+            </w:r>
+          </w:p>
+        </w:tc>
+        <w:tc>
+          <w:tcPr>
+            <w:tcW w:w="3716" w:type="dxa"/>
+          </w:tcPr>
+          <w:p>
+            <w:pPr>
+              <w:spacing w:before="80" w:after="80"/>
+              <w:rPr>
+                <w:rFonts w:ascii="Arial" w:hAnsi="Arial" w:cs="Arial"/>
+                <w:color w:val="C00000"/>
+                <w:sz w:val="20"/>
+                <w:szCs w:val="20"/>
+              </w:rPr>
+            </w:pPr>
+            <w:r>
+              <w:rPr>
+                <w:rFonts w:ascii="Arial" w:hAnsi="Arial" w:cs="Arial"/>
+                <w:color w:val="C00000"/>
+                <w:sz w:val="20"/>
+                <w:szCs w:val="20"/>
+              </w:rPr>
+              <w:t>Will be redirected back to the landing page</w:t>
+            </w:r>
+          </w:p>
+        </w:tc>
+        <w:tc>
+          <w:tcPr>
+            <w:tcW w:w="2071" w:type="dxa"/>
+          </w:tcPr>
+          <w:p>
+            <w:pPr>
+              <w:spacing w:before="80" w:after="80"/>
+              <w:rPr>
+                <w:rFonts w:ascii="Arial" w:hAnsi="Arial" w:cs="Arial"/>
+                <w:color w:val="C00000"/>
+                <w:sz w:val="20"/>
+                <w:szCs w:val="20"/>
+              </w:rPr>
+            </w:pPr>
+            <w:r>
+              <w:rPr>
+                <w:rFonts w:ascii="Arial" w:hAnsi="Arial" w:cs="Arial"/>
+                <w:color w:val="C00000"/>
+                <w:sz w:val="20"/>
+                <w:szCs w:val="20"/>
+              </w:rPr>
+              <w:t>Pass</w:t>
+            </w:r>
+          </w:p>
+        </w:tc>
+        <w:tc>
+          <w:tcPr>
+            <w:tcW w:w="1971" w:type="dxa"/>
+          </w:tcPr>
+          <w:p>
+            <w:pPr>
+              <w:spacing w:before="80" w:after="80"/>
+              <w:rPr>
+                <w:rFonts w:ascii="Arial" w:hAnsi="Arial" w:cs="Arial"/>
+                <w:color w:val="C00000"/>
+                <w:sz w:val="20"/>
+                <w:szCs w:val="20"/>
+              </w:rPr>
+            </w:pPr>
+            <w:r>
+              <w:rPr>
+                <w:rFonts w:ascii="Arial" w:hAnsi="Arial" w:cs="Arial"/>
+                <w:color w:val="C00000"/>
+                <w:sz w:val="20"/>
+                <w:szCs w:val="20"/>
+              </w:rPr>
+              <w:t>Yes</w:t>
+            </w:r>
+          </w:p>
+          <w:p>
+            <w:pPr>
+              <w:spacing w:before="80" w:after="80"/>
+              <w:rPr>
+                <w:rFonts w:ascii="Arial" w:hAnsi="Arial" w:cs="Arial"/>
+                <w:color w:val="C00000"/>
+                <w:sz w:val="20"/>
+                <w:szCs w:val="20"/>
+              </w:rPr>
+            </w:pPr>
+            <w:r>
+              <w:rPr>
+                <w:rFonts w:ascii="Arial" w:hAnsi="Arial" w:cs="Arial"/>
+                <w:color w:val="C00000"/>
+                <w:sz w:val="20"/>
+                <w:szCs w:val="20"/>
+              </w:rPr>
+              <w:drawing>
+                <wp:inline distT="0" distB="0" distL="0" distR="0" wp14:anchorId="53A0FEE7" wp14:editId="779E6D56">
+                  <wp:extent cx="2819400" cy="615557"/>
+                  <wp:effectExtent l="0" t="0" r="0" b="0"/>
+                  <wp:docPr id="535569739" name="Picture 1"/>
+                  <wp:cNvGraphicFramePr>
+                    <a:graphicFrameLocks xmlns:a="http://schemas.openxmlformats.org/drawingml/2006/main" noChangeAspect="1"/>
+                  </wp:cNvGraphicFramePr>
+                  <a:graphic xmlns:a="http://schemas.openxmlformats.org/drawingml/2006/main">
+                    <a:graphicData uri="http://schemas.openxmlformats.org/drawingml/2006/picture">
+                      <pic:pic xmlns:pic="http://schemas.openxmlformats.org/drawingml/2006/picture">
+                        <pic:nvPicPr>
+                          <pic:cNvPr id="535569739" name=""/>
                           <pic:cNvPicPr/>
                         </pic:nvPicPr>
                         <pic:blipFill>
@@ -5138,7 +5684,7 @@
                         <pic:spPr>
                           <a:xfrm>
                             <a:off x="0" y="0"/>
-                            <a:ext cx="2410194" cy="1513841"/>
+                            <a:ext cx="2829325" cy="617724"/>
                           </a:xfrm>
                           <a:prstGeom prst="rect">
                             <a:avLst/>
@@ -5155,7 +5701,7 @@
       </w:tr>
       <w:tr>
         <w:trPr>
-          <w:trHeight w:val="350"/>
+          <w:trHeight w:val="179"/>
         </w:trPr>
         <w:tc>
           <w:tcPr>
@@ -5166,148 +5712,21 @@
               <w:spacing w:before="80" w:after="80"/>
               <w:rPr>
                 <w:rFonts w:ascii="Arial" w:hAnsi="Arial" w:cs="Arial"/>
-                <w:sz w:val="20"/>
-                <w:szCs w:val="20"/>
-              </w:rPr>
-            </w:pPr>
-            <w:r>
-              <w:rPr>
-                <w:rFonts w:ascii="Arial" w:hAnsi="Arial" w:cs="Arial"/>
-                <w:sz w:val="20"/>
-                <w:szCs w:val="20"/>
-              </w:rPr>
-              <w:t>5</w:t>
-            </w:r>
-          </w:p>
-        </w:tc>
-        <w:tc>
-          <w:tcPr>
-            <w:tcW w:w="3941" w:type="dxa"/>
-          </w:tcPr>
-          <w:p>
-            <w:pPr>
-              <w:spacing w:before="80" w:after="80"/>
-              <w:rPr>
-                <w:rFonts w:ascii="Arial" w:hAnsi="Arial" w:cs="Arial"/>
-                <w:color w:val="C00000"/>
-                <w:sz w:val="20"/>
-                <w:szCs w:val="20"/>
-              </w:rPr>
-            </w:pPr>
-            <w:r>
-              <w:rPr>
-                <w:rFonts w:ascii="Arial" w:hAnsi="Arial" w:cs="Arial"/>
-                <w:color w:val="C00000"/>
-                <w:sz w:val="20"/>
-                <w:szCs w:val="20"/>
-              </w:rPr>
-              <w:t>Log out of the registered user</w:t>
-            </w:r>
-          </w:p>
-        </w:tc>
-        <w:tc>
-          <w:tcPr>
-            <w:tcW w:w="3716" w:type="dxa"/>
-          </w:tcPr>
-          <w:p>
-            <w:pPr>
-              <w:spacing w:before="80" w:after="80"/>
-              <w:rPr>
-                <w:rFonts w:ascii="Arial" w:hAnsi="Arial" w:cs="Arial"/>
-                <w:color w:val="C00000"/>
-                <w:sz w:val="20"/>
-                <w:szCs w:val="20"/>
-              </w:rPr>
-            </w:pPr>
-            <w:r>
-              <w:rPr>
-                <w:rFonts w:ascii="Arial" w:hAnsi="Arial" w:cs="Arial"/>
-                <w:color w:val="C00000"/>
-                <w:sz w:val="20"/>
-                <w:szCs w:val="20"/>
-              </w:rPr>
-              <w:t>Will be redirected back to the landing page</w:t>
-            </w:r>
-          </w:p>
-        </w:tc>
-        <w:tc>
-          <w:tcPr>
-            <w:tcW w:w="2071" w:type="dxa"/>
-          </w:tcPr>
-          <w:p>
-            <w:pPr>
-              <w:spacing w:before="80" w:after="80"/>
-              <w:rPr>
-                <w:rFonts w:ascii="Arial" w:hAnsi="Arial" w:cs="Arial"/>
-                <w:color w:val="C00000"/>
-                <w:sz w:val="20"/>
-                <w:szCs w:val="20"/>
-              </w:rPr>
-            </w:pPr>
-            <w:r>
-              <w:rPr>
-                <w:rFonts w:ascii="Arial" w:hAnsi="Arial" w:cs="Arial"/>
-                <w:color w:val="C00000"/>
-                <w:sz w:val="20"/>
-                <w:szCs w:val="20"/>
-              </w:rPr>
-              <w:t>Pass</w:t>
-            </w:r>
-          </w:p>
-        </w:tc>
-        <w:tc>
-          <w:tcPr>
-            <w:tcW w:w="1971" w:type="dxa"/>
-          </w:tcPr>
-          <w:p>
-            <w:pPr>
-              <w:spacing w:before="80" w:after="80"/>
-              <w:rPr>
-                <w:rFonts w:ascii="Arial" w:hAnsi="Arial" w:cs="Arial"/>
-                <w:color w:val="C00000"/>
-                <w:sz w:val="20"/>
-                <w:szCs w:val="20"/>
-              </w:rPr>
-            </w:pPr>
-            <w:r>
-              <w:rPr>
-                <w:rFonts w:ascii="Arial" w:hAnsi="Arial" w:cs="Arial"/>
-                <w:color w:val="C00000"/>
-                <w:sz w:val="20"/>
-                <w:szCs w:val="20"/>
-              </w:rPr>
-              <w:t>No</w:t>
-            </w:r>
-          </w:p>
-        </w:tc>
-      </w:tr>
-      <w:tr>
-        <w:trPr>
-          <w:trHeight w:val="350"/>
-        </w:trPr>
-        <w:tc>
-          <w:tcPr>
-            <w:tcW w:w="1251" w:type="dxa"/>
-          </w:tcPr>
-          <w:p>
-            <w:pPr>
-              <w:spacing w:before="80" w:after="80"/>
-              <w:rPr>
-                <w:rFonts w:ascii="Arial" w:hAnsi="Arial" w:cs="Arial"/>
-                <w:b/>
-                <w:bCs/>
-                <w:sz w:val="20"/>
-                <w:szCs w:val="20"/>
-              </w:rPr>
-            </w:pPr>
-            <w:r>
-              <w:rPr>
-                <w:rFonts w:ascii="Arial" w:hAnsi="Arial" w:cs="Arial"/>
-                <w:b/>
-                <w:bCs/>
-                <w:sz w:val="20"/>
-                <w:szCs w:val="20"/>
-              </w:rPr>
+                <w:b/>
+                <w:bCs/>
+                <w:sz w:val="20"/>
+                <w:szCs w:val="20"/>
+              </w:rPr>
+            </w:pPr>
+            <w:r>
+              <w:rPr>
+                <w:rFonts w:ascii="Arial" w:hAnsi="Arial" w:cs="Arial"/>
+                <w:b/>
+                <w:bCs/>
+                <w:sz w:val="20"/>
+                <w:szCs w:val="20"/>
+              </w:rPr>
+              <w:lastRenderedPageBreak/>
               <w:t>Comments</w:t>
             </w:r>
           </w:p>
@@ -5327,15 +5746,6 @@
                 <w:szCs w:val="20"/>
               </w:rPr>
             </w:pPr>
-            <w:r>
-              <w:rPr>
-                <w:rFonts w:ascii="Arial" w:hAnsi="Arial" w:cs="Arial"/>
-                <w:color w:val="C00000"/>
-                <w:sz w:val="20"/>
-                <w:szCs w:val="20"/>
-              </w:rPr>
-              <w:t>No error messages or confirmation messages after submission, appears reservation went through</w:t>
-            </w:r>
           </w:p>
         </w:tc>
       </w:tr>
@@ -5357,11 +5767,11 @@
         <w:tblLook w:val="04A0" w:firstRow="1" w:lastRow="0" w:firstColumn="1" w:lastColumn="0" w:noHBand="0" w:noVBand="1"/>
       </w:tblPr>
       <w:tblGrid>
-        <w:gridCol w:w="1250"/>
-        <w:gridCol w:w="3941"/>
-        <w:gridCol w:w="1757"/>
-        <w:gridCol w:w="1366"/>
-        <w:gridCol w:w="4636"/>
+        <w:gridCol w:w="1249"/>
+        <w:gridCol w:w="3934"/>
+        <w:gridCol w:w="1248"/>
+        <w:gridCol w:w="1182"/>
+        <w:gridCol w:w="5337"/>
       </w:tblGrid>
       <w:tr>
         <w:trPr>
@@ -5862,7 +6272,27 @@
                 <w:sz w:val="20"/>
                 <w:szCs w:val="20"/>
               </w:rPr>
-              <w:t>Navigate to MoffayBayLodge landing page(</w:t>
+              <w:t xml:space="preserve">Navigate to </w:t>
+            </w:r>
+            <w:proofErr w:type="spellStart"/>
+            <w:r>
+              <w:rPr>
+                <w:rFonts w:ascii="Arial" w:hAnsi="Arial" w:cs="Arial"/>
+                <w:color w:val="C00000"/>
+                <w:sz w:val="20"/>
+                <w:szCs w:val="20"/>
+              </w:rPr>
+              <w:t>MoffayBayLodge</w:t>
+            </w:r>
+            <w:proofErr w:type="spellEnd"/>
+            <w:r>
+              <w:rPr>
+                <w:rFonts w:ascii="Arial" w:hAnsi="Arial" w:cs="Arial"/>
+                <w:color w:val="C00000"/>
+                <w:sz w:val="20"/>
+                <w:szCs w:val="20"/>
+              </w:rPr>
+              <w:t xml:space="preserve"> landing page(</w:t>
             </w:r>
             <w:r>
               <w:rPr>
@@ -5971,11 +6401,11 @@
             <w:r>
               <w:rPr>
                 <w:rFonts w:ascii="Arial" w:hAnsi="Arial" w:cs="Arial"/>
-                <w:color w:val="C00000"/>
-                <w:sz w:val="20"/>
-                <w:szCs w:val="20"/>
-              </w:rPr>
-              <w:lastRenderedPageBreak/>
+                <w:noProof/>
+                <w:color w:val="C00000"/>
+                <w:sz w:val="20"/>
+                <w:szCs w:val="20"/>
+              </w:rPr>
               <w:drawing>
                 <wp:inline distT="0" distB="0" distL="0" distR="0" wp14:anchorId="642F8BB9" wp14:editId="0F102707">
                   <wp:extent cx="2273300" cy="1331881"/>
@@ -6038,7 +6468,6 @@
                 <w:sz w:val="20"/>
                 <w:szCs w:val="20"/>
               </w:rPr>
-              <w:lastRenderedPageBreak/>
               <w:t>2</w:t>
             </w:r>
           </w:p>
@@ -6139,7 +6568,7 @@
                 <w:sz w:val="20"/>
                 <w:szCs w:val="20"/>
               </w:rPr>
-              <w:t>No</w:t>
+              <w:t>Yes</w:t>
             </w:r>
           </w:p>
           <w:p>
@@ -6160,10 +6589,10 @@
                 <w:szCs w:val="20"/>
               </w:rPr>
               <w:drawing>
-                <wp:inline distT="0" distB="0" distL="0" distR="0" wp14:anchorId="4C4B7DF0" wp14:editId="072B3A2E">
-                  <wp:extent cx="2806700" cy="980851"/>
-                  <wp:effectExtent l="0" t="0" r="0" b="0"/>
-                  <wp:docPr id="197920614" name="Picture 1"/>
+                <wp:inline distT="0" distB="0" distL="0" distR="0" wp14:anchorId="13259547" wp14:editId="23DC91F9">
+                  <wp:extent cx="1976816" cy="1562100"/>
+                  <wp:effectExtent l="0" t="0" r="4445" b="0"/>
+                  <wp:docPr id="942449349" name="Picture 1"/>
                   <wp:cNvGraphicFramePr>
                     <a:graphicFrameLocks xmlns:a="http://schemas.openxmlformats.org/drawingml/2006/main" noChangeAspect="1"/>
                   </wp:cNvGraphicFramePr>
@@ -6171,7 +6600,7 @@
                     <a:graphicData uri="http://schemas.openxmlformats.org/drawingml/2006/picture">
                       <pic:pic xmlns:pic="http://schemas.openxmlformats.org/drawingml/2006/picture">
                         <pic:nvPicPr>
-                          <pic:cNvPr id="1240259731" name=""/>
+                          <pic:cNvPr id="79938956" name=""/>
                           <pic:cNvPicPr/>
                         </pic:nvPicPr>
                         <pic:blipFill>
@@ -6183,7 +6612,7 @@
                         <pic:spPr>
                           <a:xfrm>
                             <a:off x="0" y="0"/>
-                            <a:ext cx="2812208" cy="982776"/>
+                            <a:ext cx="1980955" cy="1565371"/>
                           </a:xfrm>
                           <a:prstGeom prst="rect">
                             <a:avLst/>
@@ -6221,6 +6650,7 @@
                 <w:sz w:val="20"/>
                 <w:szCs w:val="20"/>
               </w:rPr>
+              <w:lastRenderedPageBreak/>
               <w:t>3</w:t>
             </w:r>
           </w:p>
@@ -6330,225 +6760,7 @@
                 <w:sz w:val="20"/>
                 <w:szCs w:val="20"/>
               </w:rPr>
-              <w:t>No</w:t>
-            </w:r>
-          </w:p>
-        </w:tc>
-      </w:tr>
-      <w:tr>
-        <w:trPr>
-          <w:trHeight w:val="350"/>
-        </w:trPr>
-        <w:tc>
-          <w:tcPr>
-            <w:tcW w:w="1251" w:type="dxa"/>
-          </w:tcPr>
-          <w:p>
-            <w:pPr>
-              <w:spacing w:before="80" w:after="80"/>
-              <w:rPr>
-                <w:rFonts w:ascii="Arial" w:hAnsi="Arial" w:cs="Arial"/>
-                <w:sz w:val="20"/>
-                <w:szCs w:val="20"/>
-              </w:rPr>
-            </w:pPr>
-            <w:r>
-              <w:rPr>
-                <w:rFonts w:ascii="Arial" w:hAnsi="Arial" w:cs="Arial"/>
-                <w:sz w:val="20"/>
-                <w:szCs w:val="20"/>
-              </w:rPr>
-              <w:t>4</w:t>
-            </w:r>
-          </w:p>
-        </w:tc>
-        <w:tc>
-          <w:tcPr>
-            <w:tcW w:w="3941" w:type="dxa"/>
-          </w:tcPr>
-          <w:p>
-            <w:pPr>
-              <w:spacing w:before="80" w:after="80"/>
-              <w:rPr>
-                <w:rFonts w:ascii="Arial" w:hAnsi="Arial" w:cs="Arial"/>
-                <w:color w:val="C00000"/>
-                <w:sz w:val="20"/>
-                <w:szCs w:val="20"/>
-              </w:rPr>
-            </w:pPr>
-            <w:r>
-              <w:rPr>
-                <w:rFonts w:ascii="Arial" w:hAnsi="Arial" w:cs="Arial"/>
-                <w:color w:val="C00000"/>
-                <w:sz w:val="20"/>
-                <w:szCs w:val="20"/>
-              </w:rPr>
-              <w:t xml:space="preserve">Attempt to reserve a room with a </w:t>
-            </w:r>
-            <w:r>
-              <w:rPr>
-                <w:rFonts w:ascii="Arial" w:hAnsi="Arial" w:cs="Arial"/>
-                <w:color w:val="C00000"/>
-                <w:sz w:val="20"/>
-                <w:szCs w:val="20"/>
-              </w:rPr>
-              <w:t>check-in</w:t>
-            </w:r>
-            <w:r>
-              <w:rPr>
-                <w:rFonts w:ascii="Arial" w:hAnsi="Arial" w:cs="Arial"/>
-                <w:color w:val="C00000"/>
-                <w:sz w:val="20"/>
-                <w:szCs w:val="20"/>
-              </w:rPr>
-              <w:t xml:space="preserve"> date but no </w:t>
-            </w:r>
-            <w:r>
-              <w:rPr>
-                <w:rFonts w:ascii="Arial" w:hAnsi="Arial" w:cs="Arial"/>
-                <w:color w:val="C00000"/>
-                <w:sz w:val="20"/>
-                <w:szCs w:val="20"/>
-              </w:rPr>
-              <w:t>check-out date</w:t>
-            </w:r>
-          </w:p>
-        </w:tc>
-        <w:tc>
-          <w:tcPr>
-            <w:tcW w:w="3716" w:type="dxa"/>
-          </w:tcPr>
-          <w:p>
-            <w:pPr>
-              <w:spacing w:before="80" w:after="80"/>
-              <w:rPr>
-                <w:rFonts w:ascii="Arial" w:hAnsi="Arial" w:cs="Arial"/>
-                <w:color w:val="C00000"/>
-                <w:sz w:val="20"/>
-                <w:szCs w:val="20"/>
-              </w:rPr>
-            </w:pPr>
-            <w:r>
-              <w:rPr>
-                <w:rFonts w:ascii="Arial" w:hAnsi="Arial" w:cs="Arial"/>
-                <w:color w:val="C00000"/>
-                <w:sz w:val="20"/>
-                <w:szCs w:val="20"/>
-              </w:rPr>
-              <w:t>An error</w:t>
-            </w:r>
-            <w:r>
-              <w:rPr>
-                <w:rFonts w:ascii="Arial" w:hAnsi="Arial" w:cs="Arial"/>
-                <w:color w:val="C00000"/>
-                <w:sz w:val="20"/>
-                <w:szCs w:val="20"/>
-              </w:rPr>
-              <w:t xml:space="preserve"> message displays </w:t>
-            </w:r>
-            <w:r>
-              <w:rPr>
-                <w:rFonts w:ascii="Arial" w:hAnsi="Arial" w:cs="Arial"/>
-                <w:color w:val="C00000"/>
-                <w:sz w:val="20"/>
-                <w:szCs w:val="20"/>
-              </w:rPr>
-              <w:t>in an</w:t>
-            </w:r>
-            <w:r>
-              <w:rPr>
-                <w:rFonts w:ascii="Arial" w:hAnsi="Arial" w:cs="Arial"/>
-                <w:color w:val="C00000"/>
-                <w:sz w:val="20"/>
-                <w:szCs w:val="20"/>
-              </w:rPr>
-              <w:t xml:space="preserve"> empty field</w:t>
-            </w:r>
-            <w:r>
-              <w:rPr>
-                <w:rFonts w:ascii="Arial" w:hAnsi="Arial" w:cs="Arial"/>
-                <w:color w:val="C00000"/>
-                <w:sz w:val="20"/>
-                <w:szCs w:val="20"/>
-              </w:rPr>
-              <w:t>,</w:t>
-            </w:r>
-            <w:r>
-              <w:rPr>
-                <w:rFonts w:ascii="Arial" w:hAnsi="Arial" w:cs="Arial"/>
-                <w:color w:val="C00000"/>
-                <w:sz w:val="20"/>
-                <w:szCs w:val="20"/>
-              </w:rPr>
-              <w:t xml:space="preserve"> asking </w:t>
-            </w:r>
-            <w:r>
-              <w:rPr>
-                <w:rFonts w:ascii="Arial" w:hAnsi="Arial" w:cs="Arial"/>
-                <w:color w:val="C00000"/>
-                <w:sz w:val="20"/>
-                <w:szCs w:val="20"/>
-              </w:rPr>
-              <w:t xml:space="preserve">the </w:t>
-            </w:r>
-            <w:r>
-              <w:rPr>
-                <w:rFonts w:ascii="Arial" w:hAnsi="Arial" w:cs="Arial"/>
-                <w:color w:val="C00000"/>
-                <w:sz w:val="20"/>
-                <w:szCs w:val="20"/>
-              </w:rPr>
-              <w:t xml:space="preserve">user to fill it out before continuing </w:t>
-            </w:r>
-          </w:p>
-        </w:tc>
-        <w:tc>
-          <w:tcPr>
-            <w:tcW w:w="2071" w:type="dxa"/>
-          </w:tcPr>
-          <w:p>
-            <w:pPr>
-              <w:spacing w:before="80" w:after="80"/>
-              <w:rPr>
-                <w:rFonts w:ascii="Arial" w:hAnsi="Arial" w:cs="Arial"/>
-                <w:color w:val="C00000"/>
-                <w:sz w:val="20"/>
-                <w:szCs w:val="20"/>
-              </w:rPr>
-            </w:pPr>
-            <w:r>
-              <w:rPr>
-                <w:rFonts w:ascii="Arial" w:hAnsi="Arial" w:cs="Arial"/>
-                <w:color w:val="C00000"/>
-                <w:sz w:val="20"/>
-                <w:szCs w:val="20"/>
-              </w:rPr>
-              <w:t>Pass</w:t>
-            </w:r>
-          </w:p>
-        </w:tc>
-        <w:tc>
-          <w:tcPr>
-            <w:tcW w:w="1971" w:type="dxa"/>
-          </w:tcPr>
-          <w:p>
-            <w:pPr>
-              <w:spacing w:before="80" w:after="80"/>
-              <w:rPr>
-                <w:rFonts w:ascii="Arial" w:hAnsi="Arial" w:cs="Arial"/>
-                <w:color w:val="C00000"/>
-                <w:sz w:val="20"/>
-                <w:szCs w:val="20"/>
-              </w:rPr>
-            </w:pPr>
-            <w:r>
-              <w:rPr>
-                <w:rFonts w:ascii="Arial" w:hAnsi="Arial" w:cs="Arial"/>
-                <w:color w:val="C00000"/>
-                <w:sz w:val="20"/>
-                <w:szCs w:val="20"/>
-              </w:rPr>
-              <w:t>No</w:t>
+              <w:t>Yes</w:t>
             </w:r>
           </w:p>
           <w:p>
@@ -6569,10 +6781,10 @@
                 <w:szCs w:val="20"/>
               </w:rPr>
               <w:drawing>
-                <wp:inline distT="0" distB="0" distL="0" distR="0" wp14:anchorId="33292BB4" wp14:editId="4D7E7108">
-                  <wp:extent cx="2806700" cy="980851"/>
-                  <wp:effectExtent l="0" t="0" r="0" b="0"/>
-                  <wp:docPr id="1482952935" name="Picture 1"/>
+                <wp:inline distT="0" distB="0" distL="0" distR="0" wp14:anchorId="586DDC49" wp14:editId="09A8B384">
+                  <wp:extent cx="2184400" cy="1805420"/>
+                  <wp:effectExtent l="0" t="0" r="6350" b="4445"/>
+                  <wp:docPr id="413230831" name="Picture 1"/>
                   <wp:cNvGraphicFramePr>
                     <a:graphicFrameLocks xmlns:a="http://schemas.openxmlformats.org/drawingml/2006/main" noChangeAspect="1"/>
                   </wp:cNvGraphicFramePr>
@@ -6580,11 +6792,11 @@
                     <a:graphicData uri="http://schemas.openxmlformats.org/drawingml/2006/picture">
                       <pic:pic xmlns:pic="http://schemas.openxmlformats.org/drawingml/2006/picture">
                         <pic:nvPicPr>
-                          <pic:cNvPr id="1240259731" name=""/>
+                          <pic:cNvPr id="767645164" name=""/>
                           <pic:cNvPicPr/>
                         </pic:nvPicPr>
                         <pic:blipFill>
-                          <a:blip r:embed="rId9"/>
+                          <a:blip r:embed="rId10"/>
                           <a:stretch>
                             <a:fillRect/>
                           </a:stretch>
@@ -6592,7 +6804,7 @@
                         <pic:spPr>
                           <a:xfrm>
                             <a:off x="0" y="0"/>
-                            <a:ext cx="2812208" cy="982776"/>
+                            <a:ext cx="2187529" cy="1808006"/>
                           </a:xfrm>
                           <a:prstGeom prst="rect">
                             <a:avLst/>
@@ -6630,7 +6842,7 @@
                 <w:sz w:val="20"/>
                 <w:szCs w:val="20"/>
               </w:rPr>
-              <w:t>5</w:t>
+              <w:t>4</w:t>
             </w:r>
           </w:p>
         </w:tc>
@@ -6655,7 +6867,34 @@
                 <w:sz w:val="20"/>
                 <w:szCs w:val="20"/>
               </w:rPr>
-              <w:t>Log out of the registered user</w:t>
+              <w:t xml:space="preserve">Attempt to reserve a room with a </w:t>
+            </w:r>
+            <w:r>
+              <w:rPr>
+                <w:rFonts w:ascii="Arial" w:hAnsi="Arial" w:cs="Arial"/>
+                <w:color w:val="C00000"/>
+                <w:sz w:val="20"/>
+                <w:szCs w:val="20"/>
+              </w:rPr>
+              <w:t>check-in</w:t>
+            </w:r>
+            <w:r>
+              <w:rPr>
+                <w:rFonts w:ascii="Arial" w:hAnsi="Arial" w:cs="Arial"/>
+                <w:color w:val="C00000"/>
+                <w:sz w:val="20"/>
+                <w:szCs w:val="20"/>
+              </w:rPr>
+              <w:t xml:space="preserve"> date but no </w:t>
+            </w:r>
+            <w:r>
+              <w:rPr>
+                <w:rFonts w:ascii="Arial" w:hAnsi="Arial" w:cs="Arial"/>
+                <w:color w:val="C00000"/>
+                <w:sz w:val="20"/>
+                <w:szCs w:val="20"/>
+              </w:rPr>
+              <w:t>check-out date</w:t>
             </w:r>
           </w:p>
         </w:tc>
@@ -6680,7 +6919,70 @@
                 <w:sz w:val="20"/>
                 <w:szCs w:val="20"/>
               </w:rPr>
-              <w:t>Will be redirected back to the landing page</w:t>
+              <w:t>An error</w:t>
+            </w:r>
+            <w:r>
+              <w:rPr>
+                <w:rFonts w:ascii="Arial" w:hAnsi="Arial" w:cs="Arial"/>
+                <w:color w:val="C00000"/>
+                <w:sz w:val="20"/>
+                <w:szCs w:val="20"/>
+              </w:rPr>
+              <w:t xml:space="preserve"> message displays </w:t>
+            </w:r>
+            <w:r>
+              <w:rPr>
+                <w:rFonts w:ascii="Arial" w:hAnsi="Arial" w:cs="Arial"/>
+                <w:color w:val="C00000"/>
+                <w:sz w:val="20"/>
+                <w:szCs w:val="20"/>
+              </w:rPr>
+              <w:t>in an</w:t>
+            </w:r>
+            <w:r>
+              <w:rPr>
+                <w:rFonts w:ascii="Arial" w:hAnsi="Arial" w:cs="Arial"/>
+                <w:color w:val="C00000"/>
+                <w:sz w:val="20"/>
+                <w:szCs w:val="20"/>
+              </w:rPr>
+              <w:t xml:space="preserve"> empty field</w:t>
+            </w:r>
+            <w:r>
+              <w:rPr>
+                <w:rFonts w:ascii="Arial" w:hAnsi="Arial" w:cs="Arial"/>
+                <w:color w:val="C00000"/>
+                <w:sz w:val="20"/>
+                <w:szCs w:val="20"/>
+              </w:rPr>
+              <w:t>,</w:t>
+            </w:r>
+            <w:r>
+              <w:rPr>
+                <w:rFonts w:ascii="Arial" w:hAnsi="Arial" w:cs="Arial"/>
+                <w:color w:val="C00000"/>
+                <w:sz w:val="20"/>
+                <w:szCs w:val="20"/>
+              </w:rPr>
+              <w:t xml:space="preserve"> asking </w:t>
+            </w:r>
+            <w:r>
+              <w:rPr>
+                <w:rFonts w:ascii="Arial" w:hAnsi="Arial" w:cs="Arial"/>
+                <w:color w:val="C00000"/>
+                <w:sz w:val="20"/>
+                <w:szCs w:val="20"/>
+              </w:rPr>
+              <w:t xml:space="preserve">the </w:t>
+            </w:r>
+            <w:r>
+              <w:rPr>
+                <w:rFonts w:ascii="Arial" w:hAnsi="Arial" w:cs="Arial"/>
+                <w:color w:val="C00000"/>
+                <w:sz w:val="20"/>
+                <w:szCs w:val="20"/>
+              </w:rPr>
+              <w:t xml:space="preserve">user to fill it out before continuing </w:t>
             </w:r>
           </w:p>
         </w:tc>
@@ -6730,7 +7032,61 @@
                 <w:sz w:val="20"/>
                 <w:szCs w:val="20"/>
               </w:rPr>
-              <w:t>No</w:t>
+              <w:t>Yes</w:t>
+            </w:r>
+          </w:p>
+          <w:p>
+            <w:pPr>
+              <w:spacing w:before="80" w:after="80"/>
+              <w:rPr>
+                <w:rFonts w:ascii="Arial" w:hAnsi="Arial" w:cs="Arial"/>
+                <w:color w:val="C00000"/>
+                <w:sz w:val="20"/>
+                <w:szCs w:val="20"/>
+              </w:rPr>
+            </w:pPr>
+            <w:r>
+              <w:rPr>
+                <w:rFonts w:ascii="Arial" w:hAnsi="Arial" w:cs="Arial"/>
+                <w:color w:val="C00000"/>
+                <w:sz w:val="20"/>
+                <w:szCs w:val="20"/>
+              </w:rPr>
+              <w:drawing>
+                <wp:inline distT="0" distB="0" distL="0" distR="0" wp14:anchorId="14A7B2E2" wp14:editId="39DB70FD">
+                  <wp:extent cx="3250692" cy="1003300"/>
+                  <wp:effectExtent l="0" t="0" r="6985" b="6350"/>
+                  <wp:docPr id="994959243" name="Picture 1"/>
+                  <wp:cNvGraphicFramePr>
+                    <a:graphicFrameLocks xmlns:a="http://schemas.openxmlformats.org/drawingml/2006/main" noChangeAspect="1"/>
+                  </wp:cNvGraphicFramePr>
+                  <a:graphic xmlns:a="http://schemas.openxmlformats.org/drawingml/2006/main">
+                    <a:graphicData uri="http://schemas.openxmlformats.org/drawingml/2006/picture">
+                      <pic:pic xmlns:pic="http://schemas.openxmlformats.org/drawingml/2006/picture">
+                        <pic:nvPicPr>
+                          <pic:cNvPr id="994959243" name=""/>
+                          <pic:cNvPicPr/>
+                        </pic:nvPicPr>
+                        <pic:blipFill>
+                          <a:blip r:embed="rId15"/>
+                          <a:stretch>
+                            <a:fillRect/>
+                          </a:stretch>
+                        </pic:blipFill>
+                        <pic:spPr>
+                          <a:xfrm>
+                            <a:off x="0" y="0"/>
+                            <a:ext cx="3251639" cy="1003592"/>
+                          </a:xfrm>
+                          <a:prstGeom prst="rect">
+                            <a:avLst/>
+                          </a:prstGeom>
+                        </pic:spPr>
+                      </pic:pic>
+                    </a:graphicData>
+                  </a:graphic>
+                </wp:inline>
+              </w:drawing>
             </w:r>
           </w:p>
         </w:tc>
@@ -6748,21 +7104,202 @@
               <w:spacing w:before="80" w:after="80"/>
               <w:rPr>
                 <w:rFonts w:ascii="Arial" w:hAnsi="Arial" w:cs="Arial"/>
-                <w:b/>
-                <w:bCs/>
-                <w:sz w:val="20"/>
-                <w:szCs w:val="20"/>
-              </w:rPr>
-            </w:pPr>
-            <w:r>
-              <w:rPr>
-                <w:rFonts w:ascii="Arial" w:hAnsi="Arial" w:cs="Arial"/>
-                <w:b/>
-                <w:bCs/>
-                <w:sz w:val="20"/>
-                <w:szCs w:val="20"/>
-              </w:rPr>
-              <w:lastRenderedPageBreak/>
+                <w:sz w:val="20"/>
+                <w:szCs w:val="20"/>
+              </w:rPr>
+            </w:pPr>
+            <w:r>
+              <w:rPr>
+                <w:rFonts w:ascii="Arial" w:hAnsi="Arial" w:cs="Arial"/>
+                <w:sz w:val="20"/>
+                <w:szCs w:val="20"/>
+              </w:rPr>
+              <w:t>5</w:t>
+            </w:r>
+          </w:p>
+        </w:tc>
+        <w:tc>
+          <w:tcPr>
+            <w:tcW w:w="3941" w:type="dxa"/>
+          </w:tcPr>
+          <w:p>
+            <w:pPr>
+              <w:spacing w:before="80" w:after="80"/>
+              <w:rPr>
+                <w:rFonts w:ascii="Arial" w:hAnsi="Arial" w:cs="Arial"/>
+                <w:color w:val="C00000"/>
+                <w:sz w:val="20"/>
+                <w:szCs w:val="20"/>
+              </w:rPr>
+            </w:pPr>
+            <w:r>
+              <w:rPr>
+                <w:rFonts w:ascii="Arial" w:hAnsi="Arial" w:cs="Arial"/>
+                <w:color w:val="C00000"/>
+                <w:sz w:val="20"/>
+                <w:szCs w:val="20"/>
+              </w:rPr>
+              <w:t>Log out of the registered user</w:t>
+            </w:r>
+          </w:p>
+        </w:tc>
+        <w:tc>
+          <w:tcPr>
+            <w:tcW w:w="3716" w:type="dxa"/>
+          </w:tcPr>
+          <w:p>
+            <w:pPr>
+              <w:spacing w:before="80" w:after="80"/>
+              <w:rPr>
+                <w:rFonts w:ascii="Arial" w:hAnsi="Arial" w:cs="Arial"/>
+                <w:color w:val="C00000"/>
+                <w:sz w:val="20"/>
+                <w:szCs w:val="20"/>
+              </w:rPr>
+            </w:pPr>
+            <w:r>
+              <w:rPr>
+                <w:rFonts w:ascii="Arial" w:hAnsi="Arial" w:cs="Arial"/>
+                <w:color w:val="C00000"/>
+                <w:sz w:val="20"/>
+                <w:szCs w:val="20"/>
+              </w:rPr>
+              <w:t>Will be redirected back to the landing page</w:t>
+            </w:r>
+          </w:p>
+        </w:tc>
+        <w:tc>
+          <w:tcPr>
+            <w:tcW w:w="2071" w:type="dxa"/>
+          </w:tcPr>
+          <w:p>
+            <w:pPr>
+              <w:spacing w:before="80" w:after="80"/>
+              <w:rPr>
+                <w:rFonts w:ascii="Arial" w:hAnsi="Arial" w:cs="Arial"/>
+                <w:color w:val="C00000"/>
+                <w:sz w:val="20"/>
+                <w:szCs w:val="20"/>
+              </w:rPr>
+            </w:pPr>
+            <w:r>
+              <w:rPr>
+                <w:rFonts w:ascii="Arial" w:hAnsi="Arial" w:cs="Arial"/>
+                <w:color w:val="C00000"/>
+                <w:sz w:val="20"/>
+                <w:szCs w:val="20"/>
+              </w:rPr>
+              <w:t>Pass</w:t>
+            </w:r>
+          </w:p>
+        </w:tc>
+        <w:tc>
+          <w:tcPr>
+            <w:tcW w:w="1971" w:type="dxa"/>
+          </w:tcPr>
+          <w:p>
+            <w:pPr>
+              <w:spacing w:before="80" w:after="80"/>
+              <w:rPr>
+                <w:rFonts w:ascii="Arial" w:hAnsi="Arial" w:cs="Arial"/>
+                <w:color w:val="C00000"/>
+                <w:sz w:val="20"/>
+                <w:szCs w:val="20"/>
+              </w:rPr>
+            </w:pPr>
+            <w:r>
+              <w:rPr>
+                <w:rFonts w:ascii="Arial" w:hAnsi="Arial" w:cs="Arial"/>
+                <w:color w:val="C00000"/>
+                <w:sz w:val="20"/>
+                <w:szCs w:val="20"/>
+              </w:rPr>
+              <w:t>Yes</w:t>
+            </w:r>
+          </w:p>
+          <w:p>
+            <w:pPr>
+              <w:spacing w:before="80" w:after="80"/>
+              <w:rPr>
+                <w:rFonts w:ascii="Arial" w:hAnsi="Arial" w:cs="Arial"/>
+                <w:color w:val="C00000"/>
+                <w:sz w:val="20"/>
+                <w:szCs w:val="20"/>
+              </w:rPr>
+            </w:pPr>
+            <w:r>
+              <w:rPr>
+                <w:rFonts w:ascii="Arial" w:hAnsi="Arial" w:cs="Arial"/>
+                <w:color w:val="C00000"/>
+                <w:sz w:val="20"/>
+                <w:szCs w:val="20"/>
+              </w:rPr>
+              <w:drawing>
+                <wp:inline distT="0" distB="0" distL="0" distR="0" wp14:anchorId="2A700DCA" wp14:editId="27CDB53B">
+                  <wp:extent cx="2819400" cy="615557"/>
+                  <wp:effectExtent l="0" t="0" r="0" b="0"/>
+                  <wp:docPr id="2016193879" name="Picture 1"/>
+                  <wp:cNvGraphicFramePr>
+                    <a:graphicFrameLocks xmlns:a="http://schemas.openxmlformats.org/drawingml/2006/main" noChangeAspect="1"/>
+                  </wp:cNvGraphicFramePr>
+                  <a:graphic xmlns:a="http://schemas.openxmlformats.org/drawingml/2006/main">
+                    <a:graphicData uri="http://schemas.openxmlformats.org/drawingml/2006/picture">
+                      <pic:pic xmlns:pic="http://schemas.openxmlformats.org/drawingml/2006/picture">
+                        <pic:nvPicPr>
+                          <pic:cNvPr id="535569739" name=""/>
+                          <pic:cNvPicPr/>
+                        </pic:nvPicPr>
+                        <pic:blipFill>
+                          <a:blip r:embed="rId12"/>
+                          <a:stretch>
+                            <a:fillRect/>
+                          </a:stretch>
+                        </pic:blipFill>
+                        <pic:spPr>
+                          <a:xfrm>
+                            <a:off x="0" y="0"/>
+                            <a:ext cx="2829325" cy="617724"/>
+                          </a:xfrm>
+                          <a:prstGeom prst="rect">
+                            <a:avLst/>
+                          </a:prstGeom>
+                        </pic:spPr>
+                      </pic:pic>
+                    </a:graphicData>
+                  </a:graphic>
+                </wp:inline>
+              </w:drawing>
+            </w:r>
+          </w:p>
+        </w:tc>
+      </w:tr>
+      <w:tr>
+        <w:trPr>
+          <w:trHeight w:val="350"/>
+        </w:trPr>
+        <w:tc>
+          <w:tcPr>
+            <w:tcW w:w="1251" w:type="dxa"/>
+          </w:tcPr>
+          <w:p>
+            <w:pPr>
+              <w:spacing w:before="80" w:after="80"/>
+              <w:rPr>
+                <w:rFonts w:ascii="Arial" w:hAnsi="Arial" w:cs="Arial"/>
+                <w:b/>
+                <w:bCs/>
+                <w:sz w:val="20"/>
+                <w:szCs w:val="20"/>
+              </w:rPr>
+            </w:pPr>
+            <w:r>
+              <w:rPr>
+                <w:rFonts w:ascii="Arial" w:hAnsi="Arial" w:cs="Arial"/>
+                <w:b/>
+                <w:bCs/>
+                <w:sz w:val="20"/>
+                <w:szCs w:val="20"/>
+              </w:rPr>
               <w:t>Comments</w:t>
             </w:r>
           </w:p>
@@ -6782,15 +7319,6 @@
                 <w:szCs w:val="20"/>
               </w:rPr>
             </w:pPr>
-            <w:r>
-              <w:rPr>
-                <w:rFonts w:ascii="Arial" w:hAnsi="Arial" w:cs="Arial"/>
-                <w:color w:val="C00000"/>
-                <w:sz w:val="20"/>
-                <w:szCs w:val="20"/>
-              </w:rPr>
-              <w:t xml:space="preserve">No check out date selections available </w:t>
-            </w:r>
           </w:p>
         </w:tc>
       </w:tr>
@@ -6806,8 +7334,8 @@
       </w:pPr>
     </w:p>
     <w:sectPr>
-      <w:headerReference w:type="default" r:id="rId13"/>
-      <w:footerReference w:type="default" r:id="rId14"/>
+      <w:headerReference w:type="default" r:id="rId16"/>
+      <w:footerReference w:type="default" r:id="rId17"/>
       <w:pgSz w:w="15840" w:h="12240" w:orient="landscape"/>
       <w:pgMar w:top="1440" w:right="1440" w:bottom="1440" w:left="1440" w:header="720" w:footer="720" w:gutter="0"/>
       <w:cols w:space="720"/>

</xml_diff>

<commit_message>
Added in table of ontents to Test Cases - Anderson 4/24/26
</commit_message>
<xml_diff>
--- a/MODULE-6/6.2 Test Plan - MoffatBay.docx
+++ b/MODULE-6/6.2 Test Plan - MoffatBay.docx
@@ -98,25 +98,7 @@
                 <w:sz w:val="20"/>
                 <w:szCs w:val="20"/>
               </w:rPr>
-              <w:t xml:space="preserve">Zachary Anderson, </w:t>
-            </w:r>
-            <w:proofErr w:type="spellStart"/>
-            <w:r>
-              <w:rPr>
-                <w:rFonts w:ascii="Arial" w:hAnsi="Arial" w:cs="Arial"/>
-                <w:sz w:val="20"/>
-                <w:szCs w:val="20"/>
-              </w:rPr>
-              <w:t>Tevyah</w:t>
-            </w:r>
-            <w:proofErr w:type="spellEnd"/>
-            <w:r>
-              <w:rPr>
-                <w:rFonts w:ascii="Arial" w:hAnsi="Arial" w:cs="Arial"/>
-                <w:sz w:val="20"/>
-                <w:szCs w:val="20"/>
-              </w:rPr>
-              <w:t xml:space="preserve"> Hanley, Cameron Mendez, Angela Vargas</w:t>
+              <w:t>Zachary Anderson, Tevyah Hanley, Cameron Mendez, Angela Vargas</w:t>
             </w:r>
           </w:p>
         </w:tc>
@@ -593,7 +575,27 @@
                 <w:bCs/>
                 <w:noProof/>
               </w:rPr>
-              <w:t>&lt;DESCRIPTION&gt;</w:t>
+              <w:t>&lt;</w:t>
+            </w:r>
+            <w:r>
+              <w:rPr>
+                <w:rStyle w:val="Hyperlink"/>
+                <w:rFonts w:ascii="Arial" w:hAnsi="Arial" w:cs="Arial"/>
+                <w:b/>
+                <w:bCs/>
+                <w:noProof/>
+              </w:rPr>
+              <w:t>Successful Reservation</w:t>
+            </w:r>
+            <w:r>
+              <w:rPr>
+                <w:rStyle w:val="Hyperlink"/>
+                <w:rFonts w:ascii="Arial" w:hAnsi="Arial" w:cs="Arial"/>
+                <w:b/>
+                <w:bCs/>
+                <w:noProof/>
+              </w:rPr>
+              <w:t>&gt;</w:t>
             </w:r>
             <w:r>
               <w:rPr>
@@ -644,6 +646,9 @@
               <w:fldChar w:fldCharType="end"/>
             </w:r>
           </w:hyperlink>
+          <w:r>
+            <w:t>-3</w:t>
+          </w:r>
         </w:p>
         <w:p>
           <w:pPr>
@@ -665,7 +670,27 @@
                 <w:bCs/>
                 <w:noProof/>
               </w:rPr>
-              <w:t>&lt;DESCRIPTION&gt;</w:t>
+              <w:t>&lt;</w:t>
+            </w:r>
+            <w:r>
+              <w:rPr>
+                <w:rStyle w:val="Hyperlink"/>
+                <w:rFonts w:ascii="Arial" w:hAnsi="Arial" w:cs="Arial"/>
+                <w:b/>
+                <w:bCs/>
+                <w:noProof/>
+              </w:rPr>
+              <w:t>Sucessful Rservation w/ Attractions</w:t>
+            </w:r>
+            <w:r>
+              <w:rPr>
+                <w:rStyle w:val="Hyperlink"/>
+                <w:rFonts w:ascii="Arial" w:hAnsi="Arial" w:cs="Arial"/>
+                <w:b/>
+                <w:bCs/>
+                <w:noProof/>
+              </w:rPr>
+              <w:t>&gt;</w:t>
             </w:r>
             <w:r>
               <w:rPr>
@@ -679,41 +704,64 @@
                 <w:noProof/>
                 <w:webHidden/>
               </w:rPr>
-              <w:fldChar w:fldCharType="begin"/>
+              <w:t>3-</w:t>
+            </w:r>
+          </w:hyperlink>
+          <w:r>
+            <w:t>6</w:t>
+          </w:r>
+        </w:p>
+        <w:p>
+          <w:pPr>
+            <w:pStyle w:val="TOC1"/>
+            <w:tabs>
+              <w:tab w:val="right" w:leader="dot" w:pos="12950"/>
+            </w:tabs>
+          </w:pPr>
+          <w:hyperlink w:anchor="_Toc132718197" w:history="1">
+            <w:r>
+              <w:rPr>
+                <w:rStyle w:val="Hyperlink"/>
+                <w:rFonts w:ascii="Arial" w:hAnsi="Arial" w:cs="Arial"/>
+                <w:b/>
+                <w:bCs/>
+                <w:noProof/>
+              </w:rPr>
+              <w:t>&lt;</w:t>
+            </w:r>
+            <w:r>
+              <w:rPr>
+                <w:rStyle w:val="Hyperlink"/>
+                <w:rFonts w:ascii="Arial" w:hAnsi="Arial" w:cs="Arial"/>
+                <w:b/>
+                <w:bCs/>
+                <w:noProof/>
+              </w:rPr>
+              <w:t>Reserving a Room with Too Many Guests</w:t>
+            </w:r>
+            <w:r>
+              <w:rPr>
+                <w:rStyle w:val="Hyperlink"/>
+                <w:rFonts w:ascii="Arial" w:hAnsi="Arial" w:cs="Arial"/>
+                <w:b/>
+                <w:bCs/>
+                <w:noProof/>
+              </w:rPr>
+              <w:t>&gt;</w:t>
             </w:r>
             <w:r>
               <w:rPr>
                 <w:noProof/>
                 <w:webHidden/>
               </w:rPr>
-              <w:instrText xml:space="preserve"> PAGEREF _Toc132718196 \h </w:instrText>
+              <w:tab/>
             </w:r>
             <w:r>
               <w:rPr>
                 <w:noProof/>
                 <w:webHidden/>
               </w:rPr>
-            </w:r>
-            <w:r>
-              <w:rPr>
-                <w:noProof/>
-                <w:webHidden/>
-              </w:rPr>
-              <w:fldChar w:fldCharType="separate"/>
-            </w:r>
-            <w:r>
-              <w:rPr>
-                <w:noProof/>
-                <w:webHidden/>
-              </w:rPr>
-              <w:t>2</w:t>
-            </w:r>
-            <w:r>
-              <w:rPr>
-                <w:noProof/>
-                <w:webHidden/>
-              </w:rPr>
-              <w:fldChar w:fldCharType="end"/>
+              <w:t>6-7</w:t>
             </w:r>
           </w:hyperlink>
         </w:p>
@@ -723,10 +771,6 @@
             <w:tabs>
               <w:tab w:val="right" w:leader="dot" w:pos="12950"/>
             </w:tabs>
-            <w:rPr>
-              <w:rFonts w:eastAsiaTheme="minorEastAsia"/>
-              <w:noProof/>
-            </w:rPr>
           </w:pPr>
           <w:hyperlink w:anchor="_Toc132718197" w:history="1">
             <w:r>
@@ -737,7 +781,17 @@
                 <w:bCs/>
                 <w:noProof/>
               </w:rPr>
-              <w:t>&lt;DESCRIPTION&gt;</w:t>
+              <w:t>&lt;</w:t>
+            </w:r>
+            <w:r>
+              <w:rPr>
+                <w:rStyle w:val="Hyperlink"/>
+                <w:rFonts w:ascii="Arial" w:hAnsi="Arial" w:cs="Arial"/>
+                <w:b/>
+                <w:bCs/>
+                <w:noProof/>
+              </w:rPr>
+              <w:t>Reserving a Room with no Check-out date</w:t>
             </w:r>
             <w:r>
               <w:rPr>
@@ -751,44 +805,11 @@
                 <w:noProof/>
                 <w:webHidden/>
               </w:rPr>
-              <w:fldChar w:fldCharType="begin"/>
-            </w:r>
-            <w:r>
-              <w:rPr>
-                <w:noProof/>
-                <w:webHidden/>
-              </w:rPr>
-              <w:instrText xml:space="preserve"> PAGEREF _Toc132718197 \h </w:instrText>
-            </w:r>
-            <w:r>
-              <w:rPr>
-                <w:noProof/>
-                <w:webHidden/>
-              </w:rPr>
-            </w:r>
-            <w:r>
-              <w:rPr>
-                <w:noProof/>
-                <w:webHidden/>
-              </w:rPr>
-              <w:fldChar w:fldCharType="separate"/>
-            </w:r>
-            <w:r>
-              <w:rPr>
-                <w:noProof/>
-                <w:webHidden/>
-              </w:rPr>
-              <w:t>3</w:t>
-            </w:r>
-            <w:r>
-              <w:rPr>
-                <w:noProof/>
-                <w:webHidden/>
-              </w:rPr>
-              <w:fldChar w:fldCharType="end"/>
+              <w:t>8-9</w:t>
             </w:r>
           </w:hyperlink>
         </w:p>
+        <w:p/>
         <w:p>
           <w:r>
             <w:rPr>
@@ -831,134 +852,6 @@
           <w:szCs w:val="24"/>
         </w:rPr>
       </w:pPr>
-    </w:p>
-    <w:p>
-      <w:pPr>
-        <w:pStyle w:val="NoSpacing"/>
-        <w:rPr>
-          <w:rFonts w:ascii="Arial" w:hAnsi="Arial" w:cs="Arial"/>
-          <w:sz w:val="24"/>
-          <w:szCs w:val="24"/>
-        </w:rPr>
-      </w:pPr>
-    </w:p>
-    <w:p>
-      <w:pPr>
-        <w:pStyle w:val="NoSpacing"/>
-        <w:rPr>
-          <w:rFonts w:ascii="Arial" w:hAnsi="Arial" w:cs="Arial"/>
-          <w:sz w:val="24"/>
-          <w:szCs w:val="24"/>
-        </w:rPr>
-      </w:pPr>
-    </w:p>
-    <w:p>
-      <w:pPr>
-        <w:pStyle w:val="NoSpacing"/>
-        <w:rPr>
-          <w:rFonts w:ascii="Arial" w:hAnsi="Arial" w:cs="Arial"/>
-          <w:sz w:val="24"/>
-          <w:szCs w:val="24"/>
-        </w:rPr>
-      </w:pPr>
-    </w:p>
-    <w:p>
-      <w:pPr>
-        <w:pStyle w:val="NoSpacing"/>
-        <w:rPr>
-          <w:rFonts w:ascii="Arial" w:hAnsi="Arial" w:cs="Arial"/>
-          <w:sz w:val="24"/>
-          <w:szCs w:val="24"/>
-        </w:rPr>
-      </w:pPr>
-    </w:p>
-    <w:p>
-      <w:pPr>
-        <w:pStyle w:val="NoSpacing"/>
-        <w:rPr>
-          <w:rFonts w:ascii="Arial" w:hAnsi="Arial" w:cs="Arial"/>
-          <w:sz w:val="24"/>
-          <w:szCs w:val="24"/>
-        </w:rPr>
-      </w:pPr>
-    </w:p>
-    <w:p>
-      <w:pPr>
-        <w:pStyle w:val="NoSpacing"/>
-        <w:rPr>
-          <w:rFonts w:ascii="Arial" w:hAnsi="Arial" w:cs="Arial"/>
-          <w:sz w:val="24"/>
-          <w:szCs w:val="24"/>
-        </w:rPr>
-      </w:pPr>
-    </w:p>
-    <w:p>
-      <w:pPr>
-        <w:pStyle w:val="NoSpacing"/>
-        <w:rPr>
-          <w:rFonts w:ascii="Arial" w:hAnsi="Arial" w:cs="Arial"/>
-          <w:sz w:val="24"/>
-          <w:szCs w:val="24"/>
-        </w:rPr>
-      </w:pPr>
-    </w:p>
-    <w:p>
-      <w:pPr>
-        <w:pStyle w:val="NoSpacing"/>
-        <w:rPr>
-          <w:rFonts w:ascii="Arial" w:hAnsi="Arial" w:cs="Arial"/>
-          <w:sz w:val="24"/>
-          <w:szCs w:val="24"/>
-        </w:rPr>
-      </w:pPr>
-    </w:p>
-    <w:p>
-      <w:pPr>
-        <w:pStyle w:val="NoSpacing"/>
-        <w:rPr>
-          <w:rFonts w:ascii="Arial" w:hAnsi="Arial" w:cs="Arial"/>
-          <w:sz w:val="24"/>
-          <w:szCs w:val="24"/>
-        </w:rPr>
-      </w:pPr>
-    </w:p>
-    <w:p>
-      <w:pPr>
-        <w:pStyle w:val="NoSpacing"/>
-        <w:rPr>
-          <w:rFonts w:ascii="Arial" w:hAnsi="Arial" w:cs="Arial"/>
-          <w:sz w:val="24"/>
-          <w:szCs w:val="24"/>
-        </w:rPr>
-      </w:pPr>
-    </w:p>
-    <w:p>
-      <w:pPr>
-        <w:pStyle w:val="NoSpacing"/>
-        <w:rPr>
-          <w:rFonts w:ascii="Arial" w:hAnsi="Arial" w:cs="Arial"/>
-          <w:sz w:val="24"/>
-          <w:szCs w:val="24"/>
-        </w:rPr>
-      </w:pPr>
-    </w:p>
-    <w:p>
-      <w:pPr>
-        <w:pStyle w:val="NoSpacing"/>
-        <w:rPr>
-          <w:rFonts w:ascii="Arial" w:hAnsi="Arial" w:cs="Arial"/>
-          <w:sz w:val="24"/>
-          <w:szCs w:val="24"/>
-        </w:rPr>
-      </w:pPr>
-      <w:r>
-        <w:rPr>
-          <w:rFonts w:ascii="Arial" w:hAnsi="Arial" w:cs="Arial"/>
-          <w:sz w:val="24"/>
-          <w:szCs w:val="24"/>
-        </w:rPr>
-        <w:t xml:space="preserve"> </w:t>
-      </w:r>
     </w:p>
     <w:p>
       <w:pPr>
@@ -1615,27 +1508,7 @@
                 <w:sz w:val="20"/>
                 <w:szCs w:val="20"/>
               </w:rPr>
-              <w:t xml:space="preserve">Navigate to </w:t>
-            </w:r>
-            <w:proofErr w:type="spellStart"/>
-            <w:r>
-              <w:rPr>
-                <w:rFonts w:ascii="Arial" w:hAnsi="Arial" w:cs="Arial"/>
-                <w:color w:val="C00000"/>
-                <w:sz w:val="20"/>
-                <w:szCs w:val="20"/>
-              </w:rPr>
-              <w:t>MoffayBayLodge</w:t>
-            </w:r>
-            <w:proofErr w:type="spellEnd"/>
-            <w:r>
-              <w:rPr>
-                <w:rFonts w:ascii="Arial" w:hAnsi="Arial" w:cs="Arial"/>
-                <w:color w:val="C00000"/>
-                <w:sz w:val="20"/>
-                <w:szCs w:val="20"/>
-              </w:rPr>
-              <w:t xml:space="preserve"> landing page</w:t>
+              <w:t>Navigate to MoffayBayLodge landing page</w:t>
             </w:r>
             <w:r>
               <w:rPr>
@@ -2017,6 +1890,7 @@
             <w:r>
               <w:rPr>
                 <w:rFonts w:ascii="Arial" w:hAnsi="Arial" w:cs="Arial"/>
+                <w:noProof/>
                 <w:color w:val="C00000"/>
                 <w:sz w:val="20"/>
                 <w:szCs w:val="20"/>
@@ -2084,7 +1958,6 @@
                 <w:sz w:val="20"/>
                 <w:szCs w:val="20"/>
               </w:rPr>
-              <w:lastRenderedPageBreak/>
               <w:t>3</w:t>
             </w:r>
           </w:p>
@@ -2255,6 +2128,7 @@
             <w:r>
               <w:rPr>
                 <w:rFonts w:ascii="Arial" w:hAnsi="Arial" w:cs="Arial"/>
+                <w:noProof/>
                 <w:color w:val="C00000"/>
                 <w:sz w:val="20"/>
                 <w:szCs w:val="20"/>
@@ -2506,6 +2380,7 @@
             <w:r>
               <w:rPr>
                 <w:rFonts w:ascii="Arial" w:hAnsi="Arial" w:cs="Arial"/>
+                <w:noProof/>
                 <w:color w:val="C00000"/>
                 <w:sz w:val="20"/>
                 <w:szCs w:val="20"/>
@@ -2753,6 +2628,7 @@
             <w:r>
               <w:rPr>
                 <w:rFonts w:ascii="Arial" w:hAnsi="Arial" w:cs="Arial"/>
+                <w:noProof/>
                 <w:color w:val="C00000"/>
                 <w:sz w:val="20"/>
                 <w:szCs w:val="20"/>
@@ -2824,7 +2700,6 @@
                 <w:sz w:val="20"/>
                 <w:szCs w:val="20"/>
               </w:rPr>
-              <w:lastRenderedPageBreak/>
               <w:t>Comments</w:t>
             </w:r>
           </w:p>
@@ -3339,27 +3214,7 @@
                 <w:sz w:val="20"/>
                 <w:szCs w:val="20"/>
               </w:rPr>
-              <w:t xml:space="preserve">Navigate to </w:t>
-            </w:r>
-            <w:proofErr w:type="spellStart"/>
-            <w:r>
-              <w:rPr>
-                <w:rFonts w:ascii="Arial" w:hAnsi="Arial" w:cs="Arial"/>
-                <w:color w:val="C00000"/>
-                <w:sz w:val="20"/>
-                <w:szCs w:val="20"/>
-              </w:rPr>
-              <w:t>MoffayBayLodge</w:t>
-            </w:r>
-            <w:proofErr w:type="spellEnd"/>
-            <w:r>
-              <w:rPr>
-                <w:rFonts w:ascii="Arial" w:hAnsi="Arial" w:cs="Arial"/>
-                <w:color w:val="C00000"/>
-                <w:sz w:val="20"/>
-                <w:szCs w:val="20"/>
-              </w:rPr>
-              <w:t xml:space="preserve"> landing page(</w:t>
+              <w:t>Navigate to MoffayBayLodge landing page(</w:t>
             </w:r>
             <w:r>
               <w:rPr>
@@ -3651,6 +3506,7 @@
             <w:r>
               <w:rPr>
                 <w:rFonts w:ascii="Arial" w:hAnsi="Arial" w:cs="Arial"/>
+                <w:noProof/>
                 <w:color w:val="C00000"/>
                 <w:sz w:val="20"/>
                 <w:szCs w:val="20"/>
@@ -3718,7 +3574,6 @@
                 <w:sz w:val="20"/>
                 <w:szCs w:val="20"/>
               </w:rPr>
-              <w:lastRenderedPageBreak/>
               <w:t>3</w:t>
             </w:r>
           </w:p>
@@ -3835,6 +3690,7 @@
             <w:r>
               <w:rPr>
                 <w:rFonts w:ascii="Arial" w:hAnsi="Arial" w:cs="Arial"/>
+                <w:noProof/>
                 <w:color w:val="C00000"/>
                 <w:sz w:val="20"/>
                 <w:szCs w:val="20"/>
@@ -4017,6 +3873,7 @@
             <w:r>
               <w:rPr>
                 <w:rFonts w:ascii="Arial" w:hAnsi="Arial" w:cs="Arial"/>
+                <w:noProof/>
                 <w:color w:val="C00000"/>
                 <w:sz w:val="20"/>
                 <w:szCs w:val="20"/>
@@ -4210,6 +4067,7 @@
             <w:r>
               <w:rPr>
                 <w:rFonts w:ascii="Arial" w:hAnsi="Arial" w:cs="Arial"/>
+                <w:noProof/>
                 <w:color w:val="C00000"/>
                 <w:sz w:val="20"/>
                 <w:szCs w:val="20"/>
@@ -4281,7 +4139,6 @@
                 <w:sz w:val="20"/>
                 <w:szCs w:val="20"/>
               </w:rPr>
-              <w:lastRenderedPageBreak/>
               <w:t>Comments</w:t>
             </w:r>
           </w:p>
@@ -4796,27 +4653,7 @@
                 <w:sz w:val="20"/>
                 <w:szCs w:val="20"/>
               </w:rPr>
-              <w:t xml:space="preserve">Navigate to </w:t>
-            </w:r>
-            <w:proofErr w:type="spellStart"/>
-            <w:r>
-              <w:rPr>
-                <w:rFonts w:ascii="Arial" w:hAnsi="Arial" w:cs="Arial"/>
-                <w:color w:val="C00000"/>
-                <w:sz w:val="20"/>
-                <w:szCs w:val="20"/>
-              </w:rPr>
-              <w:t>MoffayBayLodge</w:t>
-            </w:r>
-            <w:proofErr w:type="spellEnd"/>
-            <w:r>
-              <w:rPr>
-                <w:rFonts w:ascii="Arial" w:hAnsi="Arial" w:cs="Arial"/>
-                <w:color w:val="C00000"/>
-                <w:sz w:val="20"/>
-                <w:szCs w:val="20"/>
-              </w:rPr>
-              <w:t xml:space="preserve"> landing page(</w:t>
+              <w:t>Navigate to MoffayBayLodge landing page(</w:t>
             </w:r>
             <w:r>
               <w:rPr>
@@ -5108,6 +4945,7 @@
             <w:r>
               <w:rPr>
                 <w:rFonts w:ascii="Arial" w:hAnsi="Arial" w:cs="Arial"/>
+                <w:noProof/>
                 <w:color w:val="C00000"/>
                 <w:sz w:val="20"/>
                 <w:szCs w:val="20"/>
@@ -5175,7 +5013,6 @@
                 <w:sz w:val="20"/>
                 <w:szCs w:val="20"/>
               </w:rPr>
-              <w:lastRenderedPageBreak/>
               <w:t>3</w:t>
             </w:r>
           </w:p>
@@ -5292,6 +5129,7 @@
             <w:r>
               <w:rPr>
                 <w:rFonts w:ascii="Arial" w:hAnsi="Arial" w:cs="Arial"/>
+                <w:noProof/>
                 <w:color w:val="C00000"/>
                 <w:sz w:val="20"/>
                 <w:szCs w:val="20"/>
@@ -5474,6 +5312,7 @@
             <w:r>
               <w:rPr>
                 <w:rFonts w:ascii="Arial" w:hAnsi="Arial" w:cs="Arial"/>
+                <w:noProof/>
                 <w:color w:val="C00000"/>
                 <w:sz w:val="20"/>
                 <w:szCs w:val="20"/>
@@ -5656,6 +5495,7 @@
             <w:r>
               <w:rPr>
                 <w:rFonts w:ascii="Arial" w:hAnsi="Arial" w:cs="Arial"/>
+                <w:noProof/>
                 <w:color w:val="C00000"/>
                 <w:sz w:val="20"/>
                 <w:szCs w:val="20"/>
@@ -6272,27 +6112,7 @@
                 <w:sz w:val="20"/>
                 <w:szCs w:val="20"/>
               </w:rPr>
-              <w:t xml:space="preserve">Navigate to </w:t>
-            </w:r>
-            <w:proofErr w:type="spellStart"/>
-            <w:r>
-              <w:rPr>
-                <w:rFonts w:ascii="Arial" w:hAnsi="Arial" w:cs="Arial"/>
-                <w:color w:val="C00000"/>
-                <w:sz w:val="20"/>
-                <w:szCs w:val="20"/>
-              </w:rPr>
-              <w:t>MoffayBayLodge</w:t>
-            </w:r>
-            <w:proofErr w:type="spellEnd"/>
-            <w:r>
-              <w:rPr>
-                <w:rFonts w:ascii="Arial" w:hAnsi="Arial" w:cs="Arial"/>
-                <w:color w:val="C00000"/>
-                <w:sz w:val="20"/>
-                <w:szCs w:val="20"/>
-              </w:rPr>
-              <w:t xml:space="preserve"> landing page(</w:t>
+              <w:t>Navigate to MoffayBayLodge landing page(</w:t>
             </w:r>
             <w:r>
               <w:rPr>
@@ -6584,6 +6404,7 @@
             <w:r>
               <w:rPr>
                 <w:rFonts w:ascii="Arial" w:hAnsi="Arial" w:cs="Arial"/>
+                <w:noProof/>
                 <w:color w:val="C00000"/>
                 <w:sz w:val="20"/>
                 <w:szCs w:val="20"/>
@@ -6776,6 +6597,7 @@
             <w:r>
               <w:rPr>
                 <w:rFonts w:ascii="Arial" w:hAnsi="Arial" w:cs="Arial"/>
+                <w:noProof/>
                 <w:color w:val="C00000"/>
                 <w:sz w:val="20"/>
                 <w:szCs w:val="20"/>
@@ -7048,6 +6870,7 @@
             <w:r>
               <w:rPr>
                 <w:rFonts w:ascii="Arial" w:hAnsi="Arial" w:cs="Arial"/>
+                <w:noProof/>
                 <w:color w:val="C00000"/>
                 <w:sz w:val="20"/>
                 <w:szCs w:val="20"/>
@@ -7230,6 +7053,7 @@
             <w:r>
               <w:rPr>
                 <w:rFonts w:ascii="Arial" w:hAnsi="Arial" w:cs="Arial"/>
+                <w:noProof/>
                 <w:color w:val="C00000"/>
                 <w:sz w:val="20"/>
                 <w:szCs w:val="20"/>

</xml_diff>